<commit_message>
Atualização da documentação final do projeto.
</commit_message>
<xml_diff>
--- a/doc/Projeto Multidisciplinar - DStudy.docx
+++ b/doc/Projeto Multidisciplinar - DStudy.docx
@@ -196,7 +196,44 @@
                 <w:rFonts w:ascii="Times New Roman" w:hAnsi="Times New Roman" w:eastAsia="Times New Roman" w:cs="Times New Roman"/>
                 <w:color w:val="000000"/>
               </w:rPr>
-              <w:t xml:space="preserve"> Matos, Paulo Henrique e Yasmin Santana</w:t>
+              <w:t xml:space="preserve"> Matos, Paulo Henrique</w:t>
+            </w:r>
+            <w:r>
+              <w:rPr>
+                <w:rFonts w:ascii="Times New Roman" w:hAnsi="Times New Roman" w:eastAsia="Times New Roman" w:cs="Times New Roman"/>
+                <w:color w:val="000000"/>
+              </w:rPr>
+              <w:t>,</w:t>
+            </w:r>
+            <w:r>
+              <w:rPr>
+                <w:rFonts w:ascii="Times New Roman" w:hAnsi="Times New Roman" w:eastAsia="Times New Roman" w:cs="Times New Roman"/>
+                <w:color w:val="000000"/>
+              </w:rPr>
+              <w:t xml:space="preserve"> Yasmin Santana</w:t>
+            </w:r>
+            <w:r>
+              <w:rPr>
+                <w:rFonts w:ascii="Times New Roman" w:hAnsi="Times New Roman" w:eastAsia="Times New Roman" w:cs="Times New Roman"/>
+                <w:color w:val="000000"/>
+              </w:rPr>
+              <w:t xml:space="preserve"> e </w:t>
+            </w:r>
+            <w:proofErr w:type="spellStart"/>
+            <w:r>
+              <w:rPr>
+                <w:rFonts w:ascii="Times New Roman" w:hAnsi="Times New Roman" w:eastAsia="Times New Roman" w:cs="Times New Roman"/>
+                <w:color w:val="000000"/>
+              </w:rPr>
+              <w:t>Luis</w:t>
+            </w:r>
+            <w:proofErr w:type="spellEnd"/>
+            <w:r>
+              <w:rPr>
+                <w:rFonts w:ascii="Times New Roman" w:hAnsi="Times New Roman" w:eastAsia="Times New Roman" w:cs="Times New Roman"/>
+                <w:color w:val="000000"/>
+              </w:rPr>
+              <w:t xml:space="preserve"> Henrique</w:t>
             </w:r>
           </w:p>
         </w:tc>
@@ -587,7 +624,6 @@
           <w:rFonts w:ascii="Times New Roman" w:hAnsi="Times New Roman" w:eastAsia="Times New Roman" w:cs="Times New Roman"/>
           <w:color w:val="000000"/>
         </w:rPr>
-        <w:lastRenderedPageBreak/>
         <w:t xml:space="preserve">O projeto </w:t>
       </w:r>
       <w:proofErr w:type="spellStart"/>
@@ -663,91 +699,63 @@
       <w:r>
         <w:rPr>
           <w:rFonts w:ascii="Times New Roman" w:hAnsi="Times New Roman" w:eastAsia="Times New Roman" w:cs="Times New Roman"/>
-          <w:color w:val="000000" w:themeColor="text1" w:themeTint="FF" w:themeShade="FF"/>
+          <w:color w:val="000000" w:themeColor="text1"/>
         </w:rPr>
         <w:t xml:space="preserve">Além disso, </w:t>
       </w:r>
       <w:r>
         <w:rPr>
           <w:rFonts w:ascii="Times New Roman" w:hAnsi="Times New Roman" w:eastAsia="Times New Roman" w:cs="Times New Roman"/>
-          <w:color w:val="000000" w:themeColor="text1" w:themeTint="FF" w:themeShade="FF"/>
-        </w:rPr>
-        <w:t xml:space="preserve">consiste em permitir que o estudante escolha uma matéria, responda aos respectivos </w:t>
-      </w:r>
-      <w:r>
-        <w:rPr>
-          <w:rFonts w:ascii="Times New Roman" w:hAnsi="Times New Roman" w:eastAsia="Times New Roman" w:cs="Times New Roman"/>
-          <w:color w:val="000000" w:themeColor="text1" w:themeTint="FF" w:themeShade="FF"/>
-        </w:rPr>
-        <w:t>flashcards</w:t>
-      </w:r>
-      <w:r>
-        <w:rPr>
-          <w:rFonts w:ascii="Times New Roman" w:hAnsi="Times New Roman" w:eastAsia="Times New Roman" w:cs="Times New Roman"/>
-          <w:color w:val="000000" w:themeColor="text1" w:themeTint="FF" w:themeShade="FF"/>
-        </w:rPr>
-        <w:t xml:space="preserve"> disponibilizados e acompanhe</w:t>
-      </w:r>
-      <w:r>
-        <w:rPr>
-          <w:rFonts w:ascii="Times New Roman" w:hAnsi="Times New Roman" w:eastAsia="Times New Roman" w:cs="Times New Roman"/>
-          <w:color w:val="000000" w:themeColor="text1" w:themeTint="FF" w:themeShade="FF"/>
+          <w:color w:val="000000" w:themeColor="text1"/>
+        </w:rPr>
+        <w:t>consiste em permitir que o estudante escolha uma matéria, responda aos respectivos flashcards disponibilizados e acompanhe</w:t>
+      </w:r>
+      <w:r>
+        <w:rPr>
+          <w:rFonts w:ascii="Times New Roman" w:hAnsi="Times New Roman" w:eastAsia="Times New Roman" w:cs="Times New Roman"/>
+          <w:color w:val="000000" w:themeColor="text1"/>
         </w:rPr>
         <w:t xml:space="preserve"> seu progresso individual. </w:t>
       </w:r>
       <w:r>
         <w:rPr>
           <w:rFonts w:ascii="Times New Roman" w:hAnsi="Times New Roman" w:eastAsia="Times New Roman" w:cs="Times New Roman"/>
-          <w:color w:val="000000" w:themeColor="text1" w:themeTint="FF" w:themeShade="FF"/>
+          <w:color w:val="000000" w:themeColor="text1"/>
         </w:rPr>
         <w:t xml:space="preserve">O sistema </w:t>
       </w:r>
       <w:r>
         <w:rPr>
           <w:rFonts w:ascii="Times New Roman" w:hAnsi="Times New Roman" w:eastAsia="Times New Roman" w:cs="Times New Roman"/>
-          <w:color w:val="000000" w:themeColor="text1" w:themeTint="FF" w:themeShade="FF"/>
-        </w:rPr>
-        <w:t xml:space="preserve">irá utilizar um mecanismo de domínio baseando-se no desempenho do usuário, onde um </w:t>
-      </w:r>
-      <w:r>
-        <w:rPr>
-          <w:rFonts w:ascii="Times New Roman" w:hAnsi="Times New Roman" w:eastAsia="Times New Roman" w:cs="Times New Roman"/>
-          <w:color w:val="000000" w:themeColor="text1" w:themeTint="FF" w:themeShade="FF"/>
-        </w:rPr>
-        <w:t>flashcard</w:t>
-      </w:r>
-      <w:r>
-        <w:rPr>
-          <w:rFonts w:ascii="Times New Roman" w:hAnsi="Times New Roman" w:eastAsia="Times New Roman" w:cs="Times New Roman"/>
-          <w:color w:val="000000" w:themeColor="text1" w:themeTint="FF" w:themeShade="FF"/>
-        </w:rPr>
-        <w:t xml:space="preserve"> será considerado dominado </w:t>
-      </w:r>
-      <w:r>
-        <w:rPr>
-          <w:rFonts w:ascii="Times New Roman" w:hAnsi="Times New Roman" w:eastAsia="Times New Roman" w:cs="Times New Roman"/>
-          <w:color w:val="000000" w:themeColor="text1" w:themeTint="FF" w:themeShade="FF"/>
+          <w:color w:val="000000" w:themeColor="text1"/>
+        </w:rPr>
+        <w:t xml:space="preserve">irá utilizar um mecanismo de domínio baseando-se no desempenho do usuário, onde um flashcard será considerado dominado </w:t>
+      </w:r>
+      <w:r>
+        <w:rPr>
+          <w:rFonts w:ascii="Times New Roman" w:hAnsi="Times New Roman" w:eastAsia="Times New Roman" w:cs="Times New Roman"/>
+          <w:color w:val="000000" w:themeColor="text1"/>
         </w:rPr>
         <w:t>assim que ele for acertado três vezes consecutivas.</w:t>
       </w:r>
       <w:r>
         <w:rPr>
           <w:rFonts w:ascii="Times New Roman" w:hAnsi="Times New Roman" w:eastAsia="Times New Roman" w:cs="Times New Roman"/>
-          <w:color w:val="000000" w:themeColor="text1" w:themeTint="FF" w:themeShade="FF"/>
+          <w:color w:val="000000" w:themeColor="text1"/>
         </w:rPr>
         <w:t xml:space="preserve"> Transformando a revisão de </w:t>
       </w:r>
       <w:r>
         <w:rPr>
           <w:rFonts w:ascii="Times New Roman" w:hAnsi="Times New Roman" w:eastAsia="Times New Roman" w:cs="Times New Roman"/>
-          <w:color w:val="000000" w:themeColor="text1" w:themeTint="FF" w:themeShade="FF"/>
+          <w:color w:val="000000" w:themeColor="text1"/>
         </w:rPr>
         <w:t>conteúdo</w:t>
       </w:r>
       <w:r>
         <w:rPr>
           <w:rFonts w:ascii="Times New Roman" w:hAnsi="Times New Roman" w:eastAsia="Times New Roman" w:cs="Times New Roman"/>
-          <w:color w:val="000000" w:themeColor="text1" w:themeTint="FF" w:themeShade="FF"/>
+          <w:color w:val="000000" w:themeColor="text1"/>
         </w:rPr>
         <w:t xml:space="preserve"> em uma experiência progressiva e mais agradável onde o usuário possa visualizar e reconhecer sua própria evolução ao longo do processo de aprendizagem.</w:t>
       </w:r>
@@ -1077,7 +1085,6 @@
               <w:rPr>
                 <w:rFonts w:ascii="Times New Roman" w:hAnsi="Times New Roman" w:eastAsia="Times New Roman" w:cs="Times New Roman"/>
               </w:rPr>
-              <w:lastRenderedPageBreak/>
               <w:t>Código</w:t>
             </w:r>
           </w:p>
@@ -2335,7 +2342,6 @@
                 <w:rFonts w:ascii="Times New Roman" w:hAnsi="Times New Roman" w:eastAsia="Times New Roman" w:cs="Times New Roman"/>
                 <w:color w:val="000000" w:themeColor="text1"/>
               </w:rPr>
-              <w:lastRenderedPageBreak/>
               <w:t>RNF02</w:t>
             </w:r>
           </w:p>
@@ -2536,12 +2542,21 @@
                 <w:color w:val="000000" w:themeColor="text1"/>
               </w:rPr>
             </w:pPr>
-            <w:r>
-              <w:rPr>
-                <w:rFonts w:ascii="Times New Roman" w:hAnsi="Times New Roman" w:eastAsia="Times New Roman" w:cs="Times New Roman"/>
-                <w:color w:val="000000" w:themeColor="text1"/>
-              </w:rPr>
-              <w:t xml:space="preserve">Renderizar </w:t>
+            <w:proofErr w:type="spellStart"/>
+            <w:r>
+              <w:rPr>
+                <w:rFonts w:ascii="Times New Roman" w:hAnsi="Times New Roman" w:eastAsia="Times New Roman" w:cs="Times New Roman"/>
+                <w:color w:val="000000" w:themeColor="text1"/>
+              </w:rPr>
+              <w:t>Renderizar</w:t>
+            </w:r>
+            <w:proofErr w:type="spellEnd"/>
+            <w:r>
+              <w:rPr>
+                <w:rFonts w:ascii="Times New Roman" w:hAnsi="Times New Roman" w:eastAsia="Times New Roman" w:cs="Times New Roman"/>
+                <w:color w:val="000000" w:themeColor="text1"/>
+              </w:rPr>
+              <w:t xml:space="preserve"> </w:t>
             </w:r>
             <w:proofErr w:type="spellStart"/>
             <w:r>
@@ -3070,15 +3085,7 @@
                 <w:rFonts w:ascii="Times New Roman" w:hAnsi="Times New Roman" w:eastAsia="Times New Roman" w:cs="Times New Roman"/>
                 <w:color w:val="000000" w:themeColor="text1"/>
               </w:rPr>
-              <w:t xml:space="preserve">Variáveis sensíveis armazenadas </w:t>
-            </w:r>
-            <w:proofErr w:type="gramStart"/>
-            <w:r>
-              <w:rPr>
-                <w:rFonts w:ascii="Times New Roman" w:hAnsi="Times New Roman" w:eastAsia="Times New Roman" w:cs="Times New Roman"/>
-                <w:color w:val="000000" w:themeColor="text1"/>
-              </w:rPr>
-              <w:t xml:space="preserve">em </w:t>
+              <w:t xml:space="preserve">Variáveis sensíveis armazenadas em </w:t>
             </w:r>
             <w:r>
               <w:rPr>
@@ -3098,7 +3105,6 @@
               <w:t>env</w:t>
             </w:r>
             <w:proofErr w:type="spellEnd"/>
-            <w:proofErr w:type="gramEnd"/>
           </w:p>
         </w:tc>
       </w:tr>
@@ -3954,7 +3960,6 @@
                 <w:rFonts w:ascii="Times New Roman" w:hAnsi="Times New Roman" w:eastAsia="Times New Roman" w:cs="Times New Roman"/>
                 <w:color w:val="000000" w:themeColor="text1"/>
               </w:rPr>
-              <w:lastRenderedPageBreak/>
               <w:t>RNF15</w:t>
             </w:r>
           </w:p>
@@ -4755,7 +4760,6 @@
           <w:sz w:val="32"/>
           <w:szCs w:val="32"/>
         </w:rPr>
-        <w:lastRenderedPageBreak/>
         <w:drawing>
           <wp:inline distT="0" distB="0" distL="0" distR="0" wp14:anchorId="1122D1F5" wp14:editId="0DB55759">
             <wp:extent cx="5733415" cy="8058785"/>
@@ -5988,7 +5992,6 @@
               <w:rPr>
                 <w:rFonts w:ascii="Times New Roman" w:hAnsi="Times New Roman" w:eastAsia="Times New Roman" w:cs="Times New Roman"/>
               </w:rPr>
-              <w:lastRenderedPageBreak/>
               <w:t>GET</w:t>
             </w:r>
           </w:p>
@@ -6017,7 +6020,21 @@
               <w:rPr>
                 <w:rFonts w:ascii="Times New Roman" w:hAnsi="Times New Roman" w:eastAsia="Times New Roman" w:cs="Times New Roman"/>
               </w:rPr>
-              <w:t>/api/</w:t>
+              <w:t>/</w:t>
+            </w:r>
+            <w:proofErr w:type="spellStart"/>
+            <w:r>
+              <w:rPr>
+                <w:rFonts w:ascii="Times New Roman" w:hAnsi="Times New Roman" w:eastAsia="Times New Roman" w:cs="Times New Roman"/>
+              </w:rPr>
+              <w:t>api</w:t>
+            </w:r>
+            <w:proofErr w:type="spellEnd"/>
+            <w:r>
+              <w:rPr>
+                <w:rFonts w:ascii="Times New Roman" w:hAnsi="Times New Roman" w:eastAsia="Times New Roman" w:cs="Times New Roman"/>
+              </w:rPr>
+              <w:t>/</w:t>
             </w:r>
             <w:proofErr w:type="spellStart"/>
             <w:r>
@@ -6112,7 +6129,21 @@
               <w:rPr>
                 <w:rFonts w:ascii="Times New Roman" w:hAnsi="Times New Roman" w:eastAsia="Times New Roman" w:cs="Times New Roman"/>
               </w:rPr>
-              <w:t>/api/</w:t>
+              <w:t>/</w:t>
+            </w:r>
+            <w:proofErr w:type="spellStart"/>
+            <w:r>
+              <w:rPr>
+                <w:rFonts w:ascii="Times New Roman" w:hAnsi="Times New Roman" w:eastAsia="Times New Roman" w:cs="Times New Roman"/>
+              </w:rPr>
+              <w:t>api</w:t>
+            </w:r>
+            <w:proofErr w:type="spellEnd"/>
+            <w:r>
+              <w:rPr>
+                <w:rFonts w:ascii="Times New Roman" w:hAnsi="Times New Roman" w:eastAsia="Times New Roman" w:cs="Times New Roman"/>
+              </w:rPr>
+              <w:t>/</w:t>
             </w:r>
             <w:proofErr w:type="spellStart"/>
             <w:r>
@@ -6322,7 +6353,21 @@
               <w:rPr>
                 <w:rFonts w:ascii="Times New Roman" w:hAnsi="Times New Roman" w:eastAsia="Times New Roman" w:cs="Times New Roman"/>
               </w:rPr>
-              <w:t>/api/</w:t>
+              <w:t>/</w:t>
+            </w:r>
+            <w:proofErr w:type="spellStart"/>
+            <w:r>
+              <w:rPr>
+                <w:rFonts w:ascii="Times New Roman" w:hAnsi="Times New Roman" w:eastAsia="Times New Roman" w:cs="Times New Roman"/>
+              </w:rPr>
+              <w:t>api</w:t>
+            </w:r>
+            <w:proofErr w:type="spellEnd"/>
+            <w:r>
+              <w:rPr>
+                <w:rFonts w:ascii="Times New Roman" w:hAnsi="Times New Roman" w:eastAsia="Times New Roman" w:cs="Times New Roman"/>
+              </w:rPr>
+              <w:t>/</w:t>
             </w:r>
             <w:proofErr w:type="spellStart"/>
             <w:r>
@@ -7433,7 +7478,6 @@
               <w:rPr>
                 <w:rFonts w:ascii="Times New Roman" w:hAnsi="Times New Roman" w:eastAsia="Times New Roman" w:cs="Times New Roman"/>
               </w:rPr>
-              <w:lastRenderedPageBreak/>
               <w:t>TI01</w:t>
             </w:r>
           </w:p>
@@ -8603,7 +8647,6 @@
           <w:rFonts w:ascii="Times New Roman" w:hAnsi="Times New Roman" w:eastAsia="Times New Roman" w:cs="Times New Roman"/>
           <w:color w:val="000000"/>
         </w:rPr>
-        <w:lastRenderedPageBreak/>
         <w:t>2. DESENVOLVIMENTO E ARQUITETURA DE SOFTWARE</w:t>
       </w:r>
     </w:p>
@@ -9807,7 +9850,6 @@
               <w:rPr>
                 <w:rFonts w:ascii="Times New Roman" w:hAnsi="Times New Roman" w:eastAsia="Times New Roman" w:cs="Times New Roman"/>
               </w:rPr>
-              <w:lastRenderedPageBreak/>
               <w:t>RF10</w:t>
             </w:r>
           </w:p>
@@ -10919,7 +10961,6 @@
           <w:rFonts w:ascii="Times New Roman" w:hAnsi="Times New Roman" w:eastAsia="Times New Roman" w:cs="Times New Roman"/>
           <w:color w:val="000000"/>
         </w:rPr>
-        <w:lastRenderedPageBreak/>
         <w:t>2.2. Modelagem (UML e DER)</w:t>
       </w:r>
     </w:p>
@@ -11029,7 +11070,6 @@
               <w:rPr>
                 <w:rFonts w:ascii="Times New Roman" w:hAnsi="Times New Roman" w:eastAsia="Times New Roman" w:cs="Times New Roman"/>
               </w:rPr>
-              <w:lastRenderedPageBreak/>
               <w:t>C</w:t>
             </w:r>
             <w:r>
@@ -11855,14 +11895,13 @@
       <w:r>
         <w:rPr>
           <w:rFonts w:ascii="Times New Roman" w:hAnsi="Times New Roman" w:eastAsia="Times New Roman" w:cs="Times New Roman"/>
-          <w:color w:val="000000" w:themeColor="text1" w:themeTint="FF" w:themeShade="FF"/>
+          <w:color w:val="000000" w:themeColor="text1"/>
         </w:rPr>
         <w:t>3. CONCLUSÃO</w:t>
       </w:r>
     </w:p>
     <w:p>
       <w:pPr>
-        <w:pStyle w:val="Normal"/>
         <w:rPr>
           <w:rFonts w:ascii="Times New Roman" w:hAnsi="Times New Roman" w:eastAsia="Times New Roman" w:cs="Times New Roman"/>
           <w:color w:val="auto"/>
@@ -11878,373 +11917,207 @@
         <w:t>3.1. Resultados Alcançados</w:t>
       </w:r>
     </w:p>
+    <w:p/>
+    <w:p>
+      <w:r>
+        <w:rPr>
+          <w:rFonts w:ascii="Times New Roman" w:hAnsi="Times New Roman" w:eastAsia="Times New Roman" w:cs="Times New Roman"/>
+          <w:color w:val="000000" w:themeColor="text1"/>
+        </w:rPr>
+        <w:t>O desenvolvimento do site DStudy permitiu consolidar os conhecimentos adquiridos ao longo do curso técnico em Desenvolvimento de Sistemas. Partindo de uma proposta de sistema gamificado e interativo de auxílio de estudos com fla</w:t>
+      </w:r>
+      <w:r>
+        <w:rPr>
+          <w:rFonts w:ascii="Times New Roman" w:hAnsi="Times New Roman" w:eastAsia="Times New Roman" w:cs="Times New Roman"/>
+          <w:color w:val="000000" w:themeColor="text1"/>
+        </w:rPr>
+        <w:t>shcards, os alunos evoluíram de um esboço conceitual para uma aplicação em desenvolvimento que integra Front</w:t>
+      </w:r>
+      <w:r>
+        <w:rPr>
+          <w:rFonts w:ascii="Times New Roman" w:hAnsi="Times New Roman" w:eastAsia="Times New Roman" w:cs="Times New Roman"/>
+          <w:color w:val="000000" w:themeColor="text1"/>
+        </w:rPr>
+        <w:t>-End, Back-End e Banco de Dados.</w:t>
+      </w:r>
+    </w:p>
+    <w:p>
+      <w:r>
+        <w:rPr>
+          <w:rFonts w:ascii="Times New Roman" w:hAnsi="Times New Roman" w:eastAsia="Times New Roman" w:cs="Times New Roman"/>
+          <w:color w:val="000000" w:themeColor="text1"/>
+        </w:rPr>
+        <w:t>Principais resultados alcançados:</w:t>
+      </w:r>
+    </w:p>
     <w:p>
       <w:pPr>
-        <w:pStyle w:val="Normal"/>
+        <w:pStyle w:val="PargrafodaLista"/>
+        <w:numPr>
+          <w:ilvl w:val="0"/>
+          <w:numId w:val="4"/>
+        </w:numPr>
+        <w:rPr>
+          <w:rFonts w:ascii="Times New Roman" w:hAnsi="Times New Roman" w:eastAsia="Times New Roman" w:cs="Times New Roman"/>
+          <w:color w:val="auto"/>
+        </w:rPr>
+      </w:pPr>
+      <w:r>
+        <w:rPr>
+          <w:rFonts w:ascii="Times New Roman" w:hAnsi="Times New Roman" w:eastAsia="Times New Roman" w:cs="Times New Roman"/>
+          <w:color w:val="auto"/>
+        </w:rPr>
+        <w:t>Versionamento e documentação contínua: uso de Git/GitHub, branches por desenvolvedor e um arquivo changes.log que registra detalhadamente cada etapa da pipeline (P01 a P10).</w:t>
+      </w:r>
+    </w:p>
+    <w:p>
+      <w:pPr>
+        <w:pStyle w:val="PargrafodaLista"/>
+        <w:numPr>
+          <w:ilvl w:val="0"/>
+          <w:numId w:val="4"/>
+        </w:numPr>
+        <w:rPr>
+          <w:rFonts w:ascii="Times New Roman" w:hAnsi="Times New Roman" w:eastAsia="Times New Roman" w:cs="Times New Roman"/>
+          <w:color w:val="auto"/>
+        </w:rPr>
+      </w:pPr>
+      <w:r>
+        <w:rPr>
+          <w:rFonts w:ascii="Times New Roman" w:hAnsi="Times New Roman" w:eastAsia="Times New Roman" w:cs="Times New Roman"/>
+          <w:color w:val="auto"/>
+        </w:rPr>
+        <w:t>Sistema de flashcards com múltipla escolha: cada flashcard exibe uma pergunta, quatro alternativas e um badge de dificuldade, com verificação automática da resposta.</w:t>
+      </w:r>
+    </w:p>
+    <w:p>
+      <w:pPr>
+        <w:pStyle w:val="PargrafodaLista"/>
+        <w:numPr>
+          <w:ilvl w:val="0"/>
+          <w:numId w:val="4"/>
+        </w:numPr>
+        <w:rPr>
+          <w:rFonts w:ascii="Times New Roman" w:hAnsi="Times New Roman" w:eastAsia="Times New Roman" w:cs="Times New Roman"/>
+          <w:color w:val="auto"/>
+        </w:rPr>
+      </w:pPr>
+      <w:r>
+        <w:rPr>
+          <w:rFonts w:ascii="Times New Roman" w:hAnsi="Times New Roman" w:eastAsia="Times New Roman" w:cs="Times New Roman"/>
+          <w:color w:val="auto"/>
+        </w:rPr>
+        <w:t>Lógica de domínio implementada no Back-End: regra de 3 acertos consecutivos para considerar um flashcard dominado, com controle de sequência e repetição espaçada.</w:t>
+      </w:r>
+    </w:p>
+    <w:p>
+      <w:pPr>
+        <w:pStyle w:val="PargrafodaLista"/>
+        <w:numPr>
+          <w:ilvl w:val="0"/>
+          <w:numId w:val="4"/>
+        </w:numPr>
+        <w:rPr>
+          <w:rFonts w:ascii="Times New Roman" w:hAnsi="Times New Roman" w:eastAsia="Times New Roman" w:cs="Times New Roman"/>
+          <w:color w:val="auto"/>
+        </w:rPr>
+      </w:pPr>
+      <w:r>
+        <w:rPr>
+          <w:rFonts w:ascii="Times New Roman" w:hAnsi="Times New Roman" w:eastAsia="Times New Roman" w:cs="Times New Roman"/>
+          <w:color w:val="auto"/>
+        </w:rPr>
+        <w:t>Progresso individual e por matéria: barras de progresso que refletem o desempenho real do usuário, atualizadas em tempo real após cada resposta.</w:t>
+      </w:r>
+    </w:p>
+    <w:p>
+      <w:pPr>
+        <w:pStyle w:val="PargrafodaLista"/>
+        <w:numPr>
+          <w:ilvl w:val="0"/>
+          <w:numId w:val="4"/>
+        </w:numPr>
+        <w:rPr>
+          <w:rFonts w:ascii="Times New Roman" w:hAnsi="Times New Roman" w:eastAsia="Times New Roman" w:cs="Times New Roman"/>
+          <w:color w:val="auto"/>
+        </w:rPr>
+      </w:pPr>
+      <w:r>
+        <w:rPr>
+          <w:rFonts w:ascii="Times New Roman" w:hAnsi="Times New Roman" w:eastAsia="Times New Roman" w:cs="Times New Roman"/>
+          <w:color w:val="auto"/>
+        </w:rPr>
+        <w:t>Integração REST: comunicação entre o Front-End (JavaScript puro) e a API Flask, com tratamento de erros, fallback para simulação e CORS configurado.</w:t>
+      </w:r>
+    </w:p>
+    <w:p>
+      <w:pPr>
+        <w:pStyle w:val="PargrafodaLista"/>
+        <w:numPr>
+          <w:ilvl w:val="0"/>
+          <w:numId w:val="4"/>
+        </w:numPr>
+        <w:rPr>
+          <w:rFonts w:ascii="Times New Roman" w:hAnsi="Times New Roman" w:eastAsia="Times New Roman" w:cs="Times New Roman"/>
+          <w:color w:val="auto"/>
+        </w:rPr>
+      </w:pPr>
+      <w:r>
+        <w:rPr>
+          <w:rFonts w:ascii="Times New Roman" w:hAnsi="Times New Roman" w:eastAsia="Times New Roman" w:cs="Times New Roman"/>
+          <w:color w:val="auto"/>
+        </w:rPr>
+        <w:t>Arquitetura modular: separação clara de responsabilidades em módulos (api.js, materias.js, estudo.js, progresso.js, flashcard.js), facilitando manutenção e testes.</w:t>
+      </w:r>
+    </w:p>
+    <w:p>
+      <w:pPr>
+        <w:rPr>
+          <w:rFonts w:ascii="Times New Roman" w:hAnsi="Times New Roman" w:eastAsia="Times New Roman" w:cs="Times New Roman"/>
+          <w:color w:val="auto"/>
+        </w:rPr>
       </w:pPr>
     </w:p>
     <w:p>
       <w:pPr>
-        <w:pStyle w:val="Normal"/>
-        <w:suppressLineNumbers w:val="0"/>
-        <w:bidi w:val="0"/>
-        <w:spacing w:before="0" w:beforeAutospacing="off" w:after="0" w:afterAutospacing="off" w:line="300" w:lineRule="auto"/>
-        <w:ind w:left="0" w:right="0"/>
-        <w:jc w:val="left"/>
+        <w:rPr>
+          <w:rFonts w:ascii="Times New Roman" w:hAnsi="Times New Roman" w:eastAsia="Times New Roman" w:cs="Times New Roman"/>
+          <w:b/>
+          <w:bCs/>
+          <w:color w:val="auto"/>
+          <w:sz w:val="28"/>
+          <w:szCs w:val="28"/>
+        </w:rPr>
       </w:pPr>
       <w:r>
         <w:rPr>
           <w:rFonts w:ascii="Times New Roman" w:hAnsi="Times New Roman" w:eastAsia="Times New Roman" w:cs="Times New Roman"/>
-          <w:color w:val="000000" w:themeColor="text1" w:themeTint="FF" w:themeShade="FF"/>
-        </w:rPr>
-        <w:t xml:space="preserve">O desenvolvimento do site </w:t>
-      </w:r>
-      <w:r>
-        <w:rPr>
-          <w:rFonts w:ascii="Times New Roman" w:hAnsi="Times New Roman" w:eastAsia="Times New Roman" w:cs="Times New Roman"/>
-          <w:color w:val="000000" w:themeColor="text1" w:themeTint="FF" w:themeShade="FF"/>
-        </w:rPr>
-        <w:t>DStudy</w:t>
-      </w:r>
-      <w:r>
-        <w:rPr>
-          <w:rFonts w:ascii="Times New Roman" w:hAnsi="Times New Roman" w:eastAsia="Times New Roman" w:cs="Times New Roman"/>
-          <w:color w:val="000000" w:themeColor="text1" w:themeTint="FF" w:themeShade="FF"/>
-        </w:rPr>
-        <w:t xml:space="preserve"> permitiu consolidar os conhecimentos adquiridos ao longo do curso técnico em Desenvolvimento de Sistemas. Partindo de uma proposta de sistema gamificado e interativo de auxílio de estudos com </w:t>
-      </w:r>
-      <w:r>
-        <w:rPr>
-          <w:rFonts w:ascii="Times New Roman" w:hAnsi="Times New Roman" w:eastAsia="Times New Roman" w:cs="Times New Roman"/>
-          <w:color w:val="000000" w:themeColor="text1" w:themeTint="FF" w:themeShade="FF"/>
-        </w:rPr>
-        <w:t>fla</w:t>
-      </w:r>
-      <w:r>
-        <w:rPr>
-          <w:rFonts w:ascii="Times New Roman" w:hAnsi="Times New Roman" w:eastAsia="Times New Roman" w:cs="Times New Roman"/>
-          <w:color w:val="000000" w:themeColor="text1" w:themeTint="FF" w:themeShade="FF"/>
-        </w:rPr>
-        <w:t>shcards</w:t>
-      </w:r>
-      <w:r>
-        <w:rPr>
-          <w:rFonts w:ascii="Times New Roman" w:hAnsi="Times New Roman" w:eastAsia="Times New Roman" w:cs="Times New Roman"/>
-          <w:color w:val="000000" w:themeColor="text1" w:themeTint="FF" w:themeShade="FF"/>
-        </w:rPr>
-        <w:t>, os alunos evoluíram de um esboço conceitual para uma aplicação em desenvolvimento que integra Front</w:t>
-      </w:r>
-      <w:r>
-        <w:rPr>
-          <w:rFonts w:ascii="Times New Roman" w:hAnsi="Times New Roman" w:eastAsia="Times New Roman" w:cs="Times New Roman"/>
-          <w:color w:val="000000" w:themeColor="text1" w:themeTint="FF" w:themeShade="FF"/>
-        </w:rPr>
-        <w:t>-</w:t>
-      </w:r>
-      <w:r>
-        <w:rPr>
-          <w:rFonts w:ascii="Times New Roman" w:hAnsi="Times New Roman" w:eastAsia="Times New Roman" w:cs="Times New Roman"/>
-          <w:color w:val="000000" w:themeColor="text1" w:themeTint="FF" w:themeShade="FF"/>
-        </w:rPr>
-        <w:t>End</w:t>
-      </w:r>
-      <w:r>
-        <w:rPr>
-          <w:rFonts w:ascii="Times New Roman" w:hAnsi="Times New Roman" w:eastAsia="Times New Roman" w:cs="Times New Roman"/>
-          <w:color w:val="000000" w:themeColor="text1" w:themeTint="FF" w:themeShade="FF"/>
-        </w:rPr>
-        <w:t>, Back-End e Banco de Dados.</w:t>
+          <w:b/>
+          <w:bCs/>
+          <w:color w:val="auto"/>
+          <w:sz w:val="28"/>
+          <w:szCs w:val="28"/>
+        </w:rPr>
+        <w:t>3.2. Dificuldades Encontradas</w:t>
       </w:r>
     </w:p>
     <w:p>
       <w:pPr>
-        <w:pStyle w:val="Normal"/>
-        <w:suppressLineNumbers w:val="0"/>
-        <w:bidi w:val="0"/>
-        <w:spacing w:before="0" w:beforeAutospacing="off" w:after="0" w:afterAutospacing="off" w:line="300" w:lineRule="auto"/>
-        <w:ind w:left="0" w:right="0" w:firstLine="0"/>
-        <w:jc w:val="left"/>
+        <w:rPr>
+          <w:rFonts w:ascii="Times New Roman" w:hAnsi="Times New Roman" w:eastAsia="Times New Roman" w:cs="Times New Roman"/>
+          <w:color w:val="auto"/>
+        </w:rPr>
       </w:pPr>
       <w:r>
         <w:rPr>
           <w:rFonts w:ascii="Times New Roman" w:hAnsi="Times New Roman" w:eastAsia="Times New Roman" w:cs="Times New Roman"/>
-          <w:color w:val="000000" w:themeColor="text1" w:themeTint="FF" w:themeShade="FF"/>
-        </w:rPr>
-        <w:t>Principais resultados alcançados:</w:t>
-      </w:r>
-    </w:p>
-    <w:p>
-      <w:pPr>
-        <w:pStyle w:val="ListParagraph"/>
-        <w:numPr>
-          <w:ilvl w:val="0"/>
-          <w:numId w:val="3"/>
-        </w:numPr>
-        <w:suppressLineNumbers w:val="0"/>
-        <w:bidi w:val="0"/>
-        <w:spacing w:before="0" w:beforeAutospacing="off" w:after="0" w:afterAutospacing="off" w:line="300" w:lineRule="auto"/>
-        <w:ind w:right="0"/>
-        <w:jc w:val="left"/>
-        <w:rPr>
-          <w:rFonts w:ascii="Times New Roman" w:hAnsi="Times New Roman" w:eastAsia="Times New Roman" w:cs="Times New Roman"/>
           <w:color w:val="auto"/>
-        </w:rPr>
-      </w:pPr>
-      <w:r>
-        <w:rPr>
-          <w:rFonts w:ascii="Times New Roman" w:hAnsi="Times New Roman" w:eastAsia="Times New Roman" w:cs="Times New Roman"/>
-          <w:color w:val="auto"/>
-        </w:rPr>
-        <w:t xml:space="preserve">Versionamento e documentação contínua: uso de </w:t>
-      </w:r>
-      <w:r>
-        <w:rPr>
-          <w:rFonts w:ascii="Times New Roman" w:hAnsi="Times New Roman" w:eastAsia="Times New Roman" w:cs="Times New Roman"/>
-          <w:color w:val="auto"/>
-        </w:rPr>
-        <w:t>Git</w:t>
-      </w:r>
-      <w:r>
-        <w:rPr>
-          <w:rFonts w:ascii="Times New Roman" w:hAnsi="Times New Roman" w:eastAsia="Times New Roman" w:cs="Times New Roman"/>
-          <w:color w:val="auto"/>
-        </w:rPr>
-        <w:t xml:space="preserve">/GitHub, </w:t>
-      </w:r>
-      <w:r>
-        <w:rPr>
-          <w:rFonts w:ascii="Times New Roman" w:hAnsi="Times New Roman" w:eastAsia="Times New Roman" w:cs="Times New Roman"/>
-          <w:color w:val="auto"/>
-        </w:rPr>
-        <w:t>branches</w:t>
-      </w:r>
-      <w:r>
-        <w:rPr>
-          <w:rFonts w:ascii="Times New Roman" w:hAnsi="Times New Roman" w:eastAsia="Times New Roman" w:cs="Times New Roman"/>
-          <w:color w:val="auto"/>
-        </w:rPr>
-        <w:t xml:space="preserve"> por desenvolvedor e um arquivo changes.log que registra detalhadamente cada etapa da pipeline (P01 a P10).</w:t>
-      </w:r>
-    </w:p>
-    <w:p>
-      <w:pPr>
-        <w:pStyle w:val="ListParagraph"/>
-        <w:numPr>
-          <w:ilvl w:val="0"/>
-          <w:numId w:val="3"/>
-        </w:numPr>
-        <w:suppressLineNumbers w:val="0"/>
-        <w:bidi w:val="0"/>
-        <w:spacing w:before="0" w:beforeAutospacing="off" w:after="0" w:afterAutospacing="off" w:line="300" w:lineRule="auto"/>
-        <w:ind w:right="0"/>
-        <w:jc w:val="left"/>
-        <w:rPr>
-          <w:rFonts w:ascii="Times New Roman" w:hAnsi="Times New Roman" w:eastAsia="Times New Roman" w:cs="Times New Roman"/>
-          <w:color w:val="auto"/>
-        </w:rPr>
-      </w:pPr>
-      <w:r>
-        <w:rPr>
-          <w:rFonts w:ascii="Times New Roman" w:hAnsi="Times New Roman" w:eastAsia="Times New Roman" w:cs="Times New Roman"/>
-          <w:color w:val="auto"/>
-        </w:rPr>
-        <w:t>Sistema de flashcards com múltipla escolha: cada flashcard exibe uma pergunta, quatro alternativas e um badge de dificuldade, com verificação automática da resposta.</w:t>
-      </w:r>
-    </w:p>
-    <w:p>
-      <w:pPr>
-        <w:pStyle w:val="ListParagraph"/>
-        <w:numPr>
-          <w:ilvl w:val="0"/>
-          <w:numId w:val="3"/>
-        </w:numPr>
-        <w:suppressLineNumbers w:val="0"/>
-        <w:bidi w:val="0"/>
-        <w:spacing w:before="0" w:beforeAutospacing="off" w:after="0" w:afterAutospacing="off" w:line="300" w:lineRule="auto"/>
-        <w:ind w:right="0"/>
-        <w:jc w:val="left"/>
-        <w:rPr>
-          <w:rFonts w:ascii="Times New Roman" w:hAnsi="Times New Roman" w:eastAsia="Times New Roman" w:cs="Times New Roman"/>
-          <w:color w:val="auto"/>
-        </w:rPr>
-      </w:pPr>
-      <w:r>
-        <w:rPr>
-          <w:rFonts w:ascii="Times New Roman" w:hAnsi="Times New Roman" w:eastAsia="Times New Roman" w:cs="Times New Roman"/>
-          <w:color w:val="auto"/>
-        </w:rPr>
-        <w:t>Lógica de domínio implementada no Back-End: regra de 3 acertos consecutivos para considerar um flashcard dominado, com controle de sequência e repetição espaçada.</w:t>
-      </w:r>
-    </w:p>
-    <w:p>
-      <w:pPr>
-        <w:pStyle w:val="ListParagraph"/>
-        <w:numPr>
-          <w:ilvl w:val="0"/>
-          <w:numId w:val="3"/>
-        </w:numPr>
-        <w:suppressLineNumbers w:val="0"/>
-        <w:bidi w:val="0"/>
-        <w:spacing w:before="0" w:beforeAutospacing="off" w:after="0" w:afterAutospacing="off" w:line="300" w:lineRule="auto"/>
-        <w:ind w:right="0"/>
-        <w:jc w:val="left"/>
-        <w:rPr>
-          <w:rFonts w:ascii="Times New Roman" w:hAnsi="Times New Roman" w:eastAsia="Times New Roman" w:cs="Times New Roman"/>
-          <w:color w:val="auto"/>
-        </w:rPr>
-      </w:pPr>
-      <w:r>
-        <w:rPr>
-          <w:rFonts w:ascii="Times New Roman" w:hAnsi="Times New Roman" w:eastAsia="Times New Roman" w:cs="Times New Roman"/>
-          <w:color w:val="auto"/>
-        </w:rPr>
-        <w:t>Progresso individual e por matéria: barras de progresso que refletem o desempenho real do usuário, atualizadas em tempo real após cada resposta.</w:t>
-      </w:r>
-    </w:p>
-    <w:p>
-      <w:pPr>
-        <w:pStyle w:val="ListParagraph"/>
-        <w:numPr>
-          <w:ilvl w:val="0"/>
-          <w:numId w:val="3"/>
-        </w:numPr>
-        <w:bidi w:val="0"/>
-        <w:rPr>
-          <w:rFonts w:ascii="Times New Roman" w:hAnsi="Times New Roman" w:eastAsia="Times New Roman" w:cs="Times New Roman"/>
-          <w:color w:val="auto"/>
-          <w:sz w:val="22"/>
-          <w:szCs w:val="22"/>
-        </w:rPr>
-      </w:pPr>
-      <w:r>
-        <w:rPr>
-          <w:rFonts w:ascii="Times New Roman" w:hAnsi="Times New Roman" w:eastAsia="Times New Roman" w:cs="Times New Roman"/>
-          <w:color w:val="auto"/>
-        </w:rPr>
-        <w:t>Integração REST: comunicação entre o Front-End (JavaScript puro) e a API Flask, com tratamento de erros, fallback para simulação e CORS configurado.</w:t>
-      </w:r>
-    </w:p>
-    <w:p>
-      <w:pPr>
-        <w:pStyle w:val="ListParagraph"/>
-        <w:numPr>
-          <w:ilvl w:val="0"/>
-          <w:numId w:val="3"/>
-        </w:numPr>
-        <w:bidi w:val="0"/>
-        <w:rPr>
-          <w:rFonts w:ascii="Times New Roman" w:hAnsi="Times New Roman" w:eastAsia="Times New Roman" w:cs="Times New Roman"/>
-          <w:color w:val="auto"/>
-          <w:sz w:val="22"/>
-          <w:szCs w:val="22"/>
-        </w:rPr>
-      </w:pPr>
-      <w:r>
-        <w:rPr>
-          <w:rFonts w:ascii="Times New Roman" w:hAnsi="Times New Roman" w:eastAsia="Times New Roman" w:cs="Times New Roman"/>
-          <w:color w:val="auto"/>
-        </w:rPr>
-        <w:t>Arquitetura modular: separação clara de responsabilidades em módulos (api.js, materias.js, estudo.js, progresso.js, flashcard.js), facilitando manutenção e testes.</w:t>
-      </w:r>
-    </w:p>
-    <w:p>
-      <w:pPr>
-        <w:pStyle w:val="Normal"/>
-        <w:bidi w:val="0"/>
-        <w:ind w:left="0"/>
-        <w:rPr>
-          <w:rFonts w:ascii="Times New Roman" w:hAnsi="Times New Roman" w:eastAsia="Times New Roman" w:cs="Times New Roman"/>
-          <w:color w:val="auto"/>
-          <w:sz w:val="22"/>
-          <w:szCs w:val="22"/>
-        </w:rPr>
-      </w:pPr>
-    </w:p>
-    <w:p>
-      <w:pPr>
-        <w:pStyle w:val="Normal"/>
-        <w:suppressLineNumbers w:val="0"/>
-        <w:bidi w:val="0"/>
-        <w:spacing w:before="0" w:beforeAutospacing="off" w:after="0" w:afterAutospacing="off" w:line="300" w:lineRule="auto"/>
-        <w:ind w:left="0" w:right="0"/>
-        <w:jc w:val="left"/>
-        <w:rPr>
-          <w:rFonts w:ascii="Times New Roman" w:hAnsi="Times New Roman" w:eastAsia="Times New Roman" w:cs="Times New Roman"/>
-          <w:b w:val="1"/>
-          <w:bCs w:val="1"/>
-          <w:i w:val="0"/>
-          <w:iCs w:val="0"/>
-          <w:caps w:val="0"/>
-          <w:smallCaps w:val="0"/>
-          <w:noProof w:val="0"/>
-          <w:color w:val="auto"/>
-          <w:sz w:val="28"/>
-          <w:szCs w:val="28"/>
-          <w:lang w:val="pt-BR"/>
-        </w:rPr>
-      </w:pPr>
-      <w:r>
-        <w:rPr>
-          <w:rFonts w:ascii="Times New Roman" w:hAnsi="Times New Roman" w:eastAsia="Times New Roman" w:cs="Times New Roman"/>
-          <w:b w:val="1"/>
-          <w:bCs w:val="1"/>
-          <w:i w:val="0"/>
-          <w:iCs w:val="0"/>
-          <w:caps w:val="0"/>
-          <w:smallCaps w:val="0"/>
-          <w:noProof w:val="0"/>
-          <w:color w:val="auto"/>
-          <w:sz w:val="28"/>
-          <w:szCs w:val="28"/>
-          <w:lang w:val="pt-BR"/>
-        </w:rPr>
-        <w:t>3.2. Dificuldades Encontradas</w:t>
-      </w:r>
-    </w:p>
-    <w:p>
-      <w:pPr>
-        <w:suppressLineNumbers w:val="0"/>
-        <w:bidi w:val="0"/>
-        <w:spacing w:before="0" w:beforeAutospacing="off" w:after="0" w:afterAutospacing="off" w:line="300" w:lineRule="auto"/>
-        <w:ind w:left="0" w:right="0"/>
-        <w:jc w:val="left"/>
-        <w:rPr>
-          <w:rFonts w:ascii="Times New Roman" w:hAnsi="Times New Roman" w:eastAsia="Times New Roman" w:cs="Times New Roman"/>
-          <w:b w:val="0"/>
-          <w:bCs w:val="0"/>
-          <w:i w:val="0"/>
-          <w:iCs w:val="0"/>
-          <w:caps w:val="0"/>
-          <w:smallCaps w:val="0"/>
-          <w:noProof w:val="0"/>
-          <w:color w:val="auto"/>
-          <w:sz w:val="22"/>
-          <w:szCs w:val="22"/>
-          <w:lang w:val="pt-BR"/>
-        </w:rPr>
-      </w:pPr>
-      <w:r>
-        <w:rPr>
-          <w:rFonts w:ascii="Times New Roman" w:hAnsi="Times New Roman" w:eastAsia="Times New Roman" w:cs="Times New Roman"/>
-          <w:b w:val="0"/>
-          <w:bCs w:val="0"/>
-          <w:i w:val="0"/>
-          <w:iCs w:val="0"/>
-          <w:caps w:val="0"/>
-          <w:smallCaps w:val="0"/>
-          <w:noProof w:val="0"/>
-          <w:color w:val="auto"/>
-          <w:sz w:val="22"/>
-          <w:szCs w:val="22"/>
-          <w:lang w:val="pt-BR"/>
         </w:rPr>
         <w:t>Durante o desenvolvimento, a equipe enfrentou desafios técnicos que contribuíram significativamente para o aprendizado:</w:t>
       </w:r>
     </w:p>
     <w:tbl>
       <w:tblPr>
-        <w:tblStyle w:val="Tabelanormal"/>
-        <w:bidiVisual w:val="0"/>
         <w:tblW w:w="0" w:type="auto"/>
         <w:tblLook w:val="06A0" w:firstRow="1" w:lastRow="0" w:firstColumn="1" w:lastColumn="0" w:noHBand="1" w:noVBand="1"/>
       </w:tblPr>
@@ -12261,43 +12134,26 @@
             <w:tcW w:w="4333" w:type="dxa"/>
             <w:tcBorders>
               <w:top w:val="nil"/>
-              <w:bottom w:val="single" w:sz="6"/>
-            </w:tcBorders>
-            <w:tcMar>
-              <w:top w:w="150" w:type="dxa"/>
-              <w:bottom w:w="150" w:type="dxa"/>
-              <w:right w:w="240" w:type="dxa"/>
-            </w:tcMar>
-            <w:vAlign w:val="center"/>
-          </w:tcPr>
-          <w:p>
-            <w:pPr>
-              <w:suppressLineNumbers w:val="0"/>
-              <w:bidi w:val="0"/>
-              <w:spacing w:before="0" w:beforeAutospacing="off" w:after="0" w:afterAutospacing="off" w:line="300" w:lineRule="auto"/>
-              <w:ind w:left="0" w:right="0"/>
-              <w:jc w:val="left"/>
-              <w:rPr>
-                <w:rFonts w:ascii="Times New Roman" w:hAnsi="Times New Roman" w:eastAsia="Times New Roman" w:cs="Times New Roman"/>
-                <w:b w:val="0"/>
-                <w:bCs w:val="0"/>
-                <w:i w:val="0"/>
-                <w:iCs w:val="0"/>
+              <w:bottom w:val="single" w:color="auto" w:sz="6" w:space="0"/>
+            </w:tcBorders>
+            <w:tcMar>
+              <w:top w:w="150" w:type="dxa"/>
+              <w:bottom w:w="150" w:type="dxa"/>
+              <w:right w:w="240" w:type="dxa"/>
+            </w:tcMar>
+            <w:vAlign w:val="center"/>
+          </w:tcPr>
+          <w:p>
+            <w:pPr>
+              <w:rPr>
+                <w:rFonts w:ascii="Times New Roman" w:hAnsi="Times New Roman" w:eastAsia="Times New Roman" w:cs="Times New Roman"/>
                 <w:color w:val="auto"/>
-                <w:sz w:val="22"/>
-                <w:szCs w:val="22"/>
-              </w:rPr>
-            </w:pPr>
-            <w:r>
-              <w:rPr>
-                <w:rFonts w:ascii="Times New Roman" w:hAnsi="Times New Roman" w:eastAsia="Times New Roman" w:cs="Times New Roman"/>
-                <w:b w:val="0"/>
-                <w:bCs w:val="0"/>
-                <w:i w:val="0"/>
-                <w:iCs w:val="0"/>
+              </w:rPr>
+            </w:pPr>
+            <w:r>
+              <w:rPr>
+                <w:rFonts w:ascii="Times New Roman" w:hAnsi="Times New Roman" w:eastAsia="Times New Roman" w:cs="Times New Roman"/>
                 <w:color w:val="auto"/>
-                <w:sz w:val="22"/>
-                <w:szCs w:val="22"/>
               </w:rPr>
               <w:t>Dificuldade</w:t>
             </w:r>
@@ -12308,44 +12164,27 @@
             <w:tcW w:w="4547" w:type="dxa"/>
             <w:tcBorders>
               <w:top w:val="nil"/>
-              <w:bottom w:val="single" w:sz="6"/>
-            </w:tcBorders>
-            <w:tcMar>
-              <w:top w:w="150" w:type="dxa"/>
-              <w:left w:w="240" w:type="dxa"/>
-              <w:bottom w:w="150" w:type="dxa"/>
-              <w:right w:w="240" w:type="dxa"/>
-            </w:tcMar>
-            <w:vAlign w:val="center"/>
-          </w:tcPr>
-          <w:p>
-            <w:pPr>
-              <w:suppressLineNumbers w:val="0"/>
-              <w:bidi w:val="0"/>
-              <w:spacing w:before="0" w:beforeAutospacing="off" w:after="0" w:afterAutospacing="off" w:line="300" w:lineRule="auto"/>
-              <w:ind w:left="0" w:right="0"/>
-              <w:jc w:val="left"/>
-              <w:rPr>
-                <w:rFonts w:ascii="Times New Roman" w:hAnsi="Times New Roman" w:eastAsia="Times New Roman" w:cs="Times New Roman"/>
-                <w:b w:val="0"/>
-                <w:bCs w:val="0"/>
-                <w:i w:val="0"/>
-                <w:iCs w:val="0"/>
+              <w:bottom w:val="single" w:color="auto" w:sz="6" w:space="0"/>
+            </w:tcBorders>
+            <w:tcMar>
+              <w:top w:w="150" w:type="dxa"/>
+              <w:left w:w="240" w:type="dxa"/>
+              <w:bottom w:w="150" w:type="dxa"/>
+              <w:right w:w="240" w:type="dxa"/>
+            </w:tcMar>
+            <w:vAlign w:val="center"/>
+          </w:tcPr>
+          <w:p>
+            <w:pPr>
+              <w:rPr>
+                <w:rFonts w:ascii="Times New Roman" w:hAnsi="Times New Roman" w:eastAsia="Times New Roman" w:cs="Times New Roman"/>
                 <w:color w:val="auto"/>
-                <w:sz w:val="22"/>
-                <w:szCs w:val="22"/>
-              </w:rPr>
-            </w:pPr>
-            <w:r>
-              <w:rPr>
-                <w:rFonts w:ascii="Times New Roman" w:hAnsi="Times New Roman" w:eastAsia="Times New Roman" w:cs="Times New Roman"/>
-                <w:b w:val="0"/>
-                <w:bCs w:val="0"/>
-                <w:i w:val="0"/>
-                <w:iCs w:val="0"/>
+              </w:rPr>
+            </w:pPr>
+            <w:r>
+              <w:rPr>
+                <w:rFonts w:ascii="Times New Roman" w:hAnsi="Times New Roman" w:eastAsia="Times New Roman" w:cs="Times New Roman"/>
                 <w:color w:val="auto"/>
-                <w:sz w:val="22"/>
-                <w:szCs w:val="22"/>
               </w:rPr>
               <w:t>Solução Aplicada</w:t>
             </w:r>
@@ -12360,43 +12199,26 @@
           <w:tcPr>
             <w:tcW w:w="4333" w:type="dxa"/>
             <w:tcBorders>
-              <w:bottom w:val="single" w:sz="6"/>
-            </w:tcBorders>
-            <w:tcMar>
-              <w:top w:w="150" w:type="dxa"/>
-              <w:bottom w:w="150" w:type="dxa"/>
-              <w:right w:w="240" w:type="dxa"/>
-            </w:tcMar>
-            <w:vAlign w:val="center"/>
-          </w:tcPr>
-          <w:p>
-            <w:pPr>
-              <w:suppressLineNumbers w:val="0"/>
-              <w:bidi w:val="0"/>
-              <w:spacing w:before="0" w:beforeAutospacing="off" w:after="0" w:afterAutospacing="off" w:line="300" w:lineRule="auto"/>
-              <w:ind w:left="0" w:right="0"/>
-              <w:jc w:val="left"/>
-              <w:rPr>
-                <w:rFonts w:ascii="Times New Roman" w:hAnsi="Times New Roman" w:eastAsia="Times New Roman" w:cs="Times New Roman"/>
-                <w:b w:val="0"/>
-                <w:bCs w:val="0"/>
-                <w:i w:val="0"/>
-                <w:iCs w:val="0"/>
+              <w:bottom w:val="single" w:color="auto" w:sz="6" w:space="0"/>
+            </w:tcBorders>
+            <w:tcMar>
+              <w:top w:w="150" w:type="dxa"/>
+              <w:bottom w:w="150" w:type="dxa"/>
+              <w:right w:w="240" w:type="dxa"/>
+            </w:tcMar>
+            <w:vAlign w:val="center"/>
+          </w:tcPr>
+          <w:p>
+            <w:pPr>
+              <w:rPr>
+                <w:rFonts w:ascii="Times New Roman" w:hAnsi="Times New Roman" w:eastAsia="Times New Roman" w:cs="Times New Roman"/>
                 <w:color w:val="auto"/>
-                <w:sz w:val="22"/>
-                <w:szCs w:val="22"/>
-              </w:rPr>
-            </w:pPr>
-            <w:r>
-              <w:rPr>
-                <w:rFonts w:ascii="Times New Roman" w:hAnsi="Times New Roman" w:eastAsia="Times New Roman" w:cs="Times New Roman"/>
-                <w:b w:val="0"/>
-                <w:bCs w:val="0"/>
-                <w:i w:val="0"/>
-                <w:iCs w:val="0"/>
+              </w:rPr>
+            </w:pPr>
+            <w:r>
+              <w:rPr>
+                <w:rFonts w:ascii="Times New Roman" w:hAnsi="Times New Roman" w:eastAsia="Times New Roman" w:cs="Times New Roman"/>
                 <w:color w:val="auto"/>
-                <w:sz w:val="22"/>
-                <w:szCs w:val="22"/>
               </w:rPr>
               <w:t>Configuração do CORS entre Front-End e Back-End</w:t>
             </w:r>
@@ -12406,71 +12228,28 @@
           <w:tcPr>
             <w:tcW w:w="4547" w:type="dxa"/>
             <w:tcBorders>
-              <w:bottom w:val="single" w:sz="6"/>
-            </w:tcBorders>
-            <w:tcMar>
-              <w:top w:w="150" w:type="dxa"/>
-              <w:left w:w="240" w:type="dxa"/>
-              <w:bottom w:w="150" w:type="dxa"/>
-            </w:tcMar>
-            <w:vAlign w:val="center"/>
-          </w:tcPr>
-          <w:p>
-            <w:pPr>
-              <w:suppressLineNumbers w:val="0"/>
-              <w:bidi w:val="0"/>
-              <w:spacing w:before="0" w:beforeAutospacing="off" w:after="0" w:afterAutospacing="off" w:line="300" w:lineRule="auto"/>
-              <w:ind w:left="0" w:right="0"/>
-              <w:jc w:val="left"/>
-              <w:rPr>
-                <w:rFonts w:ascii="Times New Roman" w:hAnsi="Times New Roman" w:eastAsia="Times New Roman" w:cs="Times New Roman"/>
-                <w:b w:val="0"/>
-                <w:bCs w:val="0"/>
-                <w:i w:val="0"/>
-                <w:iCs w:val="0"/>
+              <w:bottom w:val="single" w:color="auto" w:sz="6" w:space="0"/>
+            </w:tcBorders>
+            <w:tcMar>
+              <w:top w:w="150" w:type="dxa"/>
+              <w:left w:w="240" w:type="dxa"/>
+              <w:bottom w:w="150" w:type="dxa"/>
+            </w:tcMar>
+            <w:vAlign w:val="center"/>
+          </w:tcPr>
+          <w:p>
+            <w:pPr>
+              <w:rPr>
+                <w:rFonts w:ascii="Times New Roman" w:hAnsi="Times New Roman" w:eastAsia="Times New Roman" w:cs="Times New Roman"/>
                 <w:color w:val="auto"/>
-                <w:sz w:val="22"/>
-                <w:szCs w:val="22"/>
-              </w:rPr>
-            </w:pPr>
-            <w:r>
-              <w:rPr>
-                <w:rFonts w:ascii="Times New Roman" w:hAnsi="Times New Roman" w:eastAsia="Times New Roman" w:cs="Times New Roman"/>
-                <w:b w:val="0"/>
-                <w:bCs w:val="0"/>
-                <w:i w:val="0"/>
-                <w:iCs w:val="0"/>
+              </w:rPr>
+            </w:pPr>
+            <w:r>
+              <w:rPr>
+                <w:rFonts w:ascii="Times New Roman" w:hAnsi="Times New Roman" w:eastAsia="Times New Roman" w:cs="Times New Roman"/>
                 <w:color w:val="auto"/>
-                <w:sz w:val="22"/>
-                <w:szCs w:val="22"/>
-              </w:rPr>
-              <w:t xml:space="preserve">Instalação e configuração do </w:t>
-            </w:r>
-            <w:r>
-              <w:rPr>
-                <w:rFonts w:ascii="Times New Roman" w:hAnsi="Times New Roman" w:eastAsia="Times New Roman" w:cs="Times New Roman"/>
-                <w:b w:val="0"/>
-                <w:bCs w:val="0"/>
-                <w:i w:val="0"/>
-                <w:iCs w:val="0"/>
-                <w:color w:val="auto"/>
-                <w:sz w:val="22"/>
-                <w:szCs w:val="22"/>
-              </w:rPr>
-              <w:t>flask-cors</w:t>
-            </w:r>
-            <w:r>
-              <w:rPr>
-                <w:rFonts w:ascii="Times New Roman" w:hAnsi="Times New Roman" w:eastAsia="Times New Roman" w:cs="Times New Roman"/>
-                <w:b w:val="0"/>
-                <w:bCs w:val="0"/>
-                <w:i w:val="0"/>
-                <w:iCs w:val="0"/>
-                <w:color w:val="auto"/>
-                <w:sz w:val="22"/>
-                <w:szCs w:val="22"/>
-              </w:rPr>
-              <w:t xml:space="preserve"> no Flask, com liberação de métodos e headers</w:t>
+              </w:rPr>
+              <w:t>Instalação e configuração do flask-cors no Flask, com liberação de métodos e headers</w:t>
             </w:r>
           </w:p>
         </w:tc>
@@ -12483,43 +12262,26 @@
           <w:tcPr>
             <w:tcW w:w="4333" w:type="dxa"/>
             <w:tcBorders>
-              <w:bottom w:val="single" w:sz="6"/>
-            </w:tcBorders>
-            <w:tcMar>
-              <w:top w:w="150" w:type="dxa"/>
-              <w:bottom w:w="150" w:type="dxa"/>
-              <w:right w:w="240" w:type="dxa"/>
-            </w:tcMar>
-            <w:vAlign w:val="center"/>
-          </w:tcPr>
-          <w:p>
-            <w:pPr>
-              <w:suppressLineNumbers w:val="0"/>
-              <w:bidi w:val="0"/>
-              <w:spacing w:before="0" w:beforeAutospacing="off" w:after="0" w:afterAutospacing="off" w:line="300" w:lineRule="auto"/>
-              <w:ind w:left="0" w:right="0"/>
-              <w:jc w:val="left"/>
-              <w:rPr>
-                <w:rFonts w:ascii="Times New Roman" w:hAnsi="Times New Roman" w:eastAsia="Times New Roman" w:cs="Times New Roman"/>
-                <w:b w:val="0"/>
-                <w:bCs w:val="0"/>
-                <w:i w:val="0"/>
-                <w:iCs w:val="0"/>
+              <w:bottom w:val="single" w:color="auto" w:sz="6" w:space="0"/>
+            </w:tcBorders>
+            <w:tcMar>
+              <w:top w:w="150" w:type="dxa"/>
+              <w:bottom w:w="150" w:type="dxa"/>
+              <w:right w:w="240" w:type="dxa"/>
+            </w:tcMar>
+            <w:vAlign w:val="center"/>
+          </w:tcPr>
+          <w:p>
+            <w:pPr>
+              <w:rPr>
+                <w:rFonts w:ascii="Times New Roman" w:hAnsi="Times New Roman" w:eastAsia="Times New Roman" w:cs="Times New Roman"/>
                 <w:color w:val="auto"/>
-                <w:sz w:val="22"/>
-                <w:szCs w:val="22"/>
-              </w:rPr>
-            </w:pPr>
-            <w:r>
-              <w:rPr>
-                <w:rFonts w:ascii="Times New Roman" w:hAnsi="Times New Roman" w:eastAsia="Times New Roman" w:cs="Times New Roman"/>
-                <w:b w:val="0"/>
-                <w:bCs w:val="0"/>
-                <w:i w:val="0"/>
-                <w:iCs w:val="0"/>
+              </w:rPr>
+            </w:pPr>
+            <w:r>
+              <w:rPr>
+                <w:rFonts w:ascii="Times New Roman" w:hAnsi="Times New Roman" w:eastAsia="Times New Roman" w:cs="Times New Roman"/>
                 <w:color w:val="auto"/>
-                <w:sz w:val="22"/>
-                <w:szCs w:val="22"/>
               </w:rPr>
               <w:t>Conexão do Flask com PostgreSQL em porta alternativa (5433)</w:t>
             </w:r>
@@ -12529,97 +12291,28 @@
           <w:tcPr>
             <w:tcW w:w="4547" w:type="dxa"/>
             <w:tcBorders>
-              <w:bottom w:val="single" w:sz="6"/>
-            </w:tcBorders>
-            <w:tcMar>
-              <w:top w:w="150" w:type="dxa"/>
-              <w:left w:w="240" w:type="dxa"/>
-              <w:bottom w:w="150" w:type="dxa"/>
-            </w:tcMar>
-            <w:vAlign w:val="center"/>
-          </w:tcPr>
-          <w:p>
-            <w:pPr>
-              <w:suppressLineNumbers w:val="0"/>
-              <w:bidi w:val="0"/>
-              <w:spacing w:before="0" w:beforeAutospacing="off" w:after="0" w:afterAutospacing="off" w:line="300" w:lineRule="auto"/>
-              <w:ind w:left="0" w:right="0"/>
-              <w:jc w:val="left"/>
-              <w:rPr>
-                <w:rFonts w:ascii="Times New Roman" w:hAnsi="Times New Roman" w:eastAsia="Times New Roman" w:cs="Times New Roman"/>
-                <w:b w:val="0"/>
-                <w:bCs w:val="0"/>
-                <w:i w:val="0"/>
-                <w:iCs w:val="0"/>
+              <w:bottom w:val="single" w:color="auto" w:sz="6" w:space="0"/>
+            </w:tcBorders>
+            <w:tcMar>
+              <w:top w:w="150" w:type="dxa"/>
+              <w:left w:w="240" w:type="dxa"/>
+              <w:bottom w:w="150" w:type="dxa"/>
+            </w:tcMar>
+            <w:vAlign w:val="center"/>
+          </w:tcPr>
+          <w:p>
+            <w:pPr>
+              <w:rPr>
+                <w:rFonts w:ascii="Times New Roman" w:hAnsi="Times New Roman" w:eastAsia="Times New Roman" w:cs="Times New Roman"/>
                 <w:color w:val="auto"/>
-                <w:sz w:val="22"/>
-                <w:szCs w:val="22"/>
-              </w:rPr>
-            </w:pPr>
-            <w:r>
-              <w:rPr>
-                <w:rFonts w:ascii="Times New Roman" w:hAnsi="Times New Roman" w:eastAsia="Times New Roman" w:cs="Times New Roman"/>
-                <w:b w:val="0"/>
-                <w:bCs w:val="0"/>
-                <w:i w:val="0"/>
-                <w:iCs w:val="0"/>
+              </w:rPr>
+            </w:pPr>
+            <w:r>
+              <w:rPr>
+                <w:rFonts w:ascii="Times New Roman" w:hAnsi="Times New Roman" w:eastAsia="Times New Roman" w:cs="Times New Roman"/>
                 <w:color w:val="auto"/>
-                <w:sz w:val="22"/>
-                <w:szCs w:val="22"/>
-              </w:rPr>
-              <w:t xml:space="preserve">Ajuste no </w:t>
-            </w:r>
-            <w:r>
-              <w:rPr>
-                <w:rFonts w:ascii="Times New Roman" w:hAnsi="Times New Roman" w:eastAsia="Times New Roman" w:cs="Times New Roman"/>
-                <w:b w:val="0"/>
-                <w:bCs w:val="0"/>
-                <w:i w:val="0"/>
-                <w:iCs w:val="0"/>
-                <w:color w:val="auto"/>
-                <w:sz w:val="22"/>
-                <w:szCs w:val="22"/>
-              </w:rPr>
-              <w:t>.env</w:t>
-            </w:r>
-            <w:r>
-              <w:rPr>
-                <w:rFonts w:ascii="Times New Roman" w:hAnsi="Times New Roman" w:eastAsia="Times New Roman" w:cs="Times New Roman"/>
-                <w:b w:val="0"/>
-                <w:bCs w:val="0"/>
-                <w:i w:val="0"/>
-                <w:iCs w:val="0"/>
-                <w:color w:val="auto"/>
-                <w:sz w:val="22"/>
-                <w:szCs w:val="22"/>
-              </w:rPr>
-              <w:t xml:space="preserve"> e uso de </w:t>
-            </w:r>
-            <w:r>
-              <w:rPr>
-                <w:rFonts w:ascii="Times New Roman" w:hAnsi="Times New Roman" w:eastAsia="Times New Roman" w:cs="Times New Roman"/>
-                <w:b w:val="0"/>
-                <w:bCs w:val="0"/>
-                <w:i w:val="0"/>
-                <w:iCs w:val="0"/>
-                <w:color w:val="auto"/>
-                <w:sz w:val="22"/>
-                <w:szCs w:val="22"/>
-              </w:rPr>
-              <w:t>load_dotenv()</w:t>
-            </w:r>
-            <w:r>
-              <w:rPr>
-                <w:rFonts w:ascii="Times New Roman" w:hAnsi="Times New Roman" w:eastAsia="Times New Roman" w:cs="Times New Roman"/>
-                <w:b w:val="0"/>
-                <w:bCs w:val="0"/>
-                <w:i w:val="0"/>
-                <w:iCs w:val="0"/>
-                <w:color w:val="auto"/>
-                <w:sz w:val="22"/>
-                <w:szCs w:val="22"/>
-              </w:rPr>
-              <w:t xml:space="preserve"> antes da inicialização do app</w:t>
+              </w:rPr>
+              <w:t>Ajuste no .env e uso de load_dotenv() antes da inicialização do app</w:t>
             </w:r>
           </w:p>
         </w:tc>
@@ -12632,43 +12325,26 @@
           <w:tcPr>
             <w:tcW w:w="4333" w:type="dxa"/>
             <w:tcBorders>
-              <w:bottom w:val="single" w:sz="6"/>
-            </w:tcBorders>
-            <w:tcMar>
-              <w:top w:w="150" w:type="dxa"/>
-              <w:bottom w:w="150" w:type="dxa"/>
-              <w:right w:w="240" w:type="dxa"/>
-            </w:tcMar>
-            <w:vAlign w:val="center"/>
-          </w:tcPr>
-          <w:p>
-            <w:pPr>
-              <w:suppressLineNumbers w:val="0"/>
-              <w:bidi w:val="0"/>
-              <w:spacing w:before="0" w:beforeAutospacing="off" w:after="0" w:afterAutospacing="off" w:line="300" w:lineRule="auto"/>
-              <w:ind w:left="0" w:right="0"/>
-              <w:jc w:val="left"/>
-              <w:rPr>
-                <w:rFonts w:ascii="Times New Roman" w:hAnsi="Times New Roman" w:eastAsia="Times New Roman" w:cs="Times New Roman"/>
-                <w:b w:val="0"/>
-                <w:bCs w:val="0"/>
-                <w:i w:val="0"/>
-                <w:iCs w:val="0"/>
+              <w:bottom w:val="single" w:color="auto" w:sz="6" w:space="0"/>
+            </w:tcBorders>
+            <w:tcMar>
+              <w:top w:w="150" w:type="dxa"/>
+              <w:bottom w:w="150" w:type="dxa"/>
+              <w:right w:w="240" w:type="dxa"/>
+            </w:tcMar>
+            <w:vAlign w:val="center"/>
+          </w:tcPr>
+          <w:p>
+            <w:pPr>
+              <w:rPr>
+                <w:rFonts w:ascii="Times New Roman" w:hAnsi="Times New Roman" w:eastAsia="Times New Roman" w:cs="Times New Roman"/>
                 <w:color w:val="auto"/>
-                <w:sz w:val="22"/>
-                <w:szCs w:val="22"/>
-              </w:rPr>
-            </w:pPr>
-            <w:r>
-              <w:rPr>
-                <w:rFonts w:ascii="Times New Roman" w:hAnsi="Times New Roman" w:eastAsia="Times New Roman" w:cs="Times New Roman"/>
-                <w:b w:val="0"/>
-                <w:bCs w:val="0"/>
-                <w:i w:val="0"/>
-                <w:iCs w:val="0"/>
+              </w:rPr>
+            </w:pPr>
+            <w:r>
+              <w:rPr>
+                <w:rFonts w:ascii="Times New Roman" w:hAnsi="Times New Roman" w:eastAsia="Times New Roman" w:cs="Times New Roman"/>
                 <w:color w:val="auto"/>
-                <w:sz w:val="22"/>
-                <w:szCs w:val="22"/>
               </w:rPr>
               <w:t>Sincronização do progresso entre Front-End e Back-End</w:t>
             </w:r>
@@ -12678,71 +12354,28 @@
           <w:tcPr>
             <w:tcW w:w="4547" w:type="dxa"/>
             <w:tcBorders>
-              <w:bottom w:val="single" w:sz="6"/>
-            </w:tcBorders>
-            <w:tcMar>
-              <w:top w:w="150" w:type="dxa"/>
-              <w:left w:w="240" w:type="dxa"/>
-              <w:bottom w:w="150" w:type="dxa"/>
-            </w:tcMar>
-            <w:vAlign w:val="center"/>
-          </w:tcPr>
-          <w:p>
-            <w:pPr>
-              <w:suppressLineNumbers w:val="0"/>
-              <w:bidi w:val="0"/>
-              <w:spacing w:before="0" w:beforeAutospacing="off" w:after="0" w:afterAutospacing="off" w:line="300" w:lineRule="auto"/>
-              <w:ind w:left="0" w:right="0"/>
-              <w:jc w:val="left"/>
-              <w:rPr>
-                <w:rFonts w:ascii="Times New Roman" w:hAnsi="Times New Roman" w:eastAsia="Times New Roman" w:cs="Times New Roman"/>
-                <w:b w:val="0"/>
-                <w:bCs w:val="0"/>
-                <w:i w:val="0"/>
-                <w:iCs w:val="0"/>
+              <w:bottom w:val="single" w:color="auto" w:sz="6" w:space="0"/>
+            </w:tcBorders>
+            <w:tcMar>
+              <w:top w:w="150" w:type="dxa"/>
+              <w:left w:w="240" w:type="dxa"/>
+              <w:bottom w:w="150" w:type="dxa"/>
+            </w:tcMar>
+            <w:vAlign w:val="center"/>
+          </w:tcPr>
+          <w:p>
+            <w:pPr>
+              <w:rPr>
+                <w:rFonts w:ascii="Times New Roman" w:hAnsi="Times New Roman" w:eastAsia="Times New Roman" w:cs="Times New Roman"/>
                 <w:color w:val="auto"/>
-                <w:sz w:val="22"/>
-                <w:szCs w:val="22"/>
-              </w:rPr>
-            </w:pPr>
-            <w:r>
-              <w:rPr>
-                <w:rFonts w:ascii="Times New Roman" w:hAnsi="Times New Roman" w:eastAsia="Times New Roman" w:cs="Times New Roman"/>
-                <w:b w:val="0"/>
-                <w:bCs w:val="0"/>
-                <w:i w:val="0"/>
-                <w:iCs w:val="0"/>
+              </w:rPr>
+            </w:pPr>
+            <w:r>
+              <w:rPr>
+                <w:rFonts w:ascii="Times New Roman" w:hAnsi="Times New Roman" w:eastAsia="Times New Roman" w:cs="Times New Roman"/>
                 <w:color w:val="auto"/>
-                <w:sz w:val="22"/>
-                <w:szCs w:val="22"/>
-              </w:rPr>
-              <w:t xml:space="preserve">Implementação de rota </w:t>
-            </w:r>
-            <w:r>
-              <w:rPr>
-                <w:rFonts w:ascii="Times New Roman" w:hAnsi="Times New Roman" w:eastAsia="Times New Roman" w:cs="Times New Roman"/>
-                <w:b w:val="0"/>
-                <w:bCs w:val="0"/>
-                <w:i w:val="0"/>
-                <w:iCs w:val="0"/>
-                <w:color w:val="auto"/>
-                <w:sz w:val="22"/>
-                <w:szCs w:val="22"/>
-              </w:rPr>
-              <w:t>GET /materias/{id}/progresso</w:t>
-            </w:r>
-            <w:r>
-              <w:rPr>
-                <w:rFonts w:ascii="Times New Roman" w:hAnsi="Times New Roman" w:eastAsia="Times New Roman" w:cs="Times New Roman"/>
-                <w:b w:val="0"/>
-                <w:bCs w:val="0"/>
-                <w:i w:val="0"/>
-                <w:iCs w:val="0"/>
-                <w:color w:val="auto"/>
-                <w:sz w:val="22"/>
-                <w:szCs w:val="22"/>
-              </w:rPr>
-              <w:t xml:space="preserve"> e cálculo local agregado no Front-End</w:t>
+              </w:rPr>
+              <w:t>Implementação de rota GET /materias/{id}/progresso e cálculo local agregado no Front-End</w:t>
             </w:r>
           </w:p>
         </w:tc>
@@ -12755,43 +12388,26 @@
           <w:tcPr>
             <w:tcW w:w="4333" w:type="dxa"/>
             <w:tcBorders>
-              <w:bottom w:val="single" w:sz="6"/>
-            </w:tcBorders>
-            <w:tcMar>
-              <w:top w:w="150" w:type="dxa"/>
-              <w:bottom w:w="150" w:type="dxa"/>
-              <w:right w:w="240" w:type="dxa"/>
-            </w:tcMar>
-            <w:vAlign w:val="center"/>
-          </w:tcPr>
-          <w:p>
-            <w:pPr>
-              <w:suppressLineNumbers w:val="0"/>
-              <w:bidi w:val="0"/>
-              <w:spacing w:before="0" w:beforeAutospacing="off" w:after="0" w:afterAutospacing="off" w:line="300" w:lineRule="auto"/>
-              <w:ind w:left="0" w:right="0"/>
-              <w:jc w:val="left"/>
-              <w:rPr>
-                <w:rFonts w:ascii="Times New Roman" w:hAnsi="Times New Roman" w:eastAsia="Times New Roman" w:cs="Times New Roman"/>
-                <w:b w:val="0"/>
-                <w:bCs w:val="0"/>
-                <w:i w:val="0"/>
-                <w:iCs w:val="0"/>
+              <w:bottom w:val="single" w:color="auto" w:sz="6" w:space="0"/>
+            </w:tcBorders>
+            <w:tcMar>
+              <w:top w:w="150" w:type="dxa"/>
+              <w:bottom w:w="150" w:type="dxa"/>
+              <w:right w:w="240" w:type="dxa"/>
+            </w:tcMar>
+            <w:vAlign w:val="center"/>
+          </w:tcPr>
+          <w:p>
+            <w:pPr>
+              <w:rPr>
+                <w:rFonts w:ascii="Times New Roman" w:hAnsi="Times New Roman" w:eastAsia="Times New Roman" w:cs="Times New Roman"/>
                 <w:color w:val="auto"/>
-                <w:sz w:val="22"/>
-                <w:szCs w:val="22"/>
-              </w:rPr>
-            </w:pPr>
-            <w:r>
-              <w:rPr>
-                <w:rFonts w:ascii="Times New Roman" w:hAnsi="Times New Roman" w:eastAsia="Times New Roman" w:cs="Times New Roman"/>
-                <w:b w:val="0"/>
-                <w:bCs w:val="0"/>
-                <w:i w:val="0"/>
-                <w:iCs w:val="0"/>
+              </w:rPr>
+            </w:pPr>
+            <w:r>
+              <w:rPr>
+                <w:rFonts w:ascii="Times New Roman" w:hAnsi="Times New Roman" w:eastAsia="Times New Roman" w:cs="Times New Roman"/>
                 <w:color w:val="auto"/>
-                <w:sz w:val="22"/>
-                <w:szCs w:val="22"/>
               </w:rPr>
               <w:t>Dependência de uma API externa em desenvolvimento</w:t>
             </w:r>
@@ -12801,71 +12417,28 @@
           <w:tcPr>
             <w:tcW w:w="4547" w:type="dxa"/>
             <w:tcBorders>
-              <w:bottom w:val="single" w:sz="6"/>
-            </w:tcBorders>
-            <w:tcMar>
-              <w:top w:w="150" w:type="dxa"/>
-              <w:left w:w="240" w:type="dxa"/>
-              <w:bottom w:w="150" w:type="dxa"/>
-            </w:tcMar>
-            <w:vAlign w:val="center"/>
-          </w:tcPr>
-          <w:p>
-            <w:pPr>
-              <w:suppressLineNumbers w:val="0"/>
-              <w:bidi w:val="0"/>
-              <w:spacing w:before="0" w:beforeAutospacing="off" w:after="0" w:afterAutospacing="off" w:line="300" w:lineRule="auto"/>
-              <w:ind w:left="0" w:right="0"/>
-              <w:jc w:val="left"/>
-              <w:rPr>
-                <w:rFonts w:ascii="Times New Roman" w:hAnsi="Times New Roman" w:eastAsia="Times New Roman" w:cs="Times New Roman"/>
-                <w:b w:val="0"/>
-                <w:bCs w:val="0"/>
-                <w:i w:val="0"/>
-                <w:iCs w:val="0"/>
+              <w:bottom w:val="single" w:color="auto" w:sz="6" w:space="0"/>
+            </w:tcBorders>
+            <w:tcMar>
+              <w:top w:w="150" w:type="dxa"/>
+              <w:left w:w="240" w:type="dxa"/>
+              <w:bottom w:w="150" w:type="dxa"/>
+            </w:tcMar>
+            <w:vAlign w:val="center"/>
+          </w:tcPr>
+          <w:p>
+            <w:pPr>
+              <w:rPr>
+                <w:rFonts w:ascii="Times New Roman" w:hAnsi="Times New Roman" w:eastAsia="Times New Roman" w:cs="Times New Roman"/>
                 <w:color w:val="auto"/>
-                <w:sz w:val="22"/>
-                <w:szCs w:val="22"/>
-              </w:rPr>
-            </w:pPr>
-            <w:r>
-              <w:rPr>
-                <w:rFonts w:ascii="Times New Roman" w:hAnsi="Times New Roman" w:eastAsia="Times New Roman" w:cs="Times New Roman"/>
-                <w:b w:val="0"/>
-                <w:bCs w:val="0"/>
-                <w:i w:val="0"/>
-                <w:iCs w:val="0"/>
+              </w:rPr>
+            </w:pPr>
+            <w:r>
+              <w:rPr>
+                <w:rFonts w:ascii="Times New Roman" w:hAnsi="Times New Roman" w:eastAsia="Times New Roman" w:cs="Times New Roman"/>
                 <w:color w:val="auto"/>
-                <w:sz w:val="22"/>
-                <w:szCs w:val="22"/>
-              </w:rPr>
-              <w:t xml:space="preserve">Criação de um modo de simulação isolado no arquivo </w:t>
-            </w:r>
-            <w:r>
-              <w:rPr>
-                <w:rFonts w:ascii="Times New Roman" w:hAnsi="Times New Roman" w:eastAsia="Times New Roman" w:cs="Times New Roman"/>
-                <w:b w:val="0"/>
-                <w:bCs w:val="0"/>
-                <w:i w:val="0"/>
-                <w:iCs w:val="0"/>
-                <w:color w:val="auto"/>
-                <w:sz w:val="22"/>
-                <w:szCs w:val="22"/>
-              </w:rPr>
-              <w:t>simulacao.js</w:t>
-            </w:r>
-            <w:r>
-              <w:rPr>
-                <w:rFonts w:ascii="Times New Roman" w:hAnsi="Times New Roman" w:eastAsia="Times New Roman" w:cs="Times New Roman"/>
-                <w:b w:val="0"/>
-                <w:bCs w:val="0"/>
-                <w:i w:val="0"/>
-                <w:iCs w:val="0"/>
-                <w:color w:val="auto"/>
-                <w:sz w:val="22"/>
-                <w:szCs w:val="22"/>
-              </w:rPr>
-              <w:t>, com fallback automático</w:t>
+              </w:rPr>
+              <w:t>Criação de um modo de simulação isolado no arquivo simulacao.js, com fallback automático</w:t>
             </w:r>
           </w:p>
         </w:tc>
@@ -12878,43 +12451,26 @@
           <w:tcPr>
             <w:tcW w:w="4333" w:type="dxa"/>
             <w:tcBorders>
-              <w:bottom w:val="single" w:sz="6"/>
-            </w:tcBorders>
-            <w:tcMar>
-              <w:top w:w="150" w:type="dxa"/>
-              <w:bottom w:w="150" w:type="dxa"/>
-              <w:right w:w="240" w:type="dxa"/>
-            </w:tcMar>
-            <w:vAlign w:val="center"/>
-          </w:tcPr>
-          <w:p>
-            <w:pPr>
-              <w:suppressLineNumbers w:val="0"/>
-              <w:bidi w:val="0"/>
-              <w:spacing w:before="0" w:beforeAutospacing="off" w:after="0" w:afterAutospacing="off" w:line="300" w:lineRule="auto"/>
-              <w:ind w:left="0" w:right="0"/>
-              <w:jc w:val="left"/>
-              <w:rPr>
-                <w:rFonts w:ascii="Times New Roman" w:hAnsi="Times New Roman" w:eastAsia="Times New Roman" w:cs="Times New Roman"/>
-                <w:b w:val="0"/>
-                <w:bCs w:val="0"/>
-                <w:i w:val="0"/>
-                <w:iCs w:val="0"/>
+              <w:bottom w:val="single" w:color="auto" w:sz="6" w:space="0"/>
+            </w:tcBorders>
+            <w:tcMar>
+              <w:top w:w="150" w:type="dxa"/>
+              <w:bottom w:w="150" w:type="dxa"/>
+              <w:right w:w="240" w:type="dxa"/>
+            </w:tcMar>
+            <w:vAlign w:val="center"/>
+          </w:tcPr>
+          <w:p>
+            <w:pPr>
+              <w:rPr>
+                <w:rFonts w:ascii="Times New Roman" w:hAnsi="Times New Roman" w:eastAsia="Times New Roman" w:cs="Times New Roman"/>
                 <w:color w:val="auto"/>
-                <w:sz w:val="22"/>
-                <w:szCs w:val="22"/>
-              </w:rPr>
-            </w:pPr>
-            <w:r>
-              <w:rPr>
-                <w:rFonts w:ascii="Times New Roman" w:hAnsi="Times New Roman" w:eastAsia="Times New Roman" w:cs="Times New Roman"/>
-                <w:b w:val="0"/>
-                <w:bCs w:val="0"/>
-                <w:i w:val="0"/>
-                <w:iCs w:val="0"/>
+              </w:rPr>
+            </w:pPr>
+            <w:r>
+              <w:rPr>
+                <w:rFonts w:ascii="Times New Roman" w:hAnsi="Times New Roman" w:eastAsia="Times New Roman" w:cs="Times New Roman"/>
                 <w:color w:val="auto"/>
-                <w:sz w:val="22"/>
-                <w:szCs w:val="22"/>
               </w:rPr>
               <w:t>Controle de estado do flashcard ao trocar de matéria</w:t>
             </w:r>
@@ -12924,71 +12480,28 @@
           <w:tcPr>
             <w:tcW w:w="4547" w:type="dxa"/>
             <w:tcBorders>
-              <w:bottom w:val="single" w:sz="6"/>
-            </w:tcBorders>
-            <w:tcMar>
-              <w:top w:w="150" w:type="dxa"/>
-              <w:left w:w="240" w:type="dxa"/>
-              <w:bottom w:w="150" w:type="dxa"/>
-            </w:tcMar>
-            <w:vAlign w:val="center"/>
-          </w:tcPr>
-          <w:p>
-            <w:pPr>
-              <w:suppressLineNumbers w:val="0"/>
-              <w:bidi w:val="0"/>
-              <w:spacing w:before="0" w:beforeAutospacing="off" w:after="0" w:afterAutospacing="off" w:line="300" w:lineRule="auto"/>
-              <w:ind w:left="0" w:right="0"/>
-              <w:jc w:val="left"/>
-              <w:rPr>
-                <w:rFonts w:ascii="Times New Roman" w:hAnsi="Times New Roman" w:eastAsia="Times New Roman" w:cs="Times New Roman"/>
-                <w:b w:val="0"/>
-                <w:bCs w:val="0"/>
-                <w:i w:val="0"/>
-                <w:iCs w:val="0"/>
+              <w:bottom w:val="single" w:color="auto" w:sz="6" w:space="0"/>
+            </w:tcBorders>
+            <w:tcMar>
+              <w:top w:w="150" w:type="dxa"/>
+              <w:left w:w="240" w:type="dxa"/>
+              <w:bottom w:w="150" w:type="dxa"/>
+            </w:tcMar>
+            <w:vAlign w:val="center"/>
+          </w:tcPr>
+          <w:p>
+            <w:pPr>
+              <w:rPr>
+                <w:rFonts w:ascii="Times New Roman" w:hAnsi="Times New Roman" w:eastAsia="Times New Roman" w:cs="Times New Roman"/>
                 <w:color w:val="auto"/>
-                <w:sz w:val="22"/>
-                <w:szCs w:val="22"/>
-              </w:rPr>
-            </w:pPr>
-            <w:r>
-              <w:rPr>
-                <w:rFonts w:ascii="Times New Roman" w:hAnsi="Times New Roman" w:eastAsia="Times New Roman" w:cs="Times New Roman"/>
-                <w:b w:val="0"/>
-                <w:bCs w:val="0"/>
-                <w:i w:val="0"/>
-                <w:iCs w:val="0"/>
+              </w:rPr>
+            </w:pPr>
+            <w:r>
+              <w:rPr>
+                <w:rFonts w:ascii="Times New Roman" w:hAnsi="Times New Roman" w:eastAsia="Times New Roman" w:cs="Times New Roman"/>
                 <w:color w:val="auto"/>
-                <w:sz w:val="22"/>
-                <w:szCs w:val="22"/>
-              </w:rPr>
-              <w:t>Reset explícito do componente (</w:t>
-            </w:r>
-            <w:r>
-              <w:rPr>
-                <w:rFonts w:ascii="Times New Roman" w:hAnsi="Times New Roman" w:eastAsia="Times New Roman" w:cs="Times New Roman"/>
-                <w:b w:val="0"/>
-                <w:bCs w:val="0"/>
-                <w:i w:val="0"/>
-                <w:iCs w:val="0"/>
-                <w:color w:val="auto"/>
-                <w:sz w:val="22"/>
-                <w:szCs w:val="22"/>
-              </w:rPr>
-              <w:t>flashcardComponent.limpar()</w:t>
-            </w:r>
-            <w:r>
-              <w:rPr>
-                <w:rFonts w:ascii="Times New Roman" w:hAnsi="Times New Roman" w:eastAsia="Times New Roman" w:cs="Times New Roman"/>
-                <w:b w:val="0"/>
-                <w:bCs w:val="0"/>
-                <w:i w:val="0"/>
-                <w:iCs w:val="0"/>
-                <w:color w:val="auto"/>
-                <w:sz w:val="22"/>
-                <w:szCs w:val="22"/>
-              </w:rPr>
-              <w:t>) e uso de flags de proteção</w:t>
+              </w:rPr>
+              <w:t>Reset explícito do componente (flashcardComponent.limpar()) e uso de flags de proteção</w:t>
             </w:r>
           </w:p>
         </w:tc>
@@ -13001,43 +12514,26 @@
           <w:tcPr>
             <w:tcW w:w="4333" w:type="dxa"/>
             <w:tcBorders>
-              <w:bottom w:val="single" w:sz="6"/>
-            </w:tcBorders>
-            <w:tcMar>
-              <w:top w:w="150" w:type="dxa"/>
-              <w:bottom w:w="150" w:type="dxa"/>
-              <w:right w:w="240" w:type="dxa"/>
-            </w:tcMar>
-            <w:vAlign w:val="center"/>
-          </w:tcPr>
-          <w:p>
-            <w:pPr>
-              <w:suppressLineNumbers w:val="0"/>
-              <w:bidi w:val="0"/>
-              <w:spacing w:before="0" w:beforeAutospacing="off" w:after="0" w:afterAutospacing="off" w:line="300" w:lineRule="auto"/>
-              <w:ind w:left="0" w:right="0"/>
-              <w:jc w:val="left"/>
-              <w:rPr>
-                <w:rFonts w:ascii="Times New Roman" w:hAnsi="Times New Roman" w:eastAsia="Times New Roman" w:cs="Times New Roman"/>
-                <w:b w:val="0"/>
-                <w:bCs w:val="0"/>
-                <w:i w:val="0"/>
-                <w:iCs w:val="0"/>
+              <w:bottom w:val="single" w:color="auto" w:sz="6" w:space="0"/>
+            </w:tcBorders>
+            <w:tcMar>
+              <w:top w:w="150" w:type="dxa"/>
+              <w:bottom w:w="150" w:type="dxa"/>
+              <w:right w:w="240" w:type="dxa"/>
+            </w:tcMar>
+            <w:vAlign w:val="center"/>
+          </w:tcPr>
+          <w:p>
+            <w:pPr>
+              <w:rPr>
+                <w:rFonts w:ascii="Times New Roman" w:hAnsi="Times New Roman" w:eastAsia="Times New Roman" w:cs="Times New Roman"/>
                 <w:color w:val="auto"/>
-                <w:sz w:val="22"/>
-                <w:szCs w:val="22"/>
-              </w:rPr>
-            </w:pPr>
-            <w:r>
-              <w:rPr>
-                <w:rFonts w:ascii="Times New Roman" w:hAnsi="Times New Roman" w:eastAsia="Times New Roman" w:cs="Times New Roman"/>
-                <w:b w:val="0"/>
-                <w:bCs w:val="0"/>
-                <w:i w:val="0"/>
-                <w:iCs w:val="0"/>
+              </w:rPr>
+            </w:pPr>
+            <w:r>
+              <w:rPr>
+                <w:rFonts w:ascii="Times New Roman" w:hAnsi="Times New Roman" w:eastAsia="Times New Roman" w:cs="Times New Roman"/>
                 <w:color w:val="auto"/>
-                <w:sz w:val="22"/>
-                <w:szCs w:val="22"/>
               </w:rPr>
               <w:t>Layout do flashcard 3D cortando conteúdo no verso</w:t>
             </w:r>
@@ -13047,123 +12543,28 @@
           <w:tcPr>
             <w:tcW w:w="4547" w:type="dxa"/>
             <w:tcBorders>
-              <w:bottom w:val="single" w:sz="6"/>
-            </w:tcBorders>
-            <w:tcMar>
-              <w:top w:w="150" w:type="dxa"/>
-              <w:left w:w="240" w:type="dxa"/>
-              <w:bottom w:w="150" w:type="dxa"/>
-            </w:tcMar>
-            <w:vAlign w:val="center"/>
-          </w:tcPr>
-          <w:p>
-            <w:pPr>
-              <w:suppressLineNumbers w:val="0"/>
-              <w:bidi w:val="0"/>
-              <w:spacing w:before="0" w:beforeAutospacing="off" w:after="0" w:afterAutospacing="off" w:line="300" w:lineRule="auto"/>
-              <w:ind w:left="0" w:right="0"/>
-              <w:jc w:val="left"/>
-              <w:rPr>
-                <w:rFonts w:ascii="Times New Roman" w:hAnsi="Times New Roman" w:eastAsia="Times New Roman" w:cs="Times New Roman"/>
-                <w:b w:val="0"/>
-                <w:bCs w:val="0"/>
-                <w:i w:val="0"/>
-                <w:iCs w:val="0"/>
+              <w:bottom w:val="single" w:color="auto" w:sz="6" w:space="0"/>
+            </w:tcBorders>
+            <w:tcMar>
+              <w:top w:w="150" w:type="dxa"/>
+              <w:left w:w="240" w:type="dxa"/>
+              <w:bottom w:w="150" w:type="dxa"/>
+            </w:tcMar>
+            <w:vAlign w:val="center"/>
+          </w:tcPr>
+          <w:p>
+            <w:pPr>
+              <w:rPr>
+                <w:rFonts w:ascii="Times New Roman" w:hAnsi="Times New Roman" w:eastAsia="Times New Roman" w:cs="Times New Roman"/>
                 <w:color w:val="auto"/>
-                <w:sz w:val="22"/>
-                <w:szCs w:val="22"/>
-              </w:rPr>
-            </w:pPr>
-            <w:r>
-              <w:rPr>
-                <w:rFonts w:ascii="Times New Roman" w:hAnsi="Times New Roman" w:eastAsia="Times New Roman" w:cs="Times New Roman"/>
-                <w:b w:val="0"/>
-                <w:bCs w:val="0"/>
-                <w:i w:val="0"/>
-                <w:iCs w:val="0"/>
+              </w:rPr>
+            </w:pPr>
+            <w:r>
+              <w:rPr>
+                <w:rFonts w:ascii="Times New Roman" w:hAnsi="Times New Roman" w:eastAsia="Times New Roman" w:cs="Times New Roman"/>
                 <w:color w:val="auto"/>
-                <w:sz w:val="22"/>
-                <w:szCs w:val="22"/>
-              </w:rPr>
-              <w:t>Ajuste de CSS (</w:t>
-            </w:r>
-            <w:r>
-              <w:rPr>
-                <w:rFonts w:ascii="Times New Roman" w:hAnsi="Times New Roman" w:eastAsia="Times New Roman" w:cs="Times New Roman"/>
-                <w:b w:val="0"/>
-                <w:bCs w:val="0"/>
-                <w:i w:val="0"/>
-                <w:iCs w:val="0"/>
-                <w:color w:val="auto"/>
-                <w:sz w:val="22"/>
-                <w:szCs w:val="22"/>
-              </w:rPr>
-              <w:t>overflow</w:t>
-            </w:r>
-            <w:r>
-              <w:rPr>
-                <w:rFonts w:ascii="Times New Roman" w:hAnsi="Times New Roman" w:eastAsia="Times New Roman" w:cs="Times New Roman"/>
-                <w:b w:val="0"/>
-                <w:bCs w:val="0"/>
-                <w:i w:val="0"/>
-                <w:iCs w:val="0"/>
-                <w:color w:val="auto"/>
-                <w:sz w:val="22"/>
-                <w:szCs w:val="22"/>
-              </w:rPr>
-              <w:t xml:space="preserve">, </w:t>
-            </w:r>
-            <w:r>
-              <w:rPr>
-                <w:rFonts w:ascii="Times New Roman" w:hAnsi="Times New Roman" w:eastAsia="Times New Roman" w:cs="Times New Roman"/>
-                <w:b w:val="0"/>
-                <w:bCs w:val="0"/>
-                <w:i w:val="0"/>
-                <w:iCs w:val="0"/>
-                <w:color w:val="auto"/>
-                <w:sz w:val="22"/>
-                <w:szCs w:val="22"/>
-              </w:rPr>
-              <w:t>height</w:t>
-            </w:r>
-            <w:r>
-              <w:rPr>
-                <w:rFonts w:ascii="Times New Roman" w:hAnsi="Times New Roman" w:eastAsia="Times New Roman" w:cs="Times New Roman"/>
-                <w:b w:val="0"/>
-                <w:bCs w:val="0"/>
-                <w:i w:val="0"/>
-                <w:iCs w:val="0"/>
-                <w:color w:val="auto"/>
-                <w:sz w:val="22"/>
-                <w:szCs w:val="22"/>
-              </w:rPr>
-              <w:t xml:space="preserve">, </w:t>
-            </w:r>
-            <w:r>
-              <w:rPr>
-                <w:rFonts w:ascii="Times New Roman" w:hAnsi="Times New Roman" w:eastAsia="Times New Roman" w:cs="Times New Roman"/>
-                <w:b w:val="0"/>
-                <w:bCs w:val="0"/>
-                <w:i w:val="0"/>
-                <w:iCs w:val="0"/>
-                <w:color w:val="auto"/>
-                <w:sz w:val="22"/>
-                <w:szCs w:val="22"/>
-              </w:rPr>
-              <w:t>backface-visibility</w:t>
-            </w:r>
-            <w:r>
-              <w:rPr>
-                <w:rFonts w:ascii="Times New Roman" w:hAnsi="Times New Roman" w:eastAsia="Times New Roman" w:cs="Times New Roman"/>
-                <w:b w:val="0"/>
-                <w:bCs w:val="0"/>
-                <w:i w:val="0"/>
-                <w:iCs w:val="0"/>
-                <w:color w:val="auto"/>
-                <w:sz w:val="22"/>
-                <w:szCs w:val="22"/>
-              </w:rPr>
-              <w:t>) e remoção de barra de rolagem durante a animação</w:t>
+              </w:rPr>
+              <w:t>Ajuste de CSS (overflow, height, backface-visibility) e remoção de barra de rolagem durante a animação</w:t>
             </w:r>
           </w:p>
         </w:tc>
@@ -13176,43 +12577,26 @@
           <w:tcPr>
             <w:tcW w:w="4333" w:type="dxa"/>
             <w:tcBorders>
-              <w:bottom w:val="single" w:sz="6"/>
-            </w:tcBorders>
-            <w:tcMar>
-              <w:top w:w="150" w:type="dxa"/>
-              <w:bottom w:w="150" w:type="dxa"/>
-              <w:right w:w="240" w:type="dxa"/>
-            </w:tcMar>
-            <w:vAlign w:val="center"/>
-          </w:tcPr>
-          <w:p>
-            <w:pPr>
-              <w:suppressLineNumbers w:val="0"/>
-              <w:bidi w:val="0"/>
-              <w:spacing w:before="0" w:beforeAutospacing="off" w:after="0" w:afterAutospacing="off" w:line="300" w:lineRule="auto"/>
-              <w:ind w:left="0" w:right="0"/>
-              <w:jc w:val="left"/>
-              <w:rPr>
-                <w:rFonts w:ascii="Times New Roman" w:hAnsi="Times New Roman" w:eastAsia="Times New Roman" w:cs="Times New Roman"/>
-                <w:b w:val="0"/>
-                <w:bCs w:val="0"/>
-                <w:i w:val="0"/>
-                <w:iCs w:val="0"/>
+              <w:bottom w:val="single" w:color="auto" w:sz="6" w:space="0"/>
+            </w:tcBorders>
+            <w:tcMar>
+              <w:top w:w="150" w:type="dxa"/>
+              <w:bottom w:w="150" w:type="dxa"/>
+              <w:right w:w="240" w:type="dxa"/>
+            </w:tcMar>
+            <w:vAlign w:val="center"/>
+          </w:tcPr>
+          <w:p>
+            <w:pPr>
+              <w:rPr>
+                <w:rFonts w:ascii="Times New Roman" w:hAnsi="Times New Roman" w:eastAsia="Times New Roman" w:cs="Times New Roman"/>
                 <w:color w:val="auto"/>
-                <w:sz w:val="22"/>
-                <w:szCs w:val="22"/>
-              </w:rPr>
-            </w:pPr>
-            <w:r>
-              <w:rPr>
-                <w:rFonts w:ascii="Times New Roman" w:hAnsi="Times New Roman" w:eastAsia="Times New Roman" w:cs="Times New Roman"/>
-                <w:b w:val="0"/>
-                <w:bCs w:val="0"/>
-                <w:i w:val="0"/>
-                <w:iCs w:val="0"/>
+              </w:rPr>
+            </w:pPr>
+            <w:r>
+              <w:rPr>
+                <w:rFonts w:ascii="Times New Roman" w:hAnsi="Times New Roman" w:eastAsia="Times New Roman" w:cs="Times New Roman"/>
                 <w:color w:val="auto"/>
-                <w:sz w:val="22"/>
-                <w:szCs w:val="22"/>
               </w:rPr>
               <w:t>Contagem incorreta de flashcards nos cards</w:t>
             </w:r>
@@ -13222,71 +12606,28 @@
           <w:tcPr>
             <w:tcW w:w="4547" w:type="dxa"/>
             <w:tcBorders>
-              <w:bottom w:val="single" w:sz="6"/>
-            </w:tcBorders>
-            <w:tcMar>
-              <w:top w:w="150" w:type="dxa"/>
-              <w:left w:w="240" w:type="dxa"/>
-              <w:bottom w:w="150" w:type="dxa"/>
-            </w:tcMar>
-            <w:vAlign w:val="center"/>
-          </w:tcPr>
-          <w:p>
-            <w:pPr>
-              <w:suppressLineNumbers w:val="0"/>
-              <w:bidi w:val="0"/>
-              <w:spacing w:before="0" w:beforeAutospacing="off" w:after="0" w:afterAutospacing="off" w:line="300" w:lineRule="auto"/>
-              <w:ind w:left="0" w:right="0"/>
-              <w:jc w:val="left"/>
-              <w:rPr>
-                <w:rFonts w:ascii="Times New Roman" w:hAnsi="Times New Roman" w:eastAsia="Times New Roman" w:cs="Times New Roman"/>
-                <w:b w:val="0"/>
-                <w:bCs w:val="0"/>
-                <w:i w:val="0"/>
-                <w:iCs w:val="0"/>
+              <w:bottom w:val="single" w:color="auto" w:sz="6" w:space="0"/>
+            </w:tcBorders>
+            <w:tcMar>
+              <w:top w:w="150" w:type="dxa"/>
+              <w:left w:w="240" w:type="dxa"/>
+              <w:bottom w:w="150" w:type="dxa"/>
+            </w:tcMar>
+            <w:vAlign w:val="center"/>
+          </w:tcPr>
+          <w:p>
+            <w:pPr>
+              <w:rPr>
+                <w:rFonts w:ascii="Times New Roman" w:hAnsi="Times New Roman" w:eastAsia="Times New Roman" w:cs="Times New Roman"/>
                 <w:color w:val="auto"/>
-                <w:sz w:val="22"/>
-                <w:szCs w:val="22"/>
-              </w:rPr>
-            </w:pPr>
-            <w:r>
-              <w:rPr>
-                <w:rFonts w:ascii="Times New Roman" w:hAnsi="Times New Roman" w:eastAsia="Times New Roman" w:cs="Times New Roman"/>
-                <w:b w:val="0"/>
-                <w:bCs w:val="0"/>
-                <w:i w:val="0"/>
-                <w:iCs w:val="0"/>
+              </w:rPr>
+            </w:pPr>
+            <w:r>
+              <w:rPr>
+                <w:rFonts w:ascii="Times New Roman" w:hAnsi="Times New Roman" w:eastAsia="Times New Roman" w:cs="Times New Roman"/>
                 <w:color w:val="auto"/>
-                <w:sz w:val="22"/>
-                <w:szCs w:val="22"/>
-              </w:rPr>
-              <w:t>Correção da ordem de carregamento (</w:t>
-            </w:r>
-            <w:r>
-              <w:rPr>
-                <w:rFonts w:ascii="Times New Roman" w:hAnsi="Times New Roman" w:eastAsia="Times New Roman" w:cs="Times New Roman"/>
-                <w:b w:val="0"/>
-                <w:bCs w:val="0"/>
-                <w:i w:val="0"/>
-                <w:iCs w:val="0"/>
-                <w:color w:val="auto"/>
-                <w:sz w:val="22"/>
-                <w:szCs w:val="22"/>
-              </w:rPr>
-              <w:t>matérias → progresso → renderização</w:t>
-            </w:r>
-            <w:r>
-              <w:rPr>
-                <w:rFonts w:ascii="Times New Roman" w:hAnsi="Times New Roman" w:eastAsia="Times New Roman" w:cs="Times New Roman"/>
-                <w:b w:val="0"/>
-                <w:bCs w:val="0"/>
-                <w:i w:val="0"/>
-                <w:iCs w:val="0"/>
-                <w:color w:val="auto"/>
-                <w:sz w:val="22"/>
-                <w:szCs w:val="22"/>
-              </w:rPr>
-              <w:t>) e uso de dados reais da API</w:t>
+              </w:rPr>
+              <w:t>Correção da ordem de carregamento (matérias → progresso → renderização) e uso de dados reais da API</w:t>
             </w:r>
           </w:p>
         </w:tc>
@@ -13294,227 +12635,104 @@
     </w:tbl>
     <w:p>
       <w:pPr>
-        <w:pStyle w:val="Normal"/>
-        <w:suppressLineNumbers w:val="0"/>
-        <w:bidi w:val="0"/>
-        <w:spacing w:before="0" w:beforeAutospacing="off" w:after="0" w:afterAutospacing="off" w:line="300" w:lineRule="auto"/>
-        <w:ind w:left="0" w:right="0"/>
-        <w:jc w:val="left"/>
-        <w:rPr>
-          <w:rFonts w:ascii="Times New Roman" w:hAnsi="Times New Roman" w:eastAsia="Times New Roman" w:cs="Times New Roman"/>
-          <w:color w:val="000000" w:themeColor="text1" w:themeTint="FF" w:themeShade="FF"/>
+        <w:rPr>
+          <w:rFonts w:ascii="Times New Roman" w:hAnsi="Times New Roman" w:eastAsia="Times New Roman" w:cs="Times New Roman"/>
+          <w:color w:val="000000" w:themeColor="text1"/>
         </w:rPr>
       </w:pPr>
     </w:p>
     <w:p>
       <w:pPr>
-        <w:pStyle w:val="Normal"/>
-        <w:suppressLineNumbers w:val="0"/>
-        <w:bidi w:val="0"/>
-        <w:spacing w:before="0" w:beforeAutospacing="off" w:after="0" w:afterAutospacing="off" w:line="300" w:lineRule="auto"/>
-        <w:ind w:left="0" w:right="0" w:firstLine="0"/>
-        <w:jc w:val="left"/>
-        <w:rPr>
-          <w:rFonts w:ascii="Times New Roman" w:hAnsi="Times New Roman" w:eastAsia="Times New Roman" w:cs="Times New Roman"/>
-          <w:b w:val="1"/>
-          <w:bCs w:val="1"/>
-          <w:i w:val="0"/>
-          <w:iCs w:val="0"/>
-          <w:caps w:val="0"/>
-          <w:smallCaps w:val="0"/>
-          <w:noProof w:val="0"/>
+        <w:rPr>
+          <w:rFonts w:ascii="Times New Roman" w:hAnsi="Times New Roman" w:eastAsia="Times New Roman" w:cs="Times New Roman"/>
+          <w:b/>
+          <w:bCs/>
           <w:color w:val="auto"/>
-          <w:sz w:val="22"/>
-          <w:szCs w:val="22"/>
-          <w:lang w:val="pt-BR"/>
         </w:rPr>
       </w:pPr>
       <w:r>
         <w:rPr>
           <w:rFonts w:ascii="Times New Roman" w:hAnsi="Times New Roman" w:eastAsia="Times New Roman" w:cs="Times New Roman"/>
-          <w:b w:val="1"/>
-          <w:bCs w:val="1"/>
-          <w:i w:val="0"/>
-          <w:iCs w:val="0"/>
-          <w:caps w:val="0"/>
-          <w:smallCaps w:val="0"/>
-          <w:noProof w:val="0"/>
+          <w:b/>
+          <w:bCs/>
           <w:color w:val="auto"/>
-          <w:sz w:val="22"/>
-          <w:szCs w:val="22"/>
-          <w:lang w:val="pt-BR"/>
         </w:rPr>
         <w:t>3.3. Melhorias Futuras (Backlog)</w:t>
       </w:r>
     </w:p>
     <w:p>
       <w:pPr>
-        <w:suppressLineNumbers w:val="0"/>
-        <w:bidi w:val="0"/>
-        <w:spacing w:before="0" w:beforeAutospacing="off" w:after="0" w:afterAutospacing="off" w:line="300" w:lineRule="auto"/>
-        <w:ind w:left="0" w:right="0" w:firstLine="0"/>
-        <w:jc w:val="left"/>
-        <w:rPr>
-          <w:rFonts w:ascii="Times New Roman" w:hAnsi="Times New Roman" w:eastAsia="Times New Roman" w:cs="Times New Roman"/>
-          <w:b w:val="0"/>
-          <w:bCs w:val="0"/>
-          <w:i w:val="0"/>
-          <w:iCs w:val="0"/>
-          <w:caps w:val="0"/>
-          <w:smallCaps w:val="0"/>
-          <w:noProof w:val="0"/>
+        <w:rPr>
+          <w:rFonts w:ascii="Times New Roman" w:hAnsi="Times New Roman" w:eastAsia="Times New Roman" w:cs="Times New Roman"/>
           <w:color w:val="auto"/>
-          <w:sz w:val="22"/>
-          <w:szCs w:val="22"/>
-          <w:lang w:val="pt-BR"/>
         </w:rPr>
       </w:pPr>
       <w:r>
         <w:rPr>
           <w:rFonts w:ascii="Times New Roman" w:hAnsi="Times New Roman" w:eastAsia="Times New Roman" w:cs="Times New Roman"/>
-          <w:b w:val="0"/>
-          <w:bCs w:val="0"/>
-          <w:i w:val="0"/>
-          <w:iCs w:val="0"/>
-          <w:caps w:val="0"/>
-          <w:smallCaps w:val="0"/>
-          <w:noProof w:val="0"/>
           <w:color w:val="auto"/>
-          <w:sz w:val="22"/>
-          <w:szCs w:val="22"/>
-          <w:lang w:val="pt-BR"/>
         </w:rPr>
         <w:t>Para versões futuras, o projeto prevê as seguintes evoluções, organizadas por prioridade:</w:t>
       </w:r>
     </w:p>
     <w:p>
       <w:pPr>
-        <w:pStyle w:val="Normal"/>
-        <w:suppressLineNumbers w:val="0"/>
-        <w:bidi w:val="0"/>
-        <w:spacing w:before="0" w:beforeAutospacing="off" w:after="0" w:afterAutospacing="off" w:line="300" w:lineRule="auto"/>
-        <w:ind w:left="0" w:right="0" w:firstLine="0"/>
-        <w:jc w:val="left"/>
-        <w:rPr>
-          <w:rFonts w:ascii="Times New Roman" w:hAnsi="Times New Roman" w:eastAsia="Times New Roman" w:cs="Times New Roman"/>
-          <w:b w:val="1"/>
-          <w:bCs w:val="1"/>
-          <w:i w:val="0"/>
-          <w:iCs w:val="0"/>
-          <w:caps w:val="0"/>
-          <w:smallCaps w:val="0"/>
-          <w:noProof w:val="0"/>
+        <w:rPr>
+          <w:rFonts w:ascii="Times New Roman" w:hAnsi="Times New Roman" w:eastAsia="Times New Roman" w:cs="Times New Roman"/>
+          <w:b/>
+          <w:bCs/>
           <w:color w:val="auto"/>
-          <w:sz w:val="22"/>
-          <w:szCs w:val="22"/>
-          <w:lang w:val="pt-BR"/>
         </w:rPr>
       </w:pPr>
       <w:r>
         <w:rPr>
           <w:rFonts w:ascii="Times New Roman" w:hAnsi="Times New Roman" w:eastAsia="Times New Roman" w:cs="Times New Roman"/>
-          <w:b w:val="1"/>
-          <w:bCs w:val="1"/>
-          <w:i w:val="0"/>
-          <w:iCs w:val="0"/>
-          <w:caps w:val="0"/>
-          <w:smallCaps w:val="0"/>
-          <w:noProof w:val="0"/>
+          <w:b/>
+          <w:bCs/>
           <w:color w:val="auto"/>
-          <w:sz w:val="22"/>
-          <w:szCs w:val="22"/>
-          <w:lang w:val="pt-BR"/>
         </w:rPr>
         <w:t>Curto Prazo</w:t>
       </w:r>
     </w:p>
     <w:p>
       <w:pPr>
-        <w:pStyle w:val="ListParagraph"/>
+        <w:pStyle w:val="PargrafodaLista"/>
         <w:numPr>
           <w:ilvl w:val="0"/>
-          <w:numId w:val="4"/>
+          <w:numId w:val="3"/>
         </w:numPr>
-        <w:suppressLineNumbers w:val="0"/>
-        <w:bidi w:val="0"/>
-        <w:spacing w:before="0" w:beforeAutospacing="off" w:after="0" w:afterAutospacing="off" w:line="300" w:lineRule="auto"/>
-        <w:ind w:right="0"/>
-        <w:jc w:val="left"/>
-        <w:rPr>
-          <w:rFonts w:ascii="Times New Roman" w:hAnsi="Times New Roman" w:eastAsia="Times New Roman" w:cs="Times New Roman"/>
-          <w:b w:val="0"/>
-          <w:bCs w:val="0"/>
-          <w:i w:val="0"/>
-          <w:iCs w:val="0"/>
-          <w:caps w:val="0"/>
-          <w:smallCaps w:val="0"/>
-          <w:noProof w:val="0"/>
+        <w:rPr>
+          <w:rFonts w:ascii="Times New Roman" w:hAnsi="Times New Roman" w:eastAsia="Times New Roman" w:cs="Times New Roman"/>
           <w:color w:val="auto"/>
-          <w:sz w:val="22"/>
-          <w:szCs w:val="22"/>
-          <w:lang w:val="pt-BR"/>
         </w:rPr>
       </w:pPr>
       <w:r>
         <w:rPr>
           <w:rFonts w:ascii="Times New Roman" w:hAnsi="Times New Roman" w:eastAsia="Times New Roman" w:cs="Times New Roman"/>
-          <w:b w:val="1"/>
-          <w:bCs w:val="1"/>
-          <w:i w:val="0"/>
-          <w:iCs w:val="0"/>
-          <w:caps w:val="0"/>
-          <w:smallCaps w:val="0"/>
-          <w:noProof w:val="0"/>
+          <w:b/>
+          <w:bCs/>
           <w:color w:val="auto"/>
-          <w:sz w:val="22"/>
-          <w:szCs w:val="22"/>
-          <w:lang w:val="pt-BR"/>
         </w:rPr>
         <w:t>Autenticação completa</w:t>
       </w:r>
       <w:r>
         <w:rPr>
           <w:rFonts w:ascii="Times New Roman" w:hAnsi="Times New Roman" w:eastAsia="Times New Roman" w:cs="Times New Roman"/>
-          <w:b w:val="0"/>
-          <w:bCs w:val="0"/>
-          <w:i w:val="0"/>
-          <w:iCs w:val="0"/>
-          <w:caps w:val="0"/>
-          <w:smallCaps w:val="0"/>
-          <w:noProof w:val="0"/>
           <w:color w:val="auto"/>
-          <w:sz w:val="22"/>
-          <w:szCs w:val="22"/>
-          <w:lang w:val="pt-BR"/>
         </w:rPr>
         <w:t xml:space="preserve"> com login e cadastro de usuários (JWT ou sessão), substituindo o usuario_id fixo.</w:t>
       </w:r>
     </w:p>
     <w:p>
       <w:pPr>
-        <w:pStyle w:val="ListParagraph"/>
+        <w:pStyle w:val="PargrafodaLista"/>
         <w:numPr>
           <w:ilvl w:val="0"/>
-          <w:numId w:val="4"/>
+          <w:numId w:val="3"/>
         </w:numPr>
-        <w:suppressLineNumbers w:val="0"/>
-        <w:bidi w:val="0"/>
-        <w:spacing w:before="0" w:beforeAutospacing="off" w:after="0" w:afterAutospacing="off" w:line="300" w:lineRule="auto"/>
-        <w:ind w:right="0"/>
-        <w:jc w:val="left"/>
-        <w:rPr>
-          <w:rFonts w:ascii="Times New Roman" w:hAnsi="Times New Roman" w:eastAsia="Times New Roman" w:cs="Times New Roman"/>
-          <w:b w:val="0"/>
-          <w:bCs w:val="0"/>
-          <w:i w:val="0"/>
-          <w:iCs w:val="0"/>
-          <w:caps w:val="0"/>
-          <w:smallCaps w:val="0"/>
-          <w:noProof w:val="0"/>
+        <w:rPr>
+          <w:rFonts w:ascii="Times New Roman" w:hAnsi="Times New Roman" w:eastAsia="Times New Roman" w:cs="Times New Roman"/>
           <w:color w:val="auto"/>
-          <w:sz w:val="22"/>
-          <w:szCs w:val="22"/>
-          <w:lang w:val="pt-BR"/>
         </w:rPr>
       </w:pPr>
       <w:r>
@@ -13522,123 +12740,69 @@
           <w:rFonts w:ascii="Times New Roman" w:hAnsi="Times New Roman" w:eastAsia="Times New Roman" w:cs="Times New Roman"/>
           <w:b w:val="1"/>
           <w:bCs w:val="1"/>
-          <w:i w:val="0"/>
-          <w:iCs w:val="0"/>
-          <w:caps w:val="0"/>
-          <w:smallCaps w:val="0"/>
-          <w:noProof w:val="0"/>
           <w:color w:val="auto"/>
-          <w:sz w:val="22"/>
-          <w:szCs w:val="22"/>
-          <w:lang w:val="pt-BR"/>
         </w:rPr>
         <w:t>Hash de senhas</w:t>
       </w:r>
       <w:r>
         <w:rPr>
           <w:rFonts w:ascii="Times New Roman" w:hAnsi="Times New Roman" w:eastAsia="Times New Roman" w:cs="Times New Roman"/>
-          <w:b w:val="0"/>
-          <w:bCs w:val="0"/>
-          <w:i w:val="0"/>
-          <w:iCs w:val="0"/>
-          <w:caps w:val="0"/>
-          <w:smallCaps w:val="0"/>
-          <w:noProof w:val="0"/>
           <w:color w:val="auto"/>
-          <w:sz w:val="22"/>
-          <w:szCs w:val="22"/>
-          <w:lang w:val="pt-BR"/>
         </w:rPr>
         <w:t xml:space="preserve"> com bcrypt no Back-End.</w:t>
       </w:r>
     </w:p>
     <w:p>
       <w:pPr>
-        <w:pStyle w:val="ListParagraph"/>
+        <w:pStyle w:val="PargrafodaLista"/>
         <w:numPr>
           <w:ilvl w:val="0"/>
-          <w:numId w:val="4"/>
+          <w:numId w:val="3"/>
         </w:numPr>
-        <w:suppressLineNumbers w:val="0"/>
-        <w:bidi w:val="0"/>
-        <w:spacing w:before="0" w:beforeAutospacing="off" w:after="0" w:afterAutospacing="off" w:line="300" w:lineRule="auto"/>
-        <w:ind w:right="0"/>
-        <w:jc w:val="left"/>
-        <w:rPr>
-          <w:rFonts w:ascii="Times New Roman" w:hAnsi="Times New Roman" w:eastAsia="Times New Roman" w:cs="Times New Roman"/>
-          <w:b w:val="0"/>
-          <w:bCs w:val="0"/>
-          <w:i w:val="0"/>
-          <w:iCs w:val="0"/>
-          <w:caps w:val="0"/>
-          <w:smallCaps w:val="0"/>
-          <w:noProof w:val="0"/>
+        <w:rPr>
+          <w:rFonts w:ascii="Times New Roman" w:hAnsi="Times New Roman" w:eastAsia="Times New Roman" w:cs="Times New Roman"/>
           <w:color w:val="auto"/>
-          <w:sz w:val="22"/>
-          <w:szCs w:val="22"/>
-          <w:lang w:val="pt-BR"/>
         </w:rPr>
       </w:pPr>
+      <w:r>
+        <w:rPr>
+          <w:rFonts w:ascii="Times New Roman" w:hAnsi="Times New Roman" w:eastAsia="Times New Roman" w:cs="Times New Roman"/>
+          <w:b/>
+          <w:bCs/>
+          <w:color w:val="auto"/>
+        </w:rPr>
+        <w:t xml:space="preserve">Rota global </w:t>
+      </w:r>
+      <w:r>
+        <w:rPr>
+          <w:rFonts w:ascii="Times New Roman" w:hAnsi="Times New Roman" w:eastAsia="Times New Roman" w:cs="Times New Roman"/>
+          <w:color w:val="auto"/>
+        </w:rPr>
+        <w:t>/progresso para consolidar o progresso sem múltiplas requisições.</w:t>
+      </w:r>
+    </w:p>
+    <w:p>
+      <w:pPr/>
       <w:r>
         <w:rPr>
           <w:rFonts w:ascii="Times New Roman" w:hAnsi="Times New Roman" w:eastAsia="Times New Roman" w:cs="Times New Roman"/>
           <w:b w:val="1"/>
           <w:bCs w:val="1"/>
-          <w:i w:val="0"/>
-          <w:iCs w:val="0"/>
-          <w:caps w:val="0"/>
-          <w:smallCaps w:val="0"/>
-          <w:noProof w:val="0"/>
           <w:color w:val="auto"/>
-          <w:sz w:val="22"/>
-          <w:szCs w:val="22"/>
-          <w:lang w:val="pt-BR"/>
-        </w:rPr>
-        <w:t>Tela de perfil</w:t>
-      </w:r>
-      <w:r>
-        <w:rPr>
-          <w:rFonts w:ascii="Times New Roman" w:hAnsi="Times New Roman" w:eastAsia="Times New Roman" w:cs="Times New Roman"/>
-          <w:b w:val="0"/>
-          <w:bCs w:val="0"/>
-          <w:i w:val="0"/>
-          <w:iCs w:val="0"/>
-          <w:caps w:val="0"/>
-          <w:smallCaps w:val="0"/>
-          <w:noProof w:val="0"/>
-          <w:color w:val="auto"/>
-          <w:sz w:val="22"/>
-          <w:szCs w:val="22"/>
-          <w:lang w:val="pt-BR"/>
-        </w:rPr>
-        <w:t xml:space="preserve"> com estatísticas individuais do usuário.</w:t>
+        </w:rPr>
+        <w:t>Médio Prazo</w:t>
       </w:r>
     </w:p>
     <w:p>
       <w:pPr>
-        <w:pStyle w:val="ListParagraph"/>
+        <w:pStyle w:val="PargrafodaLista"/>
         <w:numPr>
           <w:ilvl w:val="0"/>
-          <w:numId w:val="4"/>
+          <w:numId w:val="2"/>
         </w:numPr>
-        <w:suppressLineNumbers w:val="0"/>
-        <w:bidi w:val="0"/>
-        <w:spacing w:before="0" w:beforeAutospacing="off" w:after="0" w:afterAutospacing="off" w:line="300" w:lineRule="auto"/>
-        <w:ind w:right="0"/>
-        <w:jc w:val="left"/>
-        <w:rPr>
-          <w:rFonts w:ascii="Times New Roman" w:hAnsi="Times New Roman" w:eastAsia="Times New Roman" w:cs="Times New Roman"/>
-          <w:b w:val="0"/>
-          <w:bCs w:val="0"/>
-          <w:i w:val="0"/>
-          <w:iCs w:val="0"/>
-          <w:caps w:val="0"/>
-          <w:smallCaps w:val="0"/>
-          <w:noProof w:val="0"/>
+        <w:rPr>
+          <w:rFonts w:ascii="Times New Roman" w:hAnsi="Times New Roman" w:eastAsia="Times New Roman" w:cs="Times New Roman"/>
           <w:color w:val="auto"/>
-          <w:sz w:val="22"/>
-          <w:szCs w:val="22"/>
-          <w:lang w:val="pt-BR"/>
         </w:rPr>
       </w:pPr>
       <w:r>
@@ -13646,102 +12810,57 @@
           <w:rFonts w:ascii="Times New Roman" w:hAnsi="Times New Roman" w:eastAsia="Times New Roman" w:cs="Times New Roman"/>
           <w:b w:val="1"/>
           <w:bCs w:val="1"/>
-          <w:i w:val="0"/>
-          <w:iCs w:val="0"/>
-          <w:caps w:val="0"/>
-          <w:smallCaps w:val="0"/>
-          <w:noProof w:val="0"/>
           <w:color w:val="auto"/>
-          <w:sz w:val="22"/>
-          <w:szCs w:val="22"/>
-          <w:lang w:val="pt-BR"/>
-        </w:rPr>
-        <w:t xml:space="preserve">Rota global </w:t>
-      </w:r>
-      <w:r>
-        <w:rPr>
-          <w:rFonts w:ascii="Times New Roman" w:hAnsi="Times New Roman" w:eastAsia="Times New Roman" w:cs="Times New Roman"/>
-          <w:b w:val="0"/>
-          <w:bCs w:val="0"/>
-          <w:i w:val="0"/>
-          <w:iCs w:val="0"/>
-          <w:caps w:val="0"/>
-          <w:smallCaps w:val="0"/>
-          <w:noProof w:val="0"/>
+        </w:rPr>
+        <w:t>Tela de perfil</w:t>
+      </w:r>
+      <w:r>
+        <w:rPr>
+          <w:rFonts w:ascii="Times New Roman" w:hAnsi="Times New Roman" w:eastAsia="Times New Roman" w:cs="Times New Roman"/>
           <w:color w:val="auto"/>
-          <w:sz w:val="22"/>
-          <w:szCs w:val="22"/>
-          <w:lang w:val="pt-BR"/>
-        </w:rPr>
-        <w:t>/progresso para consolidar o progresso sem múltiplas requisições.</w:t>
+        </w:rPr>
+        <w:t xml:space="preserve"> com estatísticas individuais do usuário.</w:t>
       </w:r>
     </w:p>
     <w:p>
       <w:pPr>
-        <w:pStyle w:val="Normal"/>
-        <w:suppressLineNumbers w:val="0"/>
-        <w:bidi w:val="0"/>
-        <w:spacing w:before="0" w:beforeAutospacing="off" w:after="0" w:afterAutospacing="off" w:line="300" w:lineRule="auto"/>
-        <w:ind w:left="0" w:right="0" w:firstLine="0"/>
-        <w:jc w:val="left"/>
+        <w:pStyle w:val="PargrafodaLista"/>
+        <w:numPr>
+          <w:ilvl w:val="0"/>
+          <w:numId w:val="2"/>
+        </w:numPr>
+        <w:rPr>
+          <w:rFonts w:ascii="Times New Roman" w:hAnsi="Times New Roman" w:eastAsia="Times New Roman" w:cs="Times New Roman"/>
+          <w:color w:val="auto"/>
+        </w:rPr>
+      </w:pPr>
+      <w:r>
         <w:rPr>
           <w:rFonts w:ascii="Times New Roman" w:hAnsi="Times New Roman" w:eastAsia="Times New Roman" w:cs="Times New Roman"/>
           <w:b w:val="1"/>
           <w:bCs w:val="1"/>
-          <w:i w:val="0"/>
-          <w:iCs w:val="0"/>
-          <w:caps w:val="0"/>
-          <w:smallCaps w:val="0"/>
-          <w:noProof w:val="0"/>
           <w:color w:val="auto"/>
-          <w:sz w:val="22"/>
-          <w:szCs w:val="22"/>
-          <w:lang w:val="pt-BR"/>
-        </w:rPr>
-      </w:pPr>
-      <w:r>
-        <w:rPr>
-          <w:rFonts w:ascii="Times New Roman" w:hAnsi="Times New Roman" w:eastAsia="Times New Roman" w:cs="Times New Roman"/>
-          <w:b w:val="1"/>
-          <w:bCs w:val="1"/>
-          <w:i w:val="0"/>
-          <w:iCs w:val="0"/>
-          <w:caps w:val="0"/>
-          <w:smallCaps w:val="0"/>
-          <w:noProof w:val="0"/>
+        </w:rPr>
+        <w:t>Notificações</w:t>
+      </w:r>
+      <w:r>
+        <w:rPr>
+          <w:rFonts w:ascii="Times New Roman" w:hAnsi="Times New Roman" w:eastAsia="Times New Roman" w:cs="Times New Roman"/>
           <w:color w:val="auto"/>
-          <w:sz w:val="22"/>
-          <w:szCs w:val="22"/>
-          <w:lang w:val="pt-BR"/>
-        </w:rPr>
-        <w:t>Médio Prazo</w:t>
+        </w:rPr>
+        <w:t xml:space="preserve"> de revisão pendente e lembretes de estudo.</w:t>
       </w:r>
     </w:p>
     <w:p>
       <w:pPr>
-        <w:pStyle w:val="ListParagraph"/>
+        <w:pStyle w:val="PargrafodaLista"/>
         <w:numPr>
           <w:ilvl w:val="0"/>
-          <w:numId w:val="5"/>
+          <w:numId w:val="2"/>
         </w:numPr>
-        <w:suppressLineNumbers w:val="0"/>
-        <w:bidi w:val="0"/>
-        <w:spacing w:before="0" w:beforeAutospacing="off" w:after="0" w:afterAutospacing="off" w:line="300" w:lineRule="auto"/>
-        <w:ind w:right="0"/>
-        <w:jc w:val="left"/>
-        <w:rPr>
-          <w:rFonts w:ascii="Times New Roman" w:hAnsi="Times New Roman" w:eastAsia="Times New Roman" w:cs="Times New Roman"/>
-          <w:b w:val="0"/>
-          <w:bCs w:val="0"/>
-          <w:i w:val="0"/>
-          <w:iCs w:val="0"/>
-          <w:caps w:val="0"/>
-          <w:smallCaps w:val="0"/>
-          <w:noProof w:val="0"/>
+        <w:rPr>
+          <w:rFonts w:ascii="Times New Roman" w:hAnsi="Times New Roman" w:eastAsia="Times New Roman" w:cs="Times New Roman"/>
           <w:color w:val="auto"/>
-          <w:sz w:val="22"/>
-          <w:szCs w:val="22"/>
-          <w:lang w:val="pt-BR"/>
         </w:rPr>
       </w:pPr>
       <w:r>
@@ -13749,61 +12868,40 @@
           <w:rFonts w:ascii="Times New Roman" w:hAnsi="Times New Roman" w:eastAsia="Times New Roman" w:cs="Times New Roman"/>
           <w:b w:val="1"/>
           <w:bCs w:val="1"/>
-          <w:i w:val="0"/>
-          <w:iCs w:val="0"/>
-          <w:caps w:val="0"/>
-          <w:smallCaps w:val="0"/>
-          <w:noProof w:val="0"/>
           <w:color w:val="auto"/>
-          <w:sz w:val="22"/>
-          <w:szCs w:val="22"/>
-          <w:lang w:val="pt-BR"/>
         </w:rPr>
         <w:t>Gamificação completa:</w:t>
       </w:r>
       <w:r>
         <w:rPr>
           <w:rFonts w:ascii="Times New Roman" w:hAnsi="Times New Roman" w:eastAsia="Times New Roman" w:cs="Times New Roman"/>
-          <w:b w:val="0"/>
-          <w:bCs w:val="0"/>
-          <w:i w:val="0"/>
-          <w:iCs w:val="0"/>
-          <w:caps w:val="0"/>
-          <w:smallCaps w:val="0"/>
-          <w:noProof w:val="0"/>
           <w:color w:val="auto"/>
-          <w:sz w:val="22"/>
-          <w:szCs w:val="22"/>
-          <w:lang w:val="pt-BR"/>
         </w:rPr>
         <w:t xml:space="preserve"> XP, níveis, conquistas e ranking entre usuários.</w:t>
+      </w:r>
+    </w:p>
+    <w:p>
+      <w:pPr/>
+      <w:r>
+        <w:rPr>
+          <w:rFonts w:ascii="Times New Roman" w:hAnsi="Times New Roman" w:eastAsia="Times New Roman" w:cs="Times New Roman"/>
+          <w:b w:val="1"/>
+          <w:bCs w:val="1"/>
+          <w:color w:val="auto"/>
+        </w:rPr>
+        <w:t>Longo Prazo</w:t>
       </w:r>
     </w:p>
     <w:p>
       <w:pPr>
-        <w:pStyle w:val="ListParagraph"/>
+        <w:pStyle w:val="PargrafodaLista"/>
         <w:numPr>
           <w:ilvl w:val="0"/>
-          <w:numId w:val="5"/>
+          <w:numId w:val="2"/>
         </w:numPr>
-        <w:suppressLineNumbers w:val="0"/>
-        <w:bidi w:val="0"/>
-        <w:spacing w:before="0" w:beforeAutospacing="off" w:after="0" w:afterAutospacing="off" w:line="300" w:lineRule="auto"/>
-        <w:ind w:right="0"/>
-        <w:jc w:val="left"/>
-        <w:rPr>
-          <w:rFonts w:ascii="Times New Roman" w:hAnsi="Times New Roman" w:eastAsia="Times New Roman" w:cs="Times New Roman"/>
-          <w:b w:val="0"/>
-          <w:bCs w:val="0"/>
-          <w:i w:val="0"/>
-          <w:iCs w:val="0"/>
-          <w:caps w:val="0"/>
-          <w:smallCaps w:val="0"/>
-          <w:noProof w:val="0"/>
+        <w:rPr>
+          <w:rFonts w:ascii="Times New Roman" w:hAnsi="Times New Roman" w:eastAsia="Times New Roman" w:cs="Times New Roman"/>
           <w:color w:val="auto"/>
-          <w:sz w:val="22"/>
-          <w:szCs w:val="22"/>
-          <w:lang w:val="pt-BR"/>
         </w:rPr>
       </w:pPr>
       <w:r>
@@ -13811,61 +12909,28 @@
           <w:rFonts w:ascii="Times New Roman" w:hAnsi="Times New Roman" w:eastAsia="Times New Roman" w:cs="Times New Roman"/>
           <w:b w:val="1"/>
           <w:bCs w:val="1"/>
-          <w:i w:val="0"/>
-          <w:iCs w:val="0"/>
-          <w:caps w:val="0"/>
-          <w:smallCaps w:val="0"/>
-          <w:noProof w:val="0"/>
           <w:color w:val="auto"/>
-          <w:sz w:val="22"/>
-          <w:szCs w:val="22"/>
-          <w:lang w:val="pt-BR"/>
         </w:rPr>
         <w:t>Repetição espaçada com algoritmo SM-2</w:t>
       </w:r>
       <w:r>
         <w:rPr>
           <w:rFonts w:ascii="Times New Roman" w:hAnsi="Times New Roman" w:eastAsia="Times New Roman" w:cs="Times New Roman"/>
-          <w:b w:val="0"/>
-          <w:bCs w:val="0"/>
-          <w:i w:val="0"/>
-          <w:iCs w:val="0"/>
-          <w:caps w:val="0"/>
-          <w:smallCaps w:val="0"/>
-          <w:noProof w:val="0"/>
           <w:color w:val="auto"/>
-          <w:sz w:val="22"/>
-          <w:szCs w:val="22"/>
-          <w:lang w:val="pt-BR"/>
         </w:rPr>
         <w:t xml:space="preserve"> (SuperMemo 2) para maior eficiência no aprendizado.</w:t>
       </w:r>
     </w:p>
     <w:p>
       <w:pPr>
-        <w:pStyle w:val="ListParagraph"/>
+        <w:pStyle w:val="PargrafodaLista"/>
         <w:numPr>
           <w:ilvl w:val="0"/>
-          <w:numId w:val="5"/>
+          <w:numId w:val="2"/>
         </w:numPr>
-        <w:suppressLineNumbers w:val="0"/>
-        <w:bidi w:val="0"/>
-        <w:spacing w:before="0" w:beforeAutospacing="off" w:after="0" w:afterAutospacing="off" w:line="300" w:lineRule="auto"/>
-        <w:ind w:right="0"/>
-        <w:jc w:val="left"/>
-        <w:rPr>
-          <w:rFonts w:ascii="Times New Roman" w:hAnsi="Times New Roman" w:eastAsia="Times New Roman" w:cs="Times New Roman"/>
-          <w:b w:val="0"/>
-          <w:bCs w:val="0"/>
-          <w:i w:val="0"/>
-          <w:iCs w:val="0"/>
-          <w:caps w:val="0"/>
-          <w:smallCaps w:val="0"/>
-          <w:noProof w:val="0"/>
+        <w:rPr>
+          <w:rFonts w:ascii="Times New Roman" w:hAnsi="Times New Roman" w:eastAsia="Times New Roman" w:cs="Times New Roman"/>
           <w:color w:val="auto"/>
-          <w:sz w:val="22"/>
-          <w:szCs w:val="22"/>
-          <w:lang w:val="pt-BR"/>
         </w:rPr>
       </w:pPr>
       <w:r>
@@ -13873,61 +12938,28 @@
           <w:rFonts w:ascii="Times New Roman" w:hAnsi="Times New Roman" w:eastAsia="Times New Roman" w:cs="Times New Roman"/>
           <w:b w:val="1"/>
           <w:bCs w:val="1"/>
-          <w:i w:val="0"/>
-          <w:iCs w:val="0"/>
-          <w:caps w:val="0"/>
-          <w:smallCaps w:val="0"/>
-          <w:noProof w:val="0"/>
           <w:color w:val="auto"/>
-          <w:sz w:val="22"/>
-          <w:szCs w:val="22"/>
-          <w:lang w:val="pt-BR"/>
         </w:rPr>
         <w:t>Modo offline</w:t>
       </w:r>
       <w:r>
         <w:rPr>
           <w:rFonts w:ascii="Times New Roman" w:hAnsi="Times New Roman" w:eastAsia="Times New Roman" w:cs="Times New Roman"/>
-          <w:b w:val="0"/>
-          <w:bCs w:val="0"/>
-          <w:i w:val="0"/>
-          <w:iCs w:val="0"/>
-          <w:caps w:val="0"/>
-          <w:smallCaps w:val="0"/>
-          <w:noProof w:val="0"/>
           <w:color w:val="auto"/>
-          <w:sz w:val="22"/>
-          <w:szCs w:val="22"/>
-          <w:lang w:val="pt-BR"/>
         </w:rPr>
         <w:t xml:space="preserve"> com Service Workers (PWA), permitindo estudar sem conexão.</w:t>
       </w:r>
     </w:p>
     <w:p>
       <w:pPr>
-        <w:pStyle w:val="ListParagraph"/>
+        <w:pStyle w:val="PargrafodaLista"/>
         <w:numPr>
           <w:ilvl w:val="0"/>
-          <w:numId w:val="5"/>
+          <w:numId w:val="1"/>
         </w:numPr>
-        <w:suppressLineNumbers w:val="0"/>
-        <w:bidi w:val="0"/>
-        <w:spacing w:before="0" w:beforeAutospacing="off" w:after="0" w:afterAutospacing="off" w:line="300" w:lineRule="auto"/>
-        <w:ind w:right="0"/>
-        <w:jc w:val="left"/>
-        <w:rPr>
-          <w:rFonts w:ascii="Times New Roman" w:hAnsi="Times New Roman" w:eastAsia="Times New Roman" w:cs="Times New Roman"/>
-          <w:b w:val="0"/>
-          <w:bCs w:val="0"/>
-          <w:i w:val="0"/>
-          <w:iCs w:val="0"/>
-          <w:caps w:val="0"/>
-          <w:smallCaps w:val="0"/>
-          <w:noProof w:val="0"/>
+        <w:rPr>
+          <w:rFonts w:ascii="Times New Roman" w:hAnsi="Times New Roman" w:eastAsia="Times New Roman" w:cs="Times New Roman"/>
           <w:color w:val="auto"/>
-          <w:sz w:val="22"/>
-          <w:szCs w:val="22"/>
-          <w:lang w:val="pt-BR"/>
         </w:rPr>
       </w:pPr>
       <w:r>
@@ -13935,504 +12967,62 @@
           <w:rFonts w:ascii="Times New Roman" w:hAnsi="Times New Roman" w:eastAsia="Times New Roman" w:cs="Times New Roman"/>
           <w:b w:val="1"/>
           <w:bCs w:val="1"/>
-          <w:i w:val="0"/>
-          <w:iCs w:val="0"/>
-          <w:caps w:val="0"/>
-          <w:smallCaps w:val="0"/>
-          <w:noProof w:val="0"/>
           <w:color w:val="auto"/>
-          <w:sz w:val="22"/>
-          <w:szCs w:val="22"/>
-          <w:lang w:val="pt-BR"/>
-        </w:rPr>
-        <w:t>Notificações</w:t>
-      </w:r>
-      <w:r>
-        <w:rPr>
-          <w:rFonts w:ascii="Times New Roman" w:hAnsi="Times New Roman" w:eastAsia="Times New Roman" w:cs="Times New Roman"/>
-          <w:b w:val="0"/>
-          <w:bCs w:val="0"/>
-          <w:i w:val="0"/>
-          <w:iCs w:val="0"/>
-          <w:caps w:val="0"/>
-          <w:smallCaps w:val="0"/>
-          <w:noProof w:val="0"/>
+        </w:rPr>
+        <w:t>Importação de flashcards</w:t>
+      </w:r>
+      <w:r>
+        <w:rPr>
+          <w:rFonts w:ascii="Times New Roman" w:hAnsi="Times New Roman" w:eastAsia="Times New Roman" w:cs="Times New Roman"/>
           <w:color w:val="auto"/>
-          <w:sz w:val="22"/>
-          <w:szCs w:val="22"/>
-          <w:lang w:val="pt-BR"/>
-        </w:rPr>
-        <w:t xml:space="preserve"> de revisão pendente e lembretes de estudo.</w:t>
+        </w:rPr>
+        <w:t xml:space="preserve"> via CSV/Excel.</w:t>
       </w:r>
     </w:p>
     <w:p>
       <w:pPr>
-        <w:pStyle w:val="Normal"/>
-        <w:suppressLineNumbers w:val="0"/>
-        <w:bidi w:val="0"/>
-        <w:spacing w:before="0" w:beforeAutospacing="off" w:after="0" w:afterAutospacing="off" w:line="300" w:lineRule="auto"/>
-        <w:ind w:left="0" w:right="0" w:firstLine="0"/>
-        <w:jc w:val="left"/>
-        <w:rPr>
-          <w:rFonts w:ascii="Times New Roman" w:hAnsi="Times New Roman" w:eastAsia="Times New Roman" w:cs="Times New Roman"/>
-          <w:b w:val="1"/>
-          <w:bCs w:val="1"/>
-          <w:i w:val="0"/>
-          <w:iCs w:val="0"/>
-          <w:caps w:val="0"/>
-          <w:smallCaps w:val="0"/>
-          <w:noProof w:val="0"/>
+        <w:rPr>
+          <w:rFonts w:ascii="Times New Roman" w:hAnsi="Times New Roman" w:eastAsia="Times New Roman" w:cs="Times New Roman"/>
+          <w:b/>
+          <w:bCs/>
           <w:color w:val="auto"/>
-          <w:sz w:val="22"/>
-          <w:szCs w:val="22"/>
-          <w:lang w:val="pt-BR"/>
         </w:rPr>
       </w:pPr>
       <w:r>
         <w:rPr>
           <w:rFonts w:ascii="Times New Roman" w:hAnsi="Times New Roman" w:eastAsia="Times New Roman" w:cs="Times New Roman"/>
-          <w:b w:val="1"/>
-          <w:bCs w:val="1"/>
-          <w:i w:val="0"/>
-          <w:iCs w:val="0"/>
-          <w:caps w:val="0"/>
-          <w:smallCaps w:val="0"/>
-          <w:noProof w:val="0"/>
+          <w:b/>
+          <w:bCs/>
           <w:color w:val="auto"/>
-          <w:sz w:val="22"/>
-          <w:szCs w:val="22"/>
-          <w:lang w:val="pt-BR"/>
-        </w:rPr>
-        <w:t>Longo Prazo</w:t>
+        </w:rPr>
+        <w:t>3.4. Considerações Finais</w:t>
       </w:r>
     </w:p>
     <w:p>
       <w:pPr>
-        <w:pStyle w:val="ListParagraph"/>
-        <w:numPr>
-          <w:ilvl w:val="0"/>
-          <w:numId w:val="6"/>
-        </w:numPr>
-        <w:suppressLineNumbers w:val="0"/>
-        <w:bidi w:val="0"/>
-        <w:spacing w:before="0" w:beforeAutospacing="off" w:after="0" w:afterAutospacing="off" w:line="300" w:lineRule="auto"/>
-        <w:ind w:right="0"/>
-        <w:jc w:val="left"/>
-        <w:rPr>
-          <w:rFonts w:ascii="Times New Roman" w:hAnsi="Times New Roman" w:eastAsia="Times New Roman" w:cs="Times New Roman"/>
-          <w:b w:val="0"/>
-          <w:bCs w:val="0"/>
-          <w:i w:val="0"/>
-          <w:iCs w:val="0"/>
-          <w:caps w:val="0"/>
-          <w:smallCaps w:val="0"/>
-          <w:noProof w:val="0"/>
+        <w:rPr>
+          <w:rFonts w:ascii="Times New Roman" w:hAnsi="Times New Roman" w:eastAsia="Times New Roman" w:cs="Times New Roman"/>
           <w:color w:val="auto"/>
-          <w:sz w:val="22"/>
-          <w:szCs w:val="22"/>
-          <w:lang w:val="pt-BR"/>
         </w:rPr>
       </w:pPr>
       <w:r>
         <w:rPr>
           <w:rFonts w:ascii="Times New Roman" w:hAnsi="Times New Roman" w:eastAsia="Times New Roman" w:cs="Times New Roman"/>
-          <w:b w:val="1"/>
-          <w:bCs w:val="1"/>
-          <w:i w:val="0"/>
-          <w:iCs w:val="0"/>
-          <w:caps w:val="0"/>
-          <w:smallCaps w:val="0"/>
-          <w:noProof w:val="0"/>
           <w:color w:val="auto"/>
-          <w:sz w:val="22"/>
-          <w:szCs w:val="22"/>
-          <w:lang w:val="pt-BR"/>
-        </w:rPr>
-        <w:t>Painel administrativo</w:t>
-      </w:r>
-      <w:r>
-        <w:rPr>
-          <w:rFonts w:ascii="Times New Roman" w:hAnsi="Times New Roman" w:eastAsia="Times New Roman" w:cs="Times New Roman"/>
-          <w:b w:val="0"/>
-          <w:bCs w:val="0"/>
-          <w:i w:val="0"/>
-          <w:iCs w:val="0"/>
-          <w:caps w:val="0"/>
-          <w:smallCaps w:val="0"/>
-          <w:noProof w:val="0"/>
-          <w:color w:val="auto"/>
-          <w:sz w:val="22"/>
-          <w:szCs w:val="22"/>
-          <w:lang w:val="pt-BR"/>
-        </w:rPr>
-        <w:t xml:space="preserve"> para professores cadastrarem e gerenciarem flashcards.</w:t>
+        </w:rPr>
+        <w:t>O DStudy demonstrou ser viável técnica e pedagogicamente. A integração entre as camadas foi concluída com sucesso, e a aplicação atende aos requisitos funcionais essenciais definidos no início do projeto. As dificuldades encontradas serviram para consolidar o aprendizado em tópicos como CORS, ORM, assincronismo, controle de estado e design de interfaces gamificadas.</w:t>
       </w:r>
     </w:p>
     <w:p>
       <w:pPr>
-        <w:pStyle w:val="ListParagraph"/>
-        <w:numPr>
-          <w:ilvl w:val="0"/>
-          <w:numId w:val="6"/>
-        </w:numPr>
-        <w:suppressLineNumbers w:val="0"/>
-        <w:bidi w:val="0"/>
-        <w:spacing w:before="0" w:beforeAutospacing="off" w:after="0" w:afterAutospacing="off" w:line="300" w:lineRule="auto"/>
-        <w:ind w:right="0"/>
-        <w:jc w:val="left"/>
-        <w:rPr>
-          <w:rFonts w:ascii="Times New Roman" w:hAnsi="Times New Roman" w:eastAsia="Times New Roman" w:cs="Times New Roman"/>
-          <w:b w:val="0"/>
-          <w:bCs w:val="0"/>
-          <w:i w:val="0"/>
-          <w:iCs w:val="0"/>
-          <w:caps w:val="0"/>
-          <w:smallCaps w:val="0"/>
-          <w:noProof w:val="0"/>
+        <w:rPr>
           <w:color w:val="auto"/>
-          <w:sz w:val="22"/>
-          <w:szCs w:val="22"/>
-          <w:lang w:val="pt-BR"/>
         </w:rPr>
       </w:pPr>
       <w:r>
         <w:rPr>
           <w:rFonts w:ascii="Times New Roman" w:hAnsi="Times New Roman" w:eastAsia="Times New Roman" w:cs="Times New Roman"/>
-          <w:b w:val="1"/>
-          <w:bCs w:val="1"/>
-          <w:i w:val="0"/>
-          <w:iCs w:val="0"/>
-          <w:caps w:val="0"/>
-          <w:smallCaps w:val="0"/>
-          <w:noProof w:val="0"/>
           <w:color w:val="auto"/>
-          <w:sz w:val="22"/>
-          <w:szCs w:val="22"/>
-          <w:lang w:val="pt-BR"/>
-        </w:rPr>
-        <w:t>Importação de flashcards</w:t>
-      </w:r>
-      <w:r>
-        <w:rPr>
-          <w:rFonts w:ascii="Times New Roman" w:hAnsi="Times New Roman" w:eastAsia="Times New Roman" w:cs="Times New Roman"/>
-          <w:b w:val="0"/>
-          <w:bCs w:val="0"/>
-          <w:i w:val="0"/>
-          <w:iCs w:val="0"/>
-          <w:caps w:val="0"/>
-          <w:smallCaps w:val="0"/>
-          <w:noProof w:val="0"/>
-          <w:color w:val="auto"/>
-          <w:sz w:val="22"/>
-          <w:szCs w:val="22"/>
-          <w:lang w:val="pt-BR"/>
-        </w:rPr>
-        <w:t xml:space="preserve"> via CSV/Excel.</w:t>
-      </w:r>
-    </w:p>
-    <w:p>
-      <w:pPr>
-        <w:pStyle w:val="ListParagraph"/>
-        <w:numPr>
-          <w:ilvl w:val="0"/>
-          <w:numId w:val="6"/>
-        </w:numPr>
-        <w:suppressLineNumbers w:val="0"/>
-        <w:bidi w:val="0"/>
-        <w:spacing w:before="0" w:beforeAutospacing="off" w:after="0" w:afterAutospacing="off" w:line="300" w:lineRule="auto"/>
-        <w:ind w:right="0"/>
-        <w:jc w:val="left"/>
-        <w:rPr>
-          <w:rFonts w:ascii="Times New Roman" w:hAnsi="Times New Roman" w:eastAsia="Times New Roman" w:cs="Times New Roman"/>
-          <w:b w:val="0"/>
-          <w:bCs w:val="0"/>
-          <w:i w:val="0"/>
-          <w:iCs w:val="0"/>
-          <w:caps w:val="0"/>
-          <w:smallCaps w:val="0"/>
-          <w:noProof w:val="0"/>
-          <w:color w:val="auto"/>
-          <w:sz w:val="22"/>
-          <w:szCs w:val="22"/>
-          <w:lang w:val="pt-BR"/>
-        </w:rPr>
-      </w:pPr>
-      <w:r>
-        <w:rPr>
-          <w:rFonts w:ascii="Times New Roman" w:hAnsi="Times New Roman" w:eastAsia="Times New Roman" w:cs="Times New Roman"/>
-          <w:b w:val="1"/>
-          <w:bCs w:val="1"/>
-          <w:i w:val="0"/>
-          <w:iCs w:val="0"/>
-          <w:caps w:val="0"/>
-          <w:smallCaps w:val="0"/>
-          <w:noProof w:val="0"/>
-          <w:color w:val="auto"/>
-          <w:sz w:val="22"/>
-          <w:szCs w:val="22"/>
-          <w:lang w:val="pt-BR"/>
-        </w:rPr>
-        <w:t>Modo multiplayer</w:t>
-      </w:r>
-      <w:r>
-        <w:rPr>
-          <w:rFonts w:ascii="Times New Roman" w:hAnsi="Times New Roman" w:eastAsia="Times New Roman" w:cs="Times New Roman"/>
-          <w:b w:val="0"/>
-          <w:bCs w:val="0"/>
-          <w:i w:val="0"/>
-          <w:iCs w:val="0"/>
-          <w:caps w:val="0"/>
-          <w:smallCaps w:val="0"/>
-          <w:noProof w:val="0"/>
-          <w:color w:val="auto"/>
-          <w:sz w:val="22"/>
-          <w:szCs w:val="22"/>
-          <w:lang w:val="pt-BR"/>
-        </w:rPr>
-        <w:t xml:space="preserve"> com desafios entre alunos.</w:t>
-      </w:r>
-    </w:p>
-    <w:p>
-      <w:pPr>
-        <w:pStyle w:val="ListParagraph"/>
-        <w:numPr>
-          <w:ilvl w:val="0"/>
-          <w:numId w:val="6"/>
-        </w:numPr>
-        <w:suppressLineNumbers w:val="0"/>
-        <w:bidi w:val="0"/>
-        <w:spacing w:before="0" w:beforeAutospacing="off" w:after="0" w:afterAutospacing="off" w:line="300" w:lineRule="auto"/>
-        <w:ind w:right="0"/>
-        <w:jc w:val="left"/>
-        <w:rPr>
-          <w:rFonts w:ascii="Times New Roman" w:hAnsi="Times New Roman" w:eastAsia="Times New Roman" w:cs="Times New Roman"/>
-          <w:b w:val="0"/>
-          <w:bCs w:val="0"/>
-          <w:i w:val="0"/>
-          <w:iCs w:val="0"/>
-          <w:caps w:val="0"/>
-          <w:smallCaps w:val="0"/>
-          <w:noProof w:val="0"/>
-          <w:color w:val="auto"/>
-          <w:sz w:val="22"/>
-          <w:szCs w:val="22"/>
-          <w:lang w:val="en-US"/>
-        </w:rPr>
-      </w:pPr>
-      <w:r>
-        <w:rPr>
-          <w:rFonts w:ascii="Times New Roman" w:hAnsi="Times New Roman" w:eastAsia="Times New Roman" w:cs="Times New Roman"/>
-          <w:b w:val="1"/>
-          <w:bCs w:val="1"/>
-          <w:i w:val="0"/>
-          <w:iCs w:val="0"/>
-          <w:caps w:val="0"/>
-          <w:smallCaps w:val="0"/>
-          <w:noProof w:val="0"/>
-          <w:color w:val="auto"/>
-          <w:sz w:val="22"/>
-          <w:szCs w:val="22"/>
-          <w:lang w:val="en-US"/>
-        </w:rPr>
-        <w:t>Aplicativo mobile nativo</w:t>
-      </w:r>
-      <w:r>
-        <w:rPr>
-          <w:rFonts w:ascii="Times New Roman" w:hAnsi="Times New Roman" w:eastAsia="Times New Roman" w:cs="Times New Roman"/>
-          <w:b w:val="0"/>
-          <w:bCs w:val="0"/>
-          <w:i w:val="0"/>
-          <w:iCs w:val="0"/>
-          <w:caps w:val="0"/>
-          <w:smallCaps w:val="0"/>
-          <w:noProof w:val="0"/>
-          <w:color w:val="auto"/>
-          <w:sz w:val="22"/>
-          <w:szCs w:val="22"/>
-          <w:lang w:val="en-US"/>
-        </w:rPr>
-        <w:t xml:space="preserve"> (React Native ou Flutter).</w:t>
-      </w:r>
-    </w:p>
-    <w:p>
-      <w:pPr>
-        <w:pStyle w:val="ListParagraph"/>
-        <w:numPr>
-          <w:ilvl w:val="0"/>
-          <w:numId w:val="6"/>
-        </w:numPr>
-        <w:suppressLineNumbers w:val="0"/>
-        <w:bidi w:val="0"/>
-        <w:spacing w:before="0" w:beforeAutospacing="off" w:after="0" w:afterAutospacing="off" w:line="300" w:lineRule="auto"/>
-        <w:ind w:right="0"/>
-        <w:jc w:val="left"/>
-        <w:rPr>
-          <w:rFonts w:ascii="Times New Roman" w:hAnsi="Times New Roman" w:eastAsia="Times New Roman" w:cs="Times New Roman"/>
-          <w:b w:val="0"/>
-          <w:bCs w:val="0"/>
-          <w:i w:val="0"/>
-          <w:iCs w:val="0"/>
-          <w:caps w:val="0"/>
-          <w:smallCaps w:val="0"/>
-          <w:noProof w:val="0"/>
-          <w:color w:val="auto"/>
-          <w:sz w:val="22"/>
-          <w:szCs w:val="22"/>
-          <w:lang w:val="pt-BR"/>
-        </w:rPr>
-      </w:pPr>
-      <w:r>
-        <w:rPr>
-          <w:rFonts w:ascii="Times New Roman" w:hAnsi="Times New Roman" w:eastAsia="Times New Roman" w:cs="Times New Roman"/>
-          <w:b w:val="1"/>
-          <w:bCs w:val="1"/>
-          <w:i w:val="0"/>
-          <w:iCs w:val="0"/>
-          <w:caps w:val="0"/>
-          <w:smallCaps w:val="0"/>
-          <w:noProof w:val="0"/>
-          <w:color w:val="auto"/>
-          <w:sz w:val="22"/>
-          <w:szCs w:val="22"/>
-          <w:lang w:val="pt-BR"/>
-        </w:rPr>
-        <w:t>Análise preditiva</w:t>
-      </w:r>
-      <w:r>
-        <w:rPr>
-          <w:rFonts w:ascii="Times New Roman" w:hAnsi="Times New Roman" w:eastAsia="Times New Roman" w:cs="Times New Roman"/>
-          <w:b w:val="0"/>
-          <w:bCs w:val="0"/>
-          <w:i w:val="0"/>
-          <w:iCs w:val="0"/>
-          <w:caps w:val="0"/>
-          <w:smallCaps w:val="0"/>
-          <w:noProof w:val="0"/>
-          <w:color w:val="auto"/>
-          <w:sz w:val="22"/>
-          <w:szCs w:val="22"/>
-          <w:lang w:val="pt-BR"/>
-        </w:rPr>
-        <w:t xml:space="preserve"> de desempenho com IA.</w:t>
-      </w:r>
-    </w:p>
-    <w:p>
-      <w:pPr>
-        <w:pStyle w:val="Normal"/>
-        <w:suppressLineNumbers w:val="0"/>
-        <w:bidi w:val="0"/>
-        <w:spacing w:before="0" w:beforeAutospacing="off" w:after="0" w:afterAutospacing="off" w:line="300" w:lineRule="auto"/>
-        <w:ind w:left="0" w:right="0" w:firstLine="0"/>
-        <w:jc w:val="left"/>
-        <w:rPr>
-          <w:rFonts w:ascii="Times New Roman" w:hAnsi="Times New Roman" w:eastAsia="Times New Roman" w:cs="Times New Roman"/>
-          <w:b w:val="1"/>
-          <w:bCs w:val="1"/>
-          <w:i w:val="0"/>
-          <w:iCs w:val="0"/>
-          <w:caps w:val="0"/>
-          <w:smallCaps w:val="0"/>
-          <w:noProof w:val="0"/>
-          <w:color w:val="auto"/>
-          <w:sz w:val="22"/>
-          <w:szCs w:val="22"/>
-          <w:lang w:val="pt-BR"/>
-        </w:rPr>
-      </w:pPr>
-      <w:r>
-        <w:rPr>
-          <w:rFonts w:ascii="Times New Roman" w:hAnsi="Times New Roman" w:eastAsia="Times New Roman" w:cs="Times New Roman"/>
-          <w:b w:val="1"/>
-          <w:bCs w:val="1"/>
-          <w:i w:val="0"/>
-          <w:iCs w:val="0"/>
-          <w:caps w:val="0"/>
-          <w:smallCaps w:val="0"/>
-          <w:noProof w:val="0"/>
-          <w:color w:val="auto"/>
-          <w:sz w:val="22"/>
-          <w:szCs w:val="22"/>
-          <w:lang w:val="pt-BR"/>
-        </w:rPr>
-        <w:t>3.4. Considerações Finais</w:t>
-      </w:r>
-    </w:p>
-    <w:p>
-      <w:pPr>
-        <w:suppressLineNumbers w:val="0"/>
-        <w:bidi w:val="0"/>
-        <w:spacing w:before="0" w:beforeAutospacing="off" w:after="0" w:afterAutospacing="off" w:line="300" w:lineRule="auto"/>
-        <w:ind w:left="0" w:right="0" w:firstLine="0"/>
-        <w:jc w:val="left"/>
-        <w:rPr>
-          <w:rFonts w:ascii="Times New Roman" w:hAnsi="Times New Roman" w:eastAsia="Times New Roman" w:cs="Times New Roman"/>
-          <w:b w:val="0"/>
-          <w:bCs w:val="0"/>
-          <w:i w:val="0"/>
-          <w:iCs w:val="0"/>
-          <w:caps w:val="0"/>
-          <w:smallCaps w:val="0"/>
-          <w:noProof w:val="0"/>
-          <w:color w:val="auto"/>
-          <w:sz w:val="22"/>
-          <w:szCs w:val="22"/>
-          <w:lang w:val="pt-BR"/>
-        </w:rPr>
-      </w:pPr>
-      <w:r>
-        <w:rPr>
-          <w:rFonts w:ascii="Times New Roman" w:hAnsi="Times New Roman" w:eastAsia="Times New Roman" w:cs="Times New Roman"/>
-          <w:b w:val="0"/>
-          <w:bCs w:val="0"/>
-          <w:i w:val="0"/>
-          <w:iCs w:val="0"/>
-          <w:caps w:val="0"/>
-          <w:smallCaps w:val="0"/>
-          <w:noProof w:val="0"/>
-          <w:color w:val="auto"/>
-          <w:sz w:val="22"/>
-          <w:szCs w:val="22"/>
-          <w:lang w:val="pt-BR"/>
-        </w:rPr>
-        <w:t>O DStudy demonstrou ser viável técnica e pedagogicamente. A integração entre as camadas foi concluída com sucesso, e a aplicação atende aos requisitos funcionais essenciais definidos no início do projeto. As dificuldades encontradas serviram para consolidar o aprendizado em tópicos como CORS, ORM, assincronismo, controle de estado e design de interfaces gamificadas.</w:t>
-      </w:r>
-    </w:p>
-    <w:p>
-      <w:pPr>
-        <w:suppressLineNumbers w:val="0"/>
-        <w:bidi w:val="0"/>
-        <w:spacing w:before="0" w:beforeAutospacing="off" w:after="0" w:afterAutospacing="off" w:line="300" w:lineRule="auto"/>
-        <w:ind w:left="0" w:right="0" w:firstLine="0"/>
-        <w:jc w:val="left"/>
-        <w:rPr>
-          <w:rFonts w:ascii="Roboto" w:hAnsi="Roboto" w:eastAsia="Roboto" w:cs="Roboto"/>
-          <w:b w:val="0"/>
-          <w:bCs w:val="0"/>
-          <w:i w:val="0"/>
-          <w:iCs w:val="0"/>
-          <w:caps w:val="0"/>
-          <w:smallCaps w:val="0"/>
-          <w:noProof w:val="0"/>
-          <w:color w:val="auto"/>
-          <w:sz w:val="22"/>
-          <w:szCs w:val="22"/>
-          <w:lang w:val="pt-BR"/>
-        </w:rPr>
-      </w:pPr>
-      <w:r>
-        <w:rPr>
-          <w:rFonts w:ascii="Times New Roman" w:hAnsi="Times New Roman" w:eastAsia="Times New Roman" w:cs="Times New Roman"/>
-          <w:b w:val="0"/>
-          <w:bCs w:val="0"/>
-          <w:i w:val="0"/>
-          <w:iCs w:val="0"/>
-          <w:caps w:val="0"/>
-          <w:smallCaps w:val="0"/>
-          <w:noProof w:val="0"/>
-          <w:color w:val="auto"/>
-          <w:sz w:val="22"/>
-          <w:szCs w:val="22"/>
-          <w:lang w:val="pt-BR"/>
         </w:rPr>
         <w:t>Como trabalhos futuros, a equipe pretende implementar o backlog listado, com destaque para a autenticação de usuários e a gamificação completa (XP, níveis e ranking), que agregarão valor significativo à experiência do estudante.</w:t>
       </w:r>
@@ -14440,14 +13030,10 @@
     <w:p>
       <w:pPr>
         <w:pStyle w:val="Ttulo1"/>
-        <w:suppressLineNumbers w:val="0"/>
-        <w:bidi w:val="0"/>
-        <w:spacing w:before="0" w:beforeAutospacing="off" w:after="0" w:afterAutospacing="off" w:line="300" w:lineRule="auto"/>
-        <w:ind w:left="0" w:right="0" w:firstLine="0"/>
-        <w:jc w:val="left"/>
-        <w:rPr>
-          <w:rFonts w:ascii="Times New Roman" w:hAnsi="Times New Roman" w:eastAsia="Times New Roman" w:cs="Times New Roman"/>
-          <w:color w:val="000000" w:themeColor="text1" w:themeTint="FF" w:themeShade="FF"/>
+        <w:spacing w:before="0" w:after="0" w:line="300" w:lineRule="auto"/>
+        <w:rPr>
+          <w:rFonts w:ascii="Times New Roman" w:hAnsi="Times New Roman" w:eastAsia="Times New Roman" w:cs="Times New Roman"/>
+          <w:color w:val="000000" w:themeColor="text1"/>
         </w:rPr>
       </w:pPr>
       <w:bookmarkStart w:name="_omy161x6a8yi" w:id="13"/>
@@ -14455,7 +13041,7 @@
       <w:r>
         <w:rPr>
           <w:rFonts w:ascii="Times New Roman" w:hAnsi="Times New Roman" w:eastAsia="Times New Roman" w:cs="Times New Roman"/>
-          <w:color w:val="000000" w:themeColor="text1" w:themeTint="FF" w:themeShade="FF"/>
+          <w:color w:val="000000" w:themeColor="text1"/>
         </w:rPr>
         <w:t>4. REFERÊNCIAS</w:t>
       </w:r>
@@ -15128,7 +13714,6 @@
           <w:sz w:val="22"/>
           <w:szCs w:val="22"/>
         </w:rPr>
-        <w:lastRenderedPageBreak/>
         <w:t xml:space="preserve">W3SCHOOLS. </w:t>
       </w:r>
       <w:proofErr w:type="spellStart"/>
@@ -15966,7 +14551,6 @@
           <w:rFonts w:ascii="Times New Roman" w:hAnsi="Times New Roman" w:eastAsia="Times New Roman" w:cs="Times New Roman"/>
           <w:color w:val="000000"/>
         </w:rPr>
-        <w:lastRenderedPageBreak/>
         <w:t>Critérios de Avaliação</w:t>
       </w:r>
     </w:p>
@@ -15974,7 +14558,7 @@
       <w:pPr>
         <w:numPr>
           <w:ilvl w:val="0"/>
-          <w:numId w:val="2"/>
+          <w:numId w:val="6"/>
         </w:numPr>
         <w:rPr>
           <w:rFonts w:ascii="Times New Roman" w:hAnsi="Times New Roman" w:eastAsia="Times New Roman" w:cs="Times New Roman"/>
@@ -15992,7 +14576,7 @@
       <w:pPr>
         <w:numPr>
           <w:ilvl w:val="0"/>
-          <w:numId w:val="2"/>
+          <w:numId w:val="6"/>
         </w:numPr>
         <w:rPr>
           <w:rFonts w:ascii="Times New Roman" w:hAnsi="Times New Roman" w:eastAsia="Times New Roman" w:cs="Times New Roman"/>
@@ -16010,7 +14594,7 @@
       <w:pPr>
         <w:numPr>
           <w:ilvl w:val="0"/>
-          <w:numId w:val="2"/>
+          <w:numId w:val="6"/>
         </w:numPr>
         <w:rPr>
           <w:rFonts w:ascii="Times New Roman" w:hAnsi="Times New Roman" w:eastAsia="Times New Roman" w:cs="Times New Roman"/>
@@ -16028,7 +14612,7 @@
       <w:pPr>
         <w:numPr>
           <w:ilvl w:val="0"/>
-          <w:numId w:val="2"/>
+          <w:numId w:val="6"/>
         </w:numPr>
         <w:rPr>
           <w:rFonts w:ascii="Times New Roman" w:hAnsi="Times New Roman" w:eastAsia="Times New Roman" w:cs="Times New Roman"/>
@@ -16440,10 +15024,11 @@
 
 <file path=word/numbering.xml><?xml version="1.0" encoding="utf-8"?>
 <w:numbering xmlns:wpc="http://schemas.microsoft.com/office/word/2010/wordprocessingCanvas" xmlns:cx="http://schemas.microsoft.com/office/drawing/2014/chartex" xmlns:cx1="http://schemas.microsoft.com/office/drawing/2015/9/8/chartex" xmlns:cx2="http://schemas.microsoft.com/office/drawing/2015/10/21/chartex" xmlns:cx3="http://schemas.microsoft.com/office/drawing/2016/5/9/chartex" xmlns:cx4="http://schemas.microsoft.com/office/drawing/2016/5/10/chartex" xmlns:cx5="http://schemas.microsoft.com/office/drawing/2016/5/11/chartex" xmlns:cx6="http://schemas.microsoft.com/office/drawing/2016/5/12/chartex" xmlns:cx7="http://schemas.microsoft.com/office/drawing/2016/5/13/chartex" xmlns:cx8="http://schemas.microsoft.com/office/drawing/2016/5/14/chartex" xmlns:mc="http://schemas.openxmlformats.org/markup-compatibility/2006" xmlns:aink="http://schemas.microsoft.com/office/drawing/2016/ink" xmlns:am3d="http://schemas.microsoft.com/office/drawing/2017/model3d" xmlns:o="urn:schemas-microsoft-com:office:office" xmlns:oel="http://schemas.microsoft.com/office/2019/extlst" xmlns:r="http://schemas.openxmlformats.org/officeDocument/2006/relationships" xmlns:m="http://schemas.openxmlformats.org/officeDocument/2006/math" xmlns:v="urn:schemas-microsoft-com:vml" xmlns:wp14="http://schemas.microsoft.com/office/word/2010/wordprocessingDrawing" xmlns:wp="http://schemas.openxmlformats.org/drawingml/2006/wordprocessingDrawing" xmlns:w10="urn:schemas-microsoft-com:office:word" xmlns:w="http://schemas.openxmlformats.org/wordprocessingml/2006/main" xmlns:w14="http://schemas.microsoft.com/office/word/2010/wordml" xmlns:w15="http://schemas.microsoft.com/office/word/2012/wordml" xmlns:w16cex="http://schemas.microsoft.com/office/word/2018/wordml/cex" xmlns:w16cid="http://schemas.microsoft.com/office/word/2016/wordml/cid" xmlns:w16="http://schemas.microsoft.com/office/word/2018/wordml" xmlns:w16du="http://schemas.microsoft.com/office/word/2023/wordml/word16du" xmlns:w16sdtdh="http://schemas.microsoft.com/office/word/2020/wordml/sdtdatahash" xmlns:w16sdtfl="http://schemas.microsoft.com/office/word/2024/wordml/sdtformatlock" xmlns:w16se="http://schemas.microsoft.com/office/word/2015/wordml/symex" xmlns:wpg="http://schemas.microsoft.com/office/word/2010/wordprocessingGroup" xmlns:wpi="http://schemas.microsoft.com/office/word/2010/wordprocessingInk" xmlns:wne="http://schemas.microsoft.com/office/word/2006/wordml" xmlns:wps="http://schemas.microsoft.com/office/word/2010/wordprocessingShape" mc:Ignorable="w14 w15 w16se w16cid w16 w16cex w16sdtdh w16sdtfl w16du wp14">
-  <w:abstractNum xmlns:w="http://schemas.openxmlformats.org/wordprocessingml/2006/main" w:abstractNumId="5">
-    <w:nsid w:val="40e28c86"/>
-    <w:multiLevelType xmlns:w="http://schemas.openxmlformats.org/wordprocessingml/2006/main" w:val="hybridMultilevel"/>
-    <w:lvl xmlns:w="http://schemas.openxmlformats.org/wordprocessingml/2006/main" w:ilvl="0">
+  <w:abstractNum w:abstractNumId="0" w15:restartNumberingAfterBreak="0">
+    <w:nsid w:val="0744B4DC"/>
+    <w:multiLevelType w:val="hybridMultilevel"/>
+    <w:tmpl w:val="FFFFFFFF"/>
+    <w:lvl w:ilvl="0" w:tplc="084800E8">
       <w:start w:val="1"/>
       <w:numFmt w:val="bullet"/>
       <w:lvlText w:val=""/>
@@ -16455,7 +15040,7 @@
         <w:rFonts w:hint="default" w:ascii="Symbol" w:hAnsi="Symbol"/>
       </w:rPr>
     </w:lvl>
-    <w:lvl xmlns:w="http://schemas.openxmlformats.org/wordprocessingml/2006/main" w:ilvl="1">
+    <w:lvl w:ilvl="1" w:tplc="3E023EA2">
       <w:start w:val="1"/>
       <w:numFmt w:val="bullet"/>
       <w:lvlText w:val="o"/>
@@ -16467,7 +15052,7 @@
         <w:rFonts w:hint="default" w:ascii="Courier New" w:hAnsi="Courier New"/>
       </w:rPr>
     </w:lvl>
-    <w:lvl xmlns:w="http://schemas.openxmlformats.org/wordprocessingml/2006/main" w:ilvl="2">
+    <w:lvl w:ilvl="2" w:tplc="247AD38A">
       <w:start w:val="1"/>
       <w:numFmt w:val="bullet"/>
       <w:lvlText w:val=""/>
@@ -16479,7 +15064,7 @@
         <w:rFonts w:hint="default" w:ascii="Wingdings" w:hAnsi="Wingdings"/>
       </w:rPr>
     </w:lvl>
-    <w:lvl xmlns:w="http://schemas.openxmlformats.org/wordprocessingml/2006/main" w:ilvl="3">
+    <w:lvl w:ilvl="3" w:tplc="E8686328">
       <w:start w:val="1"/>
       <w:numFmt w:val="bullet"/>
       <w:lvlText w:val=""/>
@@ -16491,7 +15076,7 @@
         <w:rFonts w:hint="default" w:ascii="Symbol" w:hAnsi="Symbol"/>
       </w:rPr>
     </w:lvl>
-    <w:lvl xmlns:w="http://schemas.openxmlformats.org/wordprocessingml/2006/main" w:ilvl="4">
+    <w:lvl w:ilvl="4" w:tplc="858A9842">
       <w:start w:val="1"/>
       <w:numFmt w:val="bullet"/>
       <w:lvlText w:val="o"/>
@@ -16503,7 +15088,7 @@
         <w:rFonts w:hint="default" w:ascii="Courier New" w:hAnsi="Courier New"/>
       </w:rPr>
     </w:lvl>
-    <w:lvl xmlns:w="http://schemas.openxmlformats.org/wordprocessingml/2006/main" w:ilvl="5">
+    <w:lvl w:ilvl="5" w:tplc="A8DA264C">
       <w:start w:val="1"/>
       <w:numFmt w:val="bullet"/>
       <w:lvlText w:val=""/>
@@ -16515,7 +15100,7 @@
         <w:rFonts w:hint="default" w:ascii="Wingdings" w:hAnsi="Wingdings"/>
       </w:rPr>
     </w:lvl>
-    <w:lvl xmlns:w="http://schemas.openxmlformats.org/wordprocessingml/2006/main" w:ilvl="6">
+    <w:lvl w:ilvl="6" w:tplc="A9BAE878">
       <w:start w:val="1"/>
       <w:numFmt w:val="bullet"/>
       <w:lvlText w:val=""/>
@@ -16527,7 +15112,7 @@
         <w:rFonts w:hint="default" w:ascii="Symbol" w:hAnsi="Symbol"/>
       </w:rPr>
     </w:lvl>
-    <w:lvl xmlns:w="http://schemas.openxmlformats.org/wordprocessingml/2006/main" w:ilvl="7">
+    <w:lvl w:ilvl="7" w:tplc="EB6AEDDC">
       <w:start w:val="1"/>
       <w:numFmt w:val="bullet"/>
       <w:lvlText w:val="o"/>
@@ -16539,7 +15124,7 @@
         <w:rFonts w:hint="default" w:ascii="Courier New" w:hAnsi="Courier New"/>
       </w:rPr>
     </w:lvl>
-    <w:lvl xmlns:w="http://schemas.openxmlformats.org/wordprocessingml/2006/main" w:ilvl="8">
+    <w:lvl w:ilvl="8" w:tplc="9C9224D8">
       <w:start w:val="1"/>
       <w:numFmt w:val="bullet"/>
       <w:lvlText w:val=""/>
@@ -16552,343 +15137,7 @@
       </w:rPr>
     </w:lvl>
   </w:abstractNum>
-  <w:abstractNum xmlns:w="http://schemas.openxmlformats.org/wordprocessingml/2006/main" w:abstractNumId="4">
-    <w:nsid w:val="3da16406"/>
-    <w:multiLevelType xmlns:w="http://schemas.openxmlformats.org/wordprocessingml/2006/main" w:val="hybridMultilevel"/>
-    <w:lvl xmlns:w="http://schemas.openxmlformats.org/wordprocessingml/2006/main" w:ilvl="0">
-      <w:start w:val="1"/>
-      <w:numFmt w:val="bullet"/>
-      <w:lvlText w:val=""/>
-      <w:lvlJc w:val="left"/>
-      <w:pPr>
-        <w:ind w:left="720" w:hanging="360"/>
-      </w:pPr>
-      <w:rPr>
-        <w:rFonts w:hint="default" w:ascii="Symbol" w:hAnsi="Symbol"/>
-      </w:rPr>
-    </w:lvl>
-    <w:lvl xmlns:w="http://schemas.openxmlformats.org/wordprocessingml/2006/main" w:ilvl="1">
-      <w:start w:val="1"/>
-      <w:numFmt w:val="bullet"/>
-      <w:lvlText w:val="o"/>
-      <w:lvlJc w:val="left"/>
-      <w:pPr>
-        <w:ind w:left="1440" w:hanging="360"/>
-      </w:pPr>
-      <w:rPr>
-        <w:rFonts w:hint="default" w:ascii="Courier New" w:hAnsi="Courier New"/>
-      </w:rPr>
-    </w:lvl>
-    <w:lvl xmlns:w="http://schemas.openxmlformats.org/wordprocessingml/2006/main" w:ilvl="2">
-      <w:start w:val="1"/>
-      <w:numFmt w:val="bullet"/>
-      <w:lvlText w:val=""/>
-      <w:lvlJc w:val="left"/>
-      <w:pPr>
-        <w:ind w:left="2160" w:hanging="360"/>
-      </w:pPr>
-      <w:rPr>
-        <w:rFonts w:hint="default" w:ascii="Wingdings" w:hAnsi="Wingdings"/>
-      </w:rPr>
-    </w:lvl>
-    <w:lvl xmlns:w="http://schemas.openxmlformats.org/wordprocessingml/2006/main" w:ilvl="3">
-      <w:start w:val="1"/>
-      <w:numFmt w:val="bullet"/>
-      <w:lvlText w:val=""/>
-      <w:lvlJc w:val="left"/>
-      <w:pPr>
-        <w:ind w:left="2880" w:hanging="360"/>
-      </w:pPr>
-      <w:rPr>
-        <w:rFonts w:hint="default" w:ascii="Symbol" w:hAnsi="Symbol"/>
-      </w:rPr>
-    </w:lvl>
-    <w:lvl xmlns:w="http://schemas.openxmlformats.org/wordprocessingml/2006/main" w:ilvl="4">
-      <w:start w:val="1"/>
-      <w:numFmt w:val="bullet"/>
-      <w:lvlText w:val="o"/>
-      <w:lvlJc w:val="left"/>
-      <w:pPr>
-        <w:ind w:left="3600" w:hanging="360"/>
-      </w:pPr>
-      <w:rPr>
-        <w:rFonts w:hint="default" w:ascii="Courier New" w:hAnsi="Courier New"/>
-      </w:rPr>
-    </w:lvl>
-    <w:lvl xmlns:w="http://schemas.openxmlformats.org/wordprocessingml/2006/main" w:ilvl="5">
-      <w:start w:val="1"/>
-      <w:numFmt w:val="bullet"/>
-      <w:lvlText w:val=""/>
-      <w:lvlJc w:val="left"/>
-      <w:pPr>
-        <w:ind w:left="4320" w:hanging="360"/>
-      </w:pPr>
-      <w:rPr>
-        <w:rFonts w:hint="default" w:ascii="Wingdings" w:hAnsi="Wingdings"/>
-      </w:rPr>
-    </w:lvl>
-    <w:lvl xmlns:w="http://schemas.openxmlformats.org/wordprocessingml/2006/main" w:ilvl="6">
-      <w:start w:val="1"/>
-      <w:numFmt w:val="bullet"/>
-      <w:lvlText w:val=""/>
-      <w:lvlJc w:val="left"/>
-      <w:pPr>
-        <w:ind w:left="5040" w:hanging="360"/>
-      </w:pPr>
-      <w:rPr>
-        <w:rFonts w:hint="default" w:ascii="Symbol" w:hAnsi="Symbol"/>
-      </w:rPr>
-    </w:lvl>
-    <w:lvl xmlns:w="http://schemas.openxmlformats.org/wordprocessingml/2006/main" w:ilvl="7">
-      <w:start w:val="1"/>
-      <w:numFmt w:val="bullet"/>
-      <w:lvlText w:val="o"/>
-      <w:lvlJc w:val="left"/>
-      <w:pPr>
-        <w:ind w:left="5760" w:hanging="360"/>
-      </w:pPr>
-      <w:rPr>
-        <w:rFonts w:hint="default" w:ascii="Courier New" w:hAnsi="Courier New"/>
-      </w:rPr>
-    </w:lvl>
-    <w:lvl xmlns:w="http://schemas.openxmlformats.org/wordprocessingml/2006/main" w:ilvl="8">
-      <w:start w:val="1"/>
-      <w:numFmt w:val="bullet"/>
-      <w:lvlText w:val=""/>
-      <w:lvlJc w:val="left"/>
-      <w:pPr>
-        <w:ind w:left="6480" w:hanging="360"/>
-      </w:pPr>
-      <w:rPr>
-        <w:rFonts w:hint="default" w:ascii="Wingdings" w:hAnsi="Wingdings"/>
-      </w:rPr>
-    </w:lvl>
-  </w:abstractNum>
-  <w:abstractNum xmlns:w="http://schemas.openxmlformats.org/wordprocessingml/2006/main" w:abstractNumId="3">
-    <w:nsid w:val="4651fa88"/>
-    <w:multiLevelType xmlns:w="http://schemas.openxmlformats.org/wordprocessingml/2006/main" w:val="hybridMultilevel"/>
-    <w:lvl xmlns:w="http://schemas.openxmlformats.org/wordprocessingml/2006/main" w:ilvl="0">
-      <w:start w:val="1"/>
-      <w:numFmt w:val="bullet"/>
-      <w:lvlText w:val=""/>
-      <w:lvlJc w:val="left"/>
-      <w:pPr>
-        <w:ind w:left="720" w:hanging="360"/>
-      </w:pPr>
-      <w:rPr>
-        <w:rFonts w:hint="default" w:ascii="Symbol" w:hAnsi="Symbol"/>
-      </w:rPr>
-    </w:lvl>
-    <w:lvl xmlns:w="http://schemas.openxmlformats.org/wordprocessingml/2006/main" w:ilvl="1">
-      <w:start w:val="1"/>
-      <w:numFmt w:val="bullet"/>
-      <w:lvlText w:val="o"/>
-      <w:lvlJc w:val="left"/>
-      <w:pPr>
-        <w:ind w:left="1440" w:hanging="360"/>
-      </w:pPr>
-      <w:rPr>
-        <w:rFonts w:hint="default" w:ascii="Courier New" w:hAnsi="Courier New"/>
-      </w:rPr>
-    </w:lvl>
-    <w:lvl xmlns:w="http://schemas.openxmlformats.org/wordprocessingml/2006/main" w:ilvl="2">
-      <w:start w:val="1"/>
-      <w:numFmt w:val="bullet"/>
-      <w:lvlText w:val=""/>
-      <w:lvlJc w:val="left"/>
-      <w:pPr>
-        <w:ind w:left="2160" w:hanging="360"/>
-      </w:pPr>
-      <w:rPr>
-        <w:rFonts w:hint="default" w:ascii="Wingdings" w:hAnsi="Wingdings"/>
-      </w:rPr>
-    </w:lvl>
-    <w:lvl xmlns:w="http://schemas.openxmlformats.org/wordprocessingml/2006/main" w:ilvl="3">
-      <w:start w:val="1"/>
-      <w:numFmt w:val="bullet"/>
-      <w:lvlText w:val=""/>
-      <w:lvlJc w:val="left"/>
-      <w:pPr>
-        <w:ind w:left="2880" w:hanging="360"/>
-      </w:pPr>
-      <w:rPr>
-        <w:rFonts w:hint="default" w:ascii="Symbol" w:hAnsi="Symbol"/>
-      </w:rPr>
-    </w:lvl>
-    <w:lvl xmlns:w="http://schemas.openxmlformats.org/wordprocessingml/2006/main" w:ilvl="4">
-      <w:start w:val="1"/>
-      <w:numFmt w:val="bullet"/>
-      <w:lvlText w:val="o"/>
-      <w:lvlJc w:val="left"/>
-      <w:pPr>
-        <w:ind w:left="3600" w:hanging="360"/>
-      </w:pPr>
-      <w:rPr>
-        <w:rFonts w:hint="default" w:ascii="Courier New" w:hAnsi="Courier New"/>
-      </w:rPr>
-    </w:lvl>
-    <w:lvl xmlns:w="http://schemas.openxmlformats.org/wordprocessingml/2006/main" w:ilvl="5">
-      <w:start w:val="1"/>
-      <w:numFmt w:val="bullet"/>
-      <w:lvlText w:val=""/>
-      <w:lvlJc w:val="left"/>
-      <w:pPr>
-        <w:ind w:left="4320" w:hanging="360"/>
-      </w:pPr>
-      <w:rPr>
-        <w:rFonts w:hint="default" w:ascii="Wingdings" w:hAnsi="Wingdings"/>
-      </w:rPr>
-    </w:lvl>
-    <w:lvl xmlns:w="http://schemas.openxmlformats.org/wordprocessingml/2006/main" w:ilvl="6">
-      <w:start w:val="1"/>
-      <w:numFmt w:val="bullet"/>
-      <w:lvlText w:val=""/>
-      <w:lvlJc w:val="left"/>
-      <w:pPr>
-        <w:ind w:left="5040" w:hanging="360"/>
-      </w:pPr>
-      <w:rPr>
-        <w:rFonts w:hint="default" w:ascii="Symbol" w:hAnsi="Symbol"/>
-      </w:rPr>
-    </w:lvl>
-    <w:lvl xmlns:w="http://schemas.openxmlformats.org/wordprocessingml/2006/main" w:ilvl="7">
-      <w:start w:val="1"/>
-      <w:numFmt w:val="bullet"/>
-      <w:lvlText w:val="o"/>
-      <w:lvlJc w:val="left"/>
-      <w:pPr>
-        <w:ind w:left="5760" w:hanging="360"/>
-      </w:pPr>
-      <w:rPr>
-        <w:rFonts w:hint="default" w:ascii="Courier New" w:hAnsi="Courier New"/>
-      </w:rPr>
-    </w:lvl>
-    <w:lvl xmlns:w="http://schemas.openxmlformats.org/wordprocessingml/2006/main" w:ilvl="8">
-      <w:start w:val="1"/>
-      <w:numFmt w:val="bullet"/>
-      <w:lvlText w:val=""/>
-      <w:lvlJc w:val="left"/>
-      <w:pPr>
-        <w:ind w:left="6480" w:hanging="360"/>
-      </w:pPr>
-      <w:rPr>
-        <w:rFonts w:hint="default" w:ascii="Wingdings" w:hAnsi="Wingdings"/>
-      </w:rPr>
-    </w:lvl>
-  </w:abstractNum>
-  <w:abstractNum xmlns:w="http://schemas.openxmlformats.org/wordprocessingml/2006/main" w:abstractNumId="2">
-    <w:nsid w:val="744b4dc"/>
-    <w:multiLevelType xmlns:w="http://schemas.openxmlformats.org/wordprocessingml/2006/main" w:val="hybridMultilevel"/>
-    <w:lvl xmlns:w="http://schemas.openxmlformats.org/wordprocessingml/2006/main" w:ilvl="0">
-      <w:start w:val="1"/>
-      <w:numFmt w:val="bullet"/>
-      <w:lvlText w:val=""/>
-      <w:lvlJc w:val="left"/>
-      <w:pPr>
-        <w:ind w:left="720" w:hanging="360"/>
-      </w:pPr>
-      <w:rPr>
-        <w:rFonts w:hint="default" w:ascii="Symbol" w:hAnsi="Symbol"/>
-      </w:rPr>
-    </w:lvl>
-    <w:lvl xmlns:w="http://schemas.openxmlformats.org/wordprocessingml/2006/main" w:ilvl="1">
-      <w:start w:val="1"/>
-      <w:numFmt w:val="bullet"/>
-      <w:lvlText w:val="o"/>
-      <w:lvlJc w:val="left"/>
-      <w:pPr>
-        <w:ind w:left="1440" w:hanging="360"/>
-      </w:pPr>
-      <w:rPr>
-        <w:rFonts w:hint="default" w:ascii="Courier New" w:hAnsi="Courier New"/>
-      </w:rPr>
-    </w:lvl>
-    <w:lvl xmlns:w="http://schemas.openxmlformats.org/wordprocessingml/2006/main" w:ilvl="2">
-      <w:start w:val="1"/>
-      <w:numFmt w:val="bullet"/>
-      <w:lvlText w:val=""/>
-      <w:lvlJc w:val="left"/>
-      <w:pPr>
-        <w:ind w:left="2160" w:hanging="360"/>
-      </w:pPr>
-      <w:rPr>
-        <w:rFonts w:hint="default" w:ascii="Wingdings" w:hAnsi="Wingdings"/>
-      </w:rPr>
-    </w:lvl>
-    <w:lvl xmlns:w="http://schemas.openxmlformats.org/wordprocessingml/2006/main" w:ilvl="3">
-      <w:start w:val="1"/>
-      <w:numFmt w:val="bullet"/>
-      <w:lvlText w:val=""/>
-      <w:lvlJc w:val="left"/>
-      <w:pPr>
-        <w:ind w:left="2880" w:hanging="360"/>
-      </w:pPr>
-      <w:rPr>
-        <w:rFonts w:hint="default" w:ascii="Symbol" w:hAnsi="Symbol"/>
-      </w:rPr>
-    </w:lvl>
-    <w:lvl xmlns:w="http://schemas.openxmlformats.org/wordprocessingml/2006/main" w:ilvl="4">
-      <w:start w:val="1"/>
-      <w:numFmt w:val="bullet"/>
-      <w:lvlText w:val="o"/>
-      <w:lvlJc w:val="left"/>
-      <w:pPr>
-        <w:ind w:left="3600" w:hanging="360"/>
-      </w:pPr>
-      <w:rPr>
-        <w:rFonts w:hint="default" w:ascii="Courier New" w:hAnsi="Courier New"/>
-      </w:rPr>
-    </w:lvl>
-    <w:lvl xmlns:w="http://schemas.openxmlformats.org/wordprocessingml/2006/main" w:ilvl="5">
-      <w:start w:val="1"/>
-      <w:numFmt w:val="bullet"/>
-      <w:lvlText w:val=""/>
-      <w:lvlJc w:val="left"/>
-      <w:pPr>
-        <w:ind w:left="4320" w:hanging="360"/>
-      </w:pPr>
-      <w:rPr>
-        <w:rFonts w:hint="default" w:ascii="Wingdings" w:hAnsi="Wingdings"/>
-      </w:rPr>
-    </w:lvl>
-    <w:lvl xmlns:w="http://schemas.openxmlformats.org/wordprocessingml/2006/main" w:ilvl="6">
-      <w:start w:val="1"/>
-      <w:numFmt w:val="bullet"/>
-      <w:lvlText w:val=""/>
-      <w:lvlJc w:val="left"/>
-      <w:pPr>
-        <w:ind w:left="5040" w:hanging="360"/>
-      </w:pPr>
-      <w:rPr>
-        <w:rFonts w:hint="default" w:ascii="Symbol" w:hAnsi="Symbol"/>
-      </w:rPr>
-    </w:lvl>
-    <w:lvl xmlns:w="http://schemas.openxmlformats.org/wordprocessingml/2006/main" w:ilvl="7">
-      <w:start w:val="1"/>
-      <w:numFmt w:val="bullet"/>
-      <w:lvlText w:val="o"/>
-      <w:lvlJc w:val="left"/>
-      <w:pPr>
-        <w:ind w:left="5760" w:hanging="360"/>
-      </w:pPr>
-      <w:rPr>
-        <w:rFonts w:hint="default" w:ascii="Courier New" w:hAnsi="Courier New"/>
-      </w:rPr>
-    </w:lvl>
-    <w:lvl xmlns:w="http://schemas.openxmlformats.org/wordprocessingml/2006/main" w:ilvl="8">
-      <w:start w:val="1"/>
-      <w:numFmt w:val="bullet"/>
-      <w:lvlText w:val=""/>
-      <w:lvlJc w:val="left"/>
-      <w:pPr>
-        <w:ind w:left="6480" w:hanging="360"/>
-      </w:pPr>
-      <w:rPr>
-        <w:rFonts w:hint="default" w:ascii="Wingdings" w:hAnsi="Wingdings"/>
-      </w:rPr>
-    </w:lvl>
-  </w:abstractNum>
-  <w:abstractNum w:abstractNumId="0" w15:restartNumberingAfterBreak="0">
+  <w:abstractNum w:abstractNumId="1" w15:restartNumberingAfterBreak="0">
     <w:nsid w:val="211D18CA"/>
     <w:multiLevelType w:val="multilevel"/>
     <w:tmpl w:val="12CEB602"/>
@@ -17109,7 +15358,346 @@
       </w:rPr>
     </w:lvl>
   </w:abstractNum>
-  <w:abstractNum w:abstractNumId="1" w15:restartNumberingAfterBreak="0">
+  <w:abstractNum w:abstractNumId="2" w15:restartNumberingAfterBreak="0">
+    <w:nsid w:val="3DA16406"/>
+    <w:multiLevelType w:val="hybridMultilevel"/>
+    <w:tmpl w:val="FFFFFFFF"/>
+    <w:lvl w:ilvl="0" w:tplc="F8488104">
+      <w:start w:val="1"/>
+      <w:numFmt w:val="bullet"/>
+      <w:lvlText w:val=""/>
+      <w:lvlJc w:val="left"/>
+      <w:pPr>
+        <w:ind w:left="720" w:hanging="360"/>
+      </w:pPr>
+      <w:rPr>
+        <w:rFonts w:hint="default" w:ascii="Symbol" w:hAnsi="Symbol"/>
+      </w:rPr>
+    </w:lvl>
+    <w:lvl w:ilvl="1" w:tplc="D40431D4">
+      <w:start w:val="1"/>
+      <w:numFmt w:val="bullet"/>
+      <w:lvlText w:val="o"/>
+      <w:lvlJc w:val="left"/>
+      <w:pPr>
+        <w:ind w:left="1440" w:hanging="360"/>
+      </w:pPr>
+      <w:rPr>
+        <w:rFonts w:hint="default" w:ascii="Courier New" w:hAnsi="Courier New"/>
+      </w:rPr>
+    </w:lvl>
+    <w:lvl w:ilvl="2" w:tplc="140C688A">
+      <w:start w:val="1"/>
+      <w:numFmt w:val="bullet"/>
+      <w:lvlText w:val=""/>
+      <w:lvlJc w:val="left"/>
+      <w:pPr>
+        <w:ind w:left="2160" w:hanging="360"/>
+      </w:pPr>
+      <w:rPr>
+        <w:rFonts w:hint="default" w:ascii="Wingdings" w:hAnsi="Wingdings"/>
+      </w:rPr>
+    </w:lvl>
+    <w:lvl w:ilvl="3" w:tplc="0448AB26">
+      <w:start w:val="1"/>
+      <w:numFmt w:val="bullet"/>
+      <w:lvlText w:val=""/>
+      <w:lvlJc w:val="left"/>
+      <w:pPr>
+        <w:ind w:left="2880" w:hanging="360"/>
+      </w:pPr>
+      <w:rPr>
+        <w:rFonts w:hint="default" w:ascii="Symbol" w:hAnsi="Symbol"/>
+      </w:rPr>
+    </w:lvl>
+    <w:lvl w:ilvl="4" w:tplc="73225F1C">
+      <w:start w:val="1"/>
+      <w:numFmt w:val="bullet"/>
+      <w:lvlText w:val="o"/>
+      <w:lvlJc w:val="left"/>
+      <w:pPr>
+        <w:ind w:left="3600" w:hanging="360"/>
+      </w:pPr>
+      <w:rPr>
+        <w:rFonts w:hint="default" w:ascii="Courier New" w:hAnsi="Courier New"/>
+      </w:rPr>
+    </w:lvl>
+    <w:lvl w:ilvl="5" w:tplc="17F8020C">
+      <w:start w:val="1"/>
+      <w:numFmt w:val="bullet"/>
+      <w:lvlText w:val=""/>
+      <w:lvlJc w:val="left"/>
+      <w:pPr>
+        <w:ind w:left="4320" w:hanging="360"/>
+      </w:pPr>
+      <w:rPr>
+        <w:rFonts w:hint="default" w:ascii="Wingdings" w:hAnsi="Wingdings"/>
+      </w:rPr>
+    </w:lvl>
+    <w:lvl w:ilvl="6" w:tplc="CDB4EF54">
+      <w:start w:val="1"/>
+      <w:numFmt w:val="bullet"/>
+      <w:lvlText w:val=""/>
+      <w:lvlJc w:val="left"/>
+      <w:pPr>
+        <w:ind w:left="5040" w:hanging="360"/>
+      </w:pPr>
+      <w:rPr>
+        <w:rFonts w:hint="default" w:ascii="Symbol" w:hAnsi="Symbol"/>
+      </w:rPr>
+    </w:lvl>
+    <w:lvl w:ilvl="7" w:tplc="F5BCDFBC">
+      <w:start w:val="1"/>
+      <w:numFmt w:val="bullet"/>
+      <w:lvlText w:val="o"/>
+      <w:lvlJc w:val="left"/>
+      <w:pPr>
+        <w:ind w:left="5760" w:hanging="360"/>
+      </w:pPr>
+      <w:rPr>
+        <w:rFonts w:hint="default" w:ascii="Courier New" w:hAnsi="Courier New"/>
+      </w:rPr>
+    </w:lvl>
+    <w:lvl w:ilvl="8" w:tplc="BF22F4E2">
+      <w:start w:val="1"/>
+      <w:numFmt w:val="bullet"/>
+      <w:lvlText w:val=""/>
+      <w:lvlJc w:val="left"/>
+      <w:pPr>
+        <w:ind w:left="6480" w:hanging="360"/>
+      </w:pPr>
+      <w:rPr>
+        <w:rFonts w:hint="default" w:ascii="Wingdings" w:hAnsi="Wingdings"/>
+      </w:rPr>
+    </w:lvl>
+  </w:abstractNum>
+  <w:abstractNum w:abstractNumId="3" w15:restartNumberingAfterBreak="0">
+    <w:nsid w:val="40E28C86"/>
+    <w:multiLevelType w:val="hybridMultilevel"/>
+    <w:tmpl w:val="FFFFFFFF"/>
+    <w:lvl w:ilvl="0" w:tplc="F3C42E5E">
+      <w:start w:val="1"/>
+      <w:numFmt w:val="bullet"/>
+      <w:lvlText w:val=""/>
+      <w:lvlJc w:val="left"/>
+      <w:pPr>
+        <w:ind w:left="720" w:hanging="360"/>
+      </w:pPr>
+      <w:rPr>
+        <w:rFonts w:hint="default" w:ascii="Symbol" w:hAnsi="Symbol"/>
+      </w:rPr>
+    </w:lvl>
+    <w:lvl w:ilvl="1" w:tplc="4FAABA6E">
+      <w:start w:val="1"/>
+      <w:numFmt w:val="bullet"/>
+      <w:lvlText w:val="o"/>
+      <w:lvlJc w:val="left"/>
+      <w:pPr>
+        <w:ind w:left="1440" w:hanging="360"/>
+      </w:pPr>
+      <w:rPr>
+        <w:rFonts w:hint="default" w:ascii="Courier New" w:hAnsi="Courier New"/>
+      </w:rPr>
+    </w:lvl>
+    <w:lvl w:ilvl="2" w:tplc="912E1A04">
+      <w:start w:val="1"/>
+      <w:numFmt w:val="bullet"/>
+      <w:lvlText w:val=""/>
+      <w:lvlJc w:val="left"/>
+      <w:pPr>
+        <w:ind w:left="2160" w:hanging="360"/>
+      </w:pPr>
+      <w:rPr>
+        <w:rFonts w:hint="default" w:ascii="Wingdings" w:hAnsi="Wingdings"/>
+      </w:rPr>
+    </w:lvl>
+    <w:lvl w:ilvl="3" w:tplc="652473A8">
+      <w:start w:val="1"/>
+      <w:numFmt w:val="bullet"/>
+      <w:lvlText w:val=""/>
+      <w:lvlJc w:val="left"/>
+      <w:pPr>
+        <w:ind w:left="2880" w:hanging="360"/>
+      </w:pPr>
+      <w:rPr>
+        <w:rFonts w:hint="default" w:ascii="Symbol" w:hAnsi="Symbol"/>
+      </w:rPr>
+    </w:lvl>
+    <w:lvl w:ilvl="4" w:tplc="5590D61A">
+      <w:start w:val="1"/>
+      <w:numFmt w:val="bullet"/>
+      <w:lvlText w:val="o"/>
+      <w:lvlJc w:val="left"/>
+      <w:pPr>
+        <w:ind w:left="3600" w:hanging="360"/>
+      </w:pPr>
+      <w:rPr>
+        <w:rFonts w:hint="default" w:ascii="Courier New" w:hAnsi="Courier New"/>
+      </w:rPr>
+    </w:lvl>
+    <w:lvl w:ilvl="5" w:tplc="40B24F30">
+      <w:start w:val="1"/>
+      <w:numFmt w:val="bullet"/>
+      <w:lvlText w:val=""/>
+      <w:lvlJc w:val="left"/>
+      <w:pPr>
+        <w:ind w:left="4320" w:hanging="360"/>
+      </w:pPr>
+      <w:rPr>
+        <w:rFonts w:hint="default" w:ascii="Wingdings" w:hAnsi="Wingdings"/>
+      </w:rPr>
+    </w:lvl>
+    <w:lvl w:ilvl="6" w:tplc="448E5102">
+      <w:start w:val="1"/>
+      <w:numFmt w:val="bullet"/>
+      <w:lvlText w:val=""/>
+      <w:lvlJc w:val="left"/>
+      <w:pPr>
+        <w:ind w:left="5040" w:hanging="360"/>
+      </w:pPr>
+      <w:rPr>
+        <w:rFonts w:hint="default" w:ascii="Symbol" w:hAnsi="Symbol"/>
+      </w:rPr>
+    </w:lvl>
+    <w:lvl w:ilvl="7" w:tplc="335E25F8">
+      <w:start w:val="1"/>
+      <w:numFmt w:val="bullet"/>
+      <w:lvlText w:val="o"/>
+      <w:lvlJc w:val="left"/>
+      <w:pPr>
+        <w:ind w:left="5760" w:hanging="360"/>
+      </w:pPr>
+      <w:rPr>
+        <w:rFonts w:hint="default" w:ascii="Courier New" w:hAnsi="Courier New"/>
+      </w:rPr>
+    </w:lvl>
+    <w:lvl w:ilvl="8" w:tplc="02DE7A54">
+      <w:start w:val="1"/>
+      <w:numFmt w:val="bullet"/>
+      <w:lvlText w:val=""/>
+      <w:lvlJc w:val="left"/>
+      <w:pPr>
+        <w:ind w:left="6480" w:hanging="360"/>
+      </w:pPr>
+      <w:rPr>
+        <w:rFonts w:hint="default" w:ascii="Wingdings" w:hAnsi="Wingdings"/>
+      </w:rPr>
+    </w:lvl>
+  </w:abstractNum>
+  <w:abstractNum w:abstractNumId="4" w15:restartNumberingAfterBreak="0">
+    <w:nsid w:val="4651FA88"/>
+    <w:multiLevelType w:val="hybridMultilevel"/>
+    <w:tmpl w:val="FFFFFFFF"/>
+    <w:lvl w:ilvl="0" w:tplc="8B12A986">
+      <w:start w:val="1"/>
+      <w:numFmt w:val="bullet"/>
+      <w:lvlText w:val=""/>
+      <w:lvlJc w:val="left"/>
+      <w:pPr>
+        <w:ind w:left="720" w:hanging="360"/>
+      </w:pPr>
+      <w:rPr>
+        <w:rFonts w:hint="default" w:ascii="Symbol" w:hAnsi="Symbol"/>
+      </w:rPr>
+    </w:lvl>
+    <w:lvl w:ilvl="1" w:tplc="FAF413BC">
+      <w:start w:val="1"/>
+      <w:numFmt w:val="bullet"/>
+      <w:lvlText w:val="o"/>
+      <w:lvlJc w:val="left"/>
+      <w:pPr>
+        <w:ind w:left="1440" w:hanging="360"/>
+      </w:pPr>
+      <w:rPr>
+        <w:rFonts w:hint="default" w:ascii="Courier New" w:hAnsi="Courier New"/>
+      </w:rPr>
+    </w:lvl>
+    <w:lvl w:ilvl="2" w:tplc="91D2C5FE">
+      <w:start w:val="1"/>
+      <w:numFmt w:val="bullet"/>
+      <w:lvlText w:val=""/>
+      <w:lvlJc w:val="left"/>
+      <w:pPr>
+        <w:ind w:left="2160" w:hanging="360"/>
+      </w:pPr>
+      <w:rPr>
+        <w:rFonts w:hint="default" w:ascii="Wingdings" w:hAnsi="Wingdings"/>
+      </w:rPr>
+    </w:lvl>
+    <w:lvl w:ilvl="3" w:tplc="498A9FF8">
+      <w:start w:val="1"/>
+      <w:numFmt w:val="bullet"/>
+      <w:lvlText w:val=""/>
+      <w:lvlJc w:val="left"/>
+      <w:pPr>
+        <w:ind w:left="2880" w:hanging="360"/>
+      </w:pPr>
+      <w:rPr>
+        <w:rFonts w:hint="default" w:ascii="Symbol" w:hAnsi="Symbol"/>
+      </w:rPr>
+    </w:lvl>
+    <w:lvl w:ilvl="4" w:tplc="8F8215B8">
+      <w:start w:val="1"/>
+      <w:numFmt w:val="bullet"/>
+      <w:lvlText w:val="o"/>
+      <w:lvlJc w:val="left"/>
+      <w:pPr>
+        <w:ind w:left="3600" w:hanging="360"/>
+      </w:pPr>
+      <w:rPr>
+        <w:rFonts w:hint="default" w:ascii="Courier New" w:hAnsi="Courier New"/>
+      </w:rPr>
+    </w:lvl>
+    <w:lvl w:ilvl="5" w:tplc="98F8D82C">
+      <w:start w:val="1"/>
+      <w:numFmt w:val="bullet"/>
+      <w:lvlText w:val=""/>
+      <w:lvlJc w:val="left"/>
+      <w:pPr>
+        <w:ind w:left="4320" w:hanging="360"/>
+      </w:pPr>
+      <w:rPr>
+        <w:rFonts w:hint="default" w:ascii="Wingdings" w:hAnsi="Wingdings"/>
+      </w:rPr>
+    </w:lvl>
+    <w:lvl w:ilvl="6" w:tplc="8BBAE10A">
+      <w:start w:val="1"/>
+      <w:numFmt w:val="bullet"/>
+      <w:lvlText w:val=""/>
+      <w:lvlJc w:val="left"/>
+      <w:pPr>
+        <w:ind w:left="5040" w:hanging="360"/>
+      </w:pPr>
+      <w:rPr>
+        <w:rFonts w:hint="default" w:ascii="Symbol" w:hAnsi="Symbol"/>
+      </w:rPr>
+    </w:lvl>
+    <w:lvl w:ilvl="7" w:tplc="EF3C5062">
+      <w:start w:val="1"/>
+      <w:numFmt w:val="bullet"/>
+      <w:lvlText w:val="o"/>
+      <w:lvlJc w:val="left"/>
+      <w:pPr>
+        <w:ind w:left="5760" w:hanging="360"/>
+      </w:pPr>
+      <w:rPr>
+        <w:rFonts w:hint="default" w:ascii="Courier New" w:hAnsi="Courier New"/>
+      </w:rPr>
+    </w:lvl>
+    <w:lvl w:ilvl="8" w:tplc="38B4CC12">
+      <w:start w:val="1"/>
+      <w:numFmt w:val="bullet"/>
+      <w:lvlText w:val=""/>
+      <w:lvlJc w:val="left"/>
+      <w:pPr>
+        <w:ind w:left="6480" w:hanging="360"/>
+      </w:pPr>
+      <w:rPr>
+        <w:rFonts w:hint="default" w:ascii="Wingdings" w:hAnsi="Wingdings"/>
+      </w:rPr>
+    </w:lvl>
+  </w:abstractNum>
+  <w:abstractNum w:abstractNumId="5" w15:restartNumberingAfterBreak="0">
     <w:nsid w:val="61610803"/>
     <w:multiLevelType w:val="multilevel"/>
     <w:tmpl w:val="35A2D4AC"/>
@@ -17330,23 +15918,23 @@
       </w:rPr>
     </w:lvl>
   </w:abstractNum>
-  <w:num w:numId="6">
-    <w:abstractNumId w:val="5"/>
+  <w:num w:numId="1" w16cid:durableId="1662851911">
+    <w:abstractNumId w:val="3"/>
   </w:num>
-  <w:num w:numId="5">
+  <w:num w:numId="2" w16cid:durableId="1747067343">
+    <w:abstractNumId w:val="2"/>
+  </w:num>
+  <w:num w:numId="3" w16cid:durableId="1152939732">
     <w:abstractNumId w:val="4"/>
   </w:num>
-  <w:num w:numId="4">
-    <w:abstractNumId w:val="3"/>
-  </w:num>
-  <w:num w:numId="3">
-    <w:abstractNumId w:val="2"/>
-  </w:num>
-  <w:num w:numId="1" w16cid:durableId="1993949772">
+  <w:num w:numId="4" w16cid:durableId="1807160030">
     <w:abstractNumId w:val="0"/>
   </w:num>
-  <w:num w:numId="2" w16cid:durableId="488056476">
+  <w:num w:numId="5" w16cid:durableId="1993949772">
     <w:abstractNumId w:val="1"/>
+  </w:num>
+  <w:num w:numId="6" w16cid:durableId="488056476">
+    <w:abstractNumId w:val="5"/>
   </w:num>
 </w:numbering>
 </file>
@@ -18140,14 +16728,14 @@
       <w:shd w:val="clear" w:color="auto" w:fill="E1DFDD"/>
     </w:rPr>
   </w:style>
-  <w:style xmlns:w14="http://schemas.microsoft.com/office/word/2010/wordml" xmlns:mc="http://schemas.openxmlformats.org/markup-compatibility/2006" xmlns:w="http://schemas.openxmlformats.org/wordprocessingml/2006/main" w:type="paragraph" w:styleId="ListParagraph" mc:Ignorable="w14">
-    <w:name xmlns:w="http://schemas.openxmlformats.org/wordprocessingml/2006/main" w:val="List Paragraph"/>
-    <w:basedOn xmlns:w="http://schemas.openxmlformats.org/wordprocessingml/2006/main" w:val="Normal"/>
-    <w:uiPriority xmlns:w="http://schemas.openxmlformats.org/wordprocessingml/2006/main" w:val="34"/>
-    <w:qFormat xmlns:w="http://schemas.openxmlformats.org/wordprocessingml/2006/main"/>
-    <w:pPr xmlns:w="http://schemas.openxmlformats.org/wordprocessingml/2006/main">
-      <w:ind xmlns:w="http://schemas.openxmlformats.org/wordprocessingml/2006/main" w:left="720"/>
-      <w:contextualSpacing xmlns:w="http://schemas.openxmlformats.org/wordprocessingml/2006/main"/>
+  <w:style w:type="paragraph" w:styleId="PargrafodaLista">
+    <w:name w:val="List Paragraph"/>
+    <w:basedOn w:val="Normal"/>
+    <w:uiPriority w:val="34"/>
+    <w:qFormat/>
+    <w:pPr>
+      <w:ind w:left="720"/>
+      <w:contextualSpacing/>
     </w:pPr>
   </w:style>
 </w:styles>

</xml_diff>